<commit_message>
Fixed alphabetical sorting in tables
</commit_message>
<xml_diff>
--- a/exports/table1.docx
+++ b/exports/table1.docx
@@ -411,55 +411,55 @@
                 <w:rFonts w:ascii="Calibri" w:hAnsi="Calibri"/>
                 <w:sz w:val="20"/>
               </w:rPr>
-              <w:t xml:space="default">    MALE</w:t>
-            </w:r>
-          </w:p>
-        </w:tc>
-        <w:tc>
-          <w:tcPr>
-            <w:tcBorders>
-              <w:top w:val="single" w:space="0" w:color="D3D3D3"/>
-              <w:bottom w:val="single" w:space="0" w:color="D3D3D3"/>
-              <w:start w:val="single" w:space="0" w:color="D3D3D3"/>
-              <w:end w:val="single" w:space="0" w:color="D3D3D3"/>
-            </w:tcBorders>
-          </w:tcPr>
-          <w:p>
-            <w:pPr>
-              <w:spacing w:before="0" w:after="60"/>
-              <w:keepNext/>
-              <w:jc w:val="center"/>
-            </w:pPr>
-            <w:r>
-              <w:rPr>
-                <w:rFonts w:ascii="Calibri" w:hAnsi="Calibri"/>
-                <w:sz w:val="20"/>
-              </w:rPr>
-              <w:t xml:space="default">2,554,191 (55%)</w:t>
-            </w:r>
-          </w:p>
-        </w:tc>
-        <w:tc>
-          <w:tcPr>
-            <w:tcBorders>
-              <w:top w:val="single" w:space="0" w:color="D3D3D3"/>
-              <w:bottom w:val="single" w:space="0" w:color="D3D3D3"/>
-              <w:start w:val="single" w:space="0" w:color="D3D3D3"/>
-              <w:end w:val="single" w:space="0" w:color="D3D3D3"/>
-            </w:tcBorders>
-          </w:tcPr>
-          <w:p>
-            <w:pPr>
-              <w:spacing w:before="0" w:after="60"/>
-              <w:keepNext/>
-              <w:jc w:val="center"/>
-            </w:pPr>
-            <w:r>
-              <w:rPr>
-                <w:rFonts w:ascii="Calibri" w:hAnsi="Calibri"/>
-                <w:sz w:val="20"/>
-              </w:rPr>
-              <w:t xml:space="default">2,777,802 (56%)</w:t>
+              <w:t xml:space="default">    Female</w:t>
+            </w:r>
+          </w:p>
+        </w:tc>
+        <w:tc>
+          <w:tcPr>
+            <w:tcBorders>
+              <w:top w:val="single" w:space="0" w:color="D3D3D3"/>
+              <w:bottom w:val="single" w:space="0" w:color="D3D3D3"/>
+              <w:start w:val="single" w:space="0" w:color="D3D3D3"/>
+              <w:end w:val="single" w:space="0" w:color="D3D3D3"/>
+            </w:tcBorders>
+          </w:tcPr>
+          <w:p>
+            <w:pPr>
+              <w:spacing w:before="0" w:after="60"/>
+              <w:keepNext/>
+              <w:jc w:val="center"/>
+            </w:pPr>
+            <w:r>
+              <w:rPr>
+                <w:rFonts w:ascii="Calibri" w:hAnsi="Calibri"/>
+                <w:sz w:val="20"/>
+              </w:rPr>
+              <w:t xml:space="default">2,107,611 (45%)</w:t>
+            </w:r>
+          </w:p>
+        </w:tc>
+        <w:tc>
+          <w:tcPr>
+            <w:tcBorders>
+              <w:top w:val="single" w:space="0" w:color="D3D3D3"/>
+              <w:bottom w:val="single" w:space="0" w:color="D3D3D3"/>
+              <w:start w:val="single" w:space="0" w:color="D3D3D3"/>
+              <w:end w:val="single" w:space="0" w:color="D3D3D3"/>
+            </w:tcBorders>
+          </w:tcPr>
+          <w:p>
+            <w:pPr>
+              <w:spacing w:before="0" w:after="60"/>
+              <w:keepNext/>
+              <w:jc w:val="center"/>
+            </w:pPr>
+            <w:r>
+              <w:rPr>
+                <w:rFonts w:ascii="Calibri" w:hAnsi="Calibri"/>
+                <w:sz w:val="20"/>
+              </w:rPr>
+              <w:t xml:space="default">2,209,568 (44%)</w:t>
             </w:r>
           </w:p>
         </w:tc>
@@ -512,55 +512,55 @@
                 <w:rFonts w:ascii="Calibri" w:hAnsi="Calibri"/>
                 <w:sz w:val="20"/>
               </w:rPr>
-              <w:t xml:space="default">    FEMALE</w:t>
-            </w:r>
-          </w:p>
-        </w:tc>
-        <w:tc>
-          <w:tcPr>
-            <w:tcBorders>
-              <w:top w:val="single" w:space="0" w:color="D3D3D3"/>
-              <w:bottom w:val="single" w:space="0" w:color="D3D3D3"/>
-              <w:start w:val="single" w:space="0" w:color="D3D3D3"/>
-              <w:end w:val="single" w:space="0" w:color="D3D3D3"/>
-            </w:tcBorders>
-          </w:tcPr>
-          <w:p>
-            <w:pPr>
-              <w:spacing w:before="0" w:after="60"/>
-              <w:keepNext/>
-              <w:jc w:val="center"/>
-            </w:pPr>
-            <w:r>
-              <w:rPr>
-                <w:rFonts w:ascii="Calibri" w:hAnsi="Calibri"/>
-                <w:sz w:val="20"/>
-              </w:rPr>
-              <w:t xml:space="default">2,107,611 (45%)</w:t>
-            </w:r>
-          </w:p>
-        </w:tc>
-        <w:tc>
-          <w:tcPr>
-            <w:tcBorders>
-              <w:top w:val="single" w:space="0" w:color="D3D3D3"/>
-              <w:bottom w:val="single" w:space="0" w:color="D3D3D3"/>
-              <w:start w:val="single" w:space="0" w:color="D3D3D3"/>
-              <w:end w:val="single" w:space="0" w:color="D3D3D3"/>
-            </w:tcBorders>
-          </w:tcPr>
-          <w:p>
-            <w:pPr>
-              <w:spacing w:before="0" w:after="60"/>
-              <w:keepNext/>
-              <w:jc w:val="center"/>
-            </w:pPr>
-            <w:r>
-              <w:rPr>
-                <w:rFonts w:ascii="Calibri" w:hAnsi="Calibri"/>
-                <w:sz w:val="20"/>
-              </w:rPr>
-              <w:t xml:space="default">2,209,568 (44%)</w:t>
+              <w:t xml:space="default">    Male</w:t>
+            </w:r>
+          </w:p>
+        </w:tc>
+        <w:tc>
+          <w:tcPr>
+            <w:tcBorders>
+              <w:top w:val="single" w:space="0" w:color="D3D3D3"/>
+              <w:bottom w:val="single" w:space="0" w:color="D3D3D3"/>
+              <w:start w:val="single" w:space="0" w:color="D3D3D3"/>
+              <w:end w:val="single" w:space="0" w:color="D3D3D3"/>
+            </w:tcBorders>
+          </w:tcPr>
+          <w:p>
+            <w:pPr>
+              <w:spacing w:before="0" w:after="60"/>
+              <w:keepNext/>
+              <w:jc w:val="center"/>
+            </w:pPr>
+            <w:r>
+              <w:rPr>
+                <w:rFonts w:ascii="Calibri" w:hAnsi="Calibri"/>
+                <w:sz w:val="20"/>
+              </w:rPr>
+              <w:t xml:space="default">2,554,191 (55%)</w:t>
+            </w:r>
+          </w:p>
+        </w:tc>
+        <w:tc>
+          <w:tcPr>
+            <w:tcBorders>
+              <w:top w:val="single" w:space="0" w:color="D3D3D3"/>
+              <w:bottom w:val="single" w:space="0" w:color="D3D3D3"/>
+              <w:start w:val="single" w:space="0" w:color="D3D3D3"/>
+              <w:end w:val="single" w:space="0" w:color="D3D3D3"/>
+            </w:tcBorders>
+          </w:tcPr>
+          <w:p>
+            <w:pPr>
+              <w:spacing w:before="0" w:after="60"/>
+              <w:keepNext/>
+              <w:jc w:val="center"/>
+            </w:pPr>
+            <w:r>
+              <w:rPr>
+                <w:rFonts w:ascii="Calibri" w:hAnsi="Calibri"/>
+                <w:sz w:val="20"/>
+              </w:rPr>
+              <w:t xml:space="default">2,777,802 (56%)</w:t>
             </w:r>
           </w:p>
         </w:tc>
@@ -715,55 +715,55 @@
                 <w:rFonts w:ascii="Calibri" w:hAnsi="Calibri"/>
                 <w:sz w:val="20"/>
               </w:rPr>
-              <w:t xml:space="default">    Asian</w:t>
-            </w:r>
-          </w:p>
-        </w:tc>
-        <w:tc>
-          <w:tcPr>
-            <w:tcBorders>
-              <w:top w:val="single" w:space="0" w:color="D3D3D3"/>
-              <w:bottom w:val="single" w:space="0" w:color="D3D3D3"/>
-              <w:start w:val="single" w:space="0" w:color="D3D3D3"/>
-              <w:end w:val="single" w:space="0" w:color="D3D3D3"/>
-            </w:tcBorders>
-          </w:tcPr>
-          <w:p>
-            <w:pPr>
-              <w:spacing w:before="0" w:after="60"/>
-              <w:keepNext/>
-              <w:jc w:val="center"/>
-            </w:pPr>
-            <w:r>
-              <w:rPr>
-                <w:rFonts w:ascii="Calibri" w:hAnsi="Calibri"/>
-                <w:sz w:val="20"/>
-              </w:rPr>
-              <w:t xml:space="default">54,212 (1.4%)</w:t>
-            </w:r>
-          </w:p>
-        </w:tc>
-        <w:tc>
-          <w:tcPr>
-            <w:tcBorders>
-              <w:top w:val="single" w:space="0" w:color="D3D3D3"/>
-              <w:bottom w:val="single" w:space="0" w:color="D3D3D3"/>
-              <w:start w:val="single" w:space="0" w:color="D3D3D3"/>
-              <w:end w:val="single" w:space="0" w:color="D3D3D3"/>
-            </w:tcBorders>
-          </w:tcPr>
-          <w:p>
-            <w:pPr>
-              <w:spacing w:before="0" w:after="60"/>
-              <w:keepNext/>
-              <w:jc w:val="center"/>
-            </w:pPr>
-            <w:r>
-              <w:rPr>
-                <w:rFonts w:ascii="Calibri" w:hAnsi="Calibri"/>
-                <w:sz w:val="20"/>
-              </w:rPr>
-              <w:t xml:space="default">44,411 (1.0%)</w:t>
+              <w:t xml:space="default">    White</w:t>
+            </w:r>
+          </w:p>
+        </w:tc>
+        <w:tc>
+          <w:tcPr>
+            <w:tcBorders>
+              <w:top w:val="single" w:space="0" w:color="D3D3D3"/>
+              <w:bottom w:val="single" w:space="0" w:color="D3D3D3"/>
+              <w:start w:val="single" w:space="0" w:color="D3D3D3"/>
+              <w:end w:val="single" w:space="0" w:color="D3D3D3"/>
+            </w:tcBorders>
+          </w:tcPr>
+          <w:p>
+            <w:pPr>
+              <w:spacing w:before="0" w:after="60"/>
+              <w:keepNext/>
+              <w:jc w:val="center"/>
+            </w:pPr>
+            <w:r>
+              <w:rPr>
+                <w:rFonts w:ascii="Calibri" w:hAnsi="Calibri"/>
+                <w:sz w:val="20"/>
+              </w:rPr>
+              <w:t xml:space="default">3,166,343 (81%)</w:t>
+            </w:r>
+          </w:p>
+        </w:tc>
+        <w:tc>
+          <w:tcPr>
+            <w:tcBorders>
+              <w:top w:val="single" w:space="0" w:color="D3D3D3"/>
+              <w:bottom w:val="single" w:space="0" w:color="D3D3D3"/>
+              <w:start w:val="single" w:space="0" w:color="D3D3D3"/>
+              <w:end w:val="single" w:space="0" w:color="D3D3D3"/>
+            </w:tcBorders>
+          </w:tcPr>
+          <w:p>
+            <w:pPr>
+              <w:spacing w:before="0" w:after="60"/>
+              <w:keepNext/>
+              <w:jc w:val="center"/>
+            </w:pPr>
+            <w:r>
+              <w:rPr>
+                <w:rFonts w:ascii="Calibri" w:hAnsi="Calibri"/>
+                <w:sz w:val="20"/>
+              </w:rPr>
+              <w:t xml:space="default">3,479,069 (82%)</w:t>
             </w:r>
           </w:p>
         </w:tc>
@@ -917,55 +917,55 @@
                 <w:rFonts w:ascii="Calibri" w:hAnsi="Calibri"/>
                 <w:sz w:val="20"/>
               </w:rPr>
-              <w:t xml:space="default">    Other</w:t>
-            </w:r>
-          </w:p>
-        </w:tc>
-        <w:tc>
-          <w:tcPr>
-            <w:tcBorders>
-              <w:top w:val="single" w:space="0" w:color="D3D3D3"/>
-              <w:bottom w:val="single" w:space="0" w:color="D3D3D3"/>
-              <w:start w:val="single" w:space="0" w:color="D3D3D3"/>
-              <w:end w:val="single" w:space="0" w:color="D3D3D3"/>
-            </w:tcBorders>
-          </w:tcPr>
-          <w:p>
-            <w:pPr>
-              <w:spacing w:before="0" w:after="60"/>
-              <w:keepNext/>
-              <w:jc w:val="center"/>
-            </w:pPr>
-            <w:r>
-              <w:rPr>
-                <w:rFonts w:ascii="Calibri" w:hAnsi="Calibri"/>
-                <w:sz w:val="20"/>
-              </w:rPr>
-              <w:t xml:space="default">258,290 (6.6%)</w:t>
-            </w:r>
-          </w:p>
-        </w:tc>
-        <w:tc>
-          <w:tcPr>
-            <w:tcBorders>
-              <w:top w:val="single" w:space="0" w:color="D3D3D3"/>
-              <w:bottom w:val="single" w:space="0" w:color="D3D3D3"/>
-              <w:start w:val="single" w:space="0" w:color="D3D3D3"/>
-              <w:end w:val="single" w:space="0" w:color="D3D3D3"/>
-            </w:tcBorders>
-          </w:tcPr>
-          <w:p>
-            <w:pPr>
-              <w:spacing w:before="0" w:after="60"/>
-              <w:keepNext/>
-              <w:jc w:val="center"/>
-            </w:pPr>
-            <w:r>
-              <w:rPr>
-                <w:rFonts w:ascii="Calibri" w:hAnsi="Calibri"/>
-                <w:sz w:val="20"/>
-              </w:rPr>
-              <w:t xml:space="default">297,835 (7.0%)</w:t>
+              <w:t xml:space="default">    Asian</w:t>
+            </w:r>
+          </w:p>
+        </w:tc>
+        <w:tc>
+          <w:tcPr>
+            <w:tcBorders>
+              <w:top w:val="single" w:space="0" w:color="D3D3D3"/>
+              <w:bottom w:val="single" w:space="0" w:color="D3D3D3"/>
+              <w:start w:val="single" w:space="0" w:color="D3D3D3"/>
+              <w:end w:val="single" w:space="0" w:color="D3D3D3"/>
+            </w:tcBorders>
+          </w:tcPr>
+          <w:p>
+            <w:pPr>
+              <w:spacing w:before="0" w:after="60"/>
+              <w:keepNext/>
+              <w:jc w:val="center"/>
+            </w:pPr>
+            <w:r>
+              <w:rPr>
+                <w:rFonts w:ascii="Calibri" w:hAnsi="Calibri"/>
+                <w:sz w:val="20"/>
+              </w:rPr>
+              <w:t xml:space="default">54,212 (1.4%)</w:t>
+            </w:r>
+          </w:p>
+        </w:tc>
+        <w:tc>
+          <w:tcPr>
+            <w:tcBorders>
+              <w:top w:val="single" w:space="0" w:color="D3D3D3"/>
+              <w:bottom w:val="single" w:space="0" w:color="D3D3D3"/>
+              <w:start w:val="single" w:space="0" w:color="D3D3D3"/>
+              <w:end w:val="single" w:space="0" w:color="D3D3D3"/>
+            </w:tcBorders>
+          </w:tcPr>
+          <w:p>
+            <w:pPr>
+              <w:spacing w:before="0" w:after="60"/>
+              <w:keepNext/>
+              <w:jc w:val="center"/>
+            </w:pPr>
+            <w:r>
+              <w:rPr>
+                <w:rFonts w:ascii="Calibri" w:hAnsi="Calibri"/>
+                <w:sz w:val="20"/>
+              </w:rPr>
+              <w:t xml:space="default">44,411 (1.0%)</w:t>
             </w:r>
           </w:p>
         </w:tc>
@@ -1018,55 +1018,55 @@
                 <w:rFonts w:ascii="Calibri" w:hAnsi="Calibri"/>
                 <w:sz w:val="20"/>
               </w:rPr>
-              <w:t xml:space="default">    White</w:t>
-            </w:r>
-          </w:p>
-        </w:tc>
-        <w:tc>
-          <w:tcPr>
-            <w:tcBorders>
-              <w:top w:val="single" w:space="0" w:color="D3D3D3"/>
-              <w:bottom w:val="single" w:space="0" w:color="D3D3D3"/>
-              <w:start w:val="single" w:space="0" w:color="D3D3D3"/>
-              <w:end w:val="single" w:space="0" w:color="D3D3D3"/>
-            </w:tcBorders>
-          </w:tcPr>
-          <w:p>
-            <w:pPr>
-              <w:spacing w:before="0" w:after="60"/>
-              <w:keepNext/>
-              <w:jc w:val="center"/>
-            </w:pPr>
-            <w:r>
-              <w:rPr>
-                <w:rFonts w:ascii="Calibri" w:hAnsi="Calibri"/>
-                <w:sz w:val="20"/>
-              </w:rPr>
-              <w:t xml:space="default">3,166,343 (81%)</w:t>
-            </w:r>
-          </w:p>
-        </w:tc>
-        <w:tc>
-          <w:tcPr>
-            <w:tcBorders>
-              <w:top w:val="single" w:space="0" w:color="D3D3D3"/>
-              <w:bottom w:val="single" w:space="0" w:color="D3D3D3"/>
-              <w:start w:val="single" w:space="0" w:color="D3D3D3"/>
-              <w:end w:val="single" w:space="0" w:color="D3D3D3"/>
-            </w:tcBorders>
-          </w:tcPr>
-          <w:p>
-            <w:pPr>
-              <w:spacing w:before="0" w:after="60"/>
-              <w:keepNext/>
-              <w:jc w:val="center"/>
-            </w:pPr>
-            <w:r>
-              <w:rPr>
-                <w:rFonts w:ascii="Calibri" w:hAnsi="Calibri"/>
-                <w:sz w:val="20"/>
-              </w:rPr>
-              <w:t xml:space="default">3,479,069 (82%)</w:t>
+              <w:t xml:space="default">    Other</w:t>
+            </w:r>
+          </w:p>
+        </w:tc>
+        <w:tc>
+          <w:tcPr>
+            <w:tcBorders>
+              <w:top w:val="single" w:space="0" w:color="D3D3D3"/>
+              <w:bottom w:val="single" w:space="0" w:color="D3D3D3"/>
+              <w:start w:val="single" w:space="0" w:color="D3D3D3"/>
+              <w:end w:val="single" w:space="0" w:color="D3D3D3"/>
+            </w:tcBorders>
+          </w:tcPr>
+          <w:p>
+            <w:pPr>
+              <w:spacing w:before="0" w:after="60"/>
+              <w:keepNext/>
+              <w:jc w:val="center"/>
+            </w:pPr>
+            <w:r>
+              <w:rPr>
+                <w:rFonts w:ascii="Calibri" w:hAnsi="Calibri"/>
+                <w:sz w:val="20"/>
+              </w:rPr>
+              <w:t xml:space="default">258,290 (6.6%)</w:t>
+            </w:r>
+          </w:p>
+        </w:tc>
+        <w:tc>
+          <w:tcPr>
+            <w:tcBorders>
+              <w:top w:val="single" w:space="0" w:color="D3D3D3"/>
+              <w:bottom w:val="single" w:space="0" w:color="D3D3D3"/>
+              <w:start w:val="single" w:space="0" w:color="D3D3D3"/>
+              <w:end w:val="single" w:space="0" w:color="D3D3D3"/>
+            </w:tcBorders>
+          </w:tcPr>
+          <w:p>
+            <w:pPr>
+              <w:spacing w:before="0" w:after="60"/>
+              <w:keepNext/>
+              <w:jc w:val="center"/>
+            </w:pPr>
+            <w:r>
+              <w:rPr>
+                <w:rFonts w:ascii="Calibri" w:hAnsi="Calibri"/>
+                <w:sz w:val="20"/>
+              </w:rPr>
+              <w:t xml:space="default">297,835 (7.0%)</w:t>
             </w:r>
           </w:p>
         </w:tc>
@@ -1118,56 +1118,9 @@
               <w:rPr>
                 <w:rFonts w:ascii="Calibri" w:hAnsi="Calibri"/>
                 <w:sz w:val="20"/>
-              </w:rPr>
-              <w:t xml:space="default">    Unknown</w:t>
-            </w:r>
-          </w:p>
-        </w:tc>
-        <w:tc>
-          <w:tcPr>
-            <w:tcBorders>
-              <w:top w:val="single" w:space="0" w:color="D3D3D3"/>
-              <w:bottom w:val="single" w:space="0" w:color="D3D3D3"/>
-              <w:start w:val="single" w:space="0" w:color="D3D3D3"/>
-              <w:end w:val="single" w:space="0" w:color="D3D3D3"/>
-            </w:tcBorders>
-          </w:tcPr>
-          <w:p>
-            <w:pPr>
-              <w:spacing w:before="0" w:after="60"/>
-              <w:keepNext/>
-              <w:jc w:val="center"/>
-            </w:pPr>
-            <w:r>
-              <w:rPr>
-                <w:rFonts w:ascii="Calibri" w:hAnsi="Calibri"/>
-                <w:sz w:val="20"/>
-              </w:rPr>
-              <w:t xml:space="default">742,358</w:t>
-            </w:r>
-          </w:p>
-        </w:tc>
-        <w:tc>
-          <w:tcPr>
-            <w:tcBorders>
-              <w:top w:val="single" w:space="0" w:color="D3D3D3"/>
-              <w:bottom w:val="single" w:space="0" w:color="D3D3D3"/>
-              <w:start w:val="single" w:space="0" w:color="D3D3D3"/>
-              <w:end w:val="single" w:space="0" w:color="D3D3D3"/>
-            </w:tcBorders>
-          </w:tcPr>
-          <w:p>
-            <w:pPr>
-              <w:spacing w:before="0" w:after="60"/>
-              <w:keepNext/>
-              <w:jc w:val="center"/>
-            </w:pPr>
-            <w:r>
-              <w:rPr>
-                <w:rFonts w:ascii="Calibri" w:hAnsi="Calibri"/>
-                <w:sz w:val="20"/>
-              </w:rPr>
-              <w:t xml:space="default">726,424</w:t>
+                <w:b w:val="true"/>
+              </w:rPr>
+              <w:t xml:space="default">Ethnicity</w:t>
             </w:r>
           </w:p>
         </w:tc>
@@ -1192,6 +1145,54 @@
                 <w:sz w:val="20"/>
               </w:rPr>
               <w:t xml:space="default"/>
+            </w:r>
+          </w:p>
+        </w:tc>
+        <w:tc>
+          <w:tcPr>
+            <w:tcBorders>
+              <w:top w:val="single" w:space="0" w:color="D3D3D3"/>
+              <w:bottom w:val="single" w:space="0" w:color="D3D3D3"/>
+              <w:start w:val="single" w:space="0" w:color="D3D3D3"/>
+              <w:end w:val="single" w:space="0" w:color="D3D3D3"/>
+            </w:tcBorders>
+          </w:tcPr>
+          <w:p>
+            <w:pPr>
+              <w:spacing w:before="0" w:after="60"/>
+              <w:keepNext/>
+              <w:jc w:val="center"/>
+            </w:pPr>
+            <w:r>
+              <w:rPr>
+                <w:rFonts w:ascii="Calibri" w:hAnsi="Calibri"/>
+                <w:sz w:val="20"/>
+              </w:rPr>
+              <w:t xml:space="default"/>
+            </w:r>
+          </w:p>
+        </w:tc>
+        <w:tc>
+          <w:tcPr>
+            <w:tcBorders>
+              <w:top w:val="single" w:space="0" w:color="D3D3D3"/>
+              <w:bottom w:val="single" w:space="0" w:color="D3D3D3"/>
+              <w:start w:val="single" w:space="0" w:color="D3D3D3"/>
+              <w:end w:val="single" w:space="0" w:color="D3D3D3"/>
+            </w:tcBorders>
+          </w:tcPr>
+          <w:p>
+            <w:pPr>
+              <w:spacing w:before="0" w:after="60"/>
+              <w:keepNext/>
+              <w:jc w:val="center"/>
+            </w:pPr>
+            <w:r>
+              <w:rPr>
+                <w:rFonts w:ascii="Calibri" w:hAnsi="Calibri"/>
+                <w:sz w:val="20"/>
+              </w:rPr>
+              <w:t xml:space="default">0.2</w:t>
             </w:r>
           </w:p>
         </w:tc>
@@ -1219,9 +1220,56 @@
               <w:rPr>
                 <w:rFonts w:ascii="Calibri" w:hAnsi="Calibri"/>
                 <w:sz w:val="20"/>
-                <w:b w:val="true"/>
-              </w:rPr>
-              <w:t xml:space="default">Ethnicity</w:t>
+              </w:rPr>
+              <w:t xml:space="default">    Hispanic</w:t>
+            </w:r>
+          </w:p>
+        </w:tc>
+        <w:tc>
+          <w:tcPr>
+            <w:tcBorders>
+              <w:top w:val="single" w:space="0" w:color="D3D3D3"/>
+              <w:bottom w:val="single" w:space="0" w:color="D3D3D3"/>
+              <w:start w:val="single" w:space="0" w:color="D3D3D3"/>
+              <w:end w:val="single" w:space="0" w:color="D3D3D3"/>
+            </w:tcBorders>
+          </w:tcPr>
+          <w:p>
+            <w:pPr>
+              <w:spacing w:before="0" w:after="60"/>
+              <w:keepNext/>
+              <w:jc w:val="center"/>
+            </w:pPr>
+            <w:r>
+              <w:rPr>
+                <w:rFonts w:ascii="Calibri" w:hAnsi="Calibri"/>
+                <w:sz w:val="20"/>
+              </w:rPr>
+              <w:t xml:space="default">742,358 (16%)</w:t>
+            </w:r>
+          </w:p>
+        </w:tc>
+        <w:tc>
+          <w:tcPr>
+            <w:tcBorders>
+              <w:top w:val="single" w:space="0" w:color="D3D3D3"/>
+              <w:bottom w:val="single" w:space="0" w:color="D3D3D3"/>
+              <w:start w:val="single" w:space="0" w:color="D3D3D3"/>
+              <w:end w:val="single" w:space="0" w:color="D3D3D3"/>
+            </w:tcBorders>
+          </w:tcPr>
+          <w:p>
+            <w:pPr>
+              <w:spacing w:before="0" w:after="60"/>
+              <w:keepNext/>
+              <w:jc w:val="center"/>
+            </w:pPr>
+            <w:r>
+              <w:rPr>
+                <w:rFonts w:ascii="Calibri" w:hAnsi="Calibri"/>
+                <w:sz w:val="20"/>
+              </w:rPr>
+              <w:t xml:space="default">726,424 (15%)</w:t>
             </w:r>
           </w:p>
         </w:tc>
@@ -1246,54 +1294,6 @@
                 <w:sz w:val="20"/>
               </w:rPr>
               <w:t xml:space="default"/>
-            </w:r>
-          </w:p>
-        </w:tc>
-        <w:tc>
-          <w:tcPr>
-            <w:tcBorders>
-              <w:top w:val="single" w:space="0" w:color="D3D3D3"/>
-              <w:bottom w:val="single" w:space="0" w:color="D3D3D3"/>
-              <w:start w:val="single" w:space="0" w:color="D3D3D3"/>
-              <w:end w:val="single" w:space="0" w:color="D3D3D3"/>
-            </w:tcBorders>
-          </w:tcPr>
-          <w:p>
-            <w:pPr>
-              <w:spacing w:before="0" w:after="60"/>
-              <w:keepNext/>
-              <w:jc w:val="center"/>
-            </w:pPr>
-            <w:r>
-              <w:rPr>
-                <w:rFonts w:ascii="Calibri" w:hAnsi="Calibri"/>
-                <w:sz w:val="20"/>
-              </w:rPr>
-              <w:t xml:space="default"/>
-            </w:r>
-          </w:p>
-        </w:tc>
-        <w:tc>
-          <w:tcPr>
-            <w:tcBorders>
-              <w:top w:val="single" w:space="0" w:color="D3D3D3"/>
-              <w:bottom w:val="single" w:space="0" w:color="D3D3D3"/>
-              <w:start w:val="single" w:space="0" w:color="D3D3D3"/>
-              <w:end w:val="single" w:space="0" w:color="D3D3D3"/>
-            </w:tcBorders>
-          </w:tcPr>
-          <w:p>
-            <w:pPr>
-              <w:spacing w:before="0" w:after="60"/>
-              <w:keepNext/>
-              <w:jc w:val="center"/>
-            </w:pPr>
-            <w:r>
-              <w:rPr>
-                <w:rFonts w:ascii="Calibri" w:hAnsi="Calibri"/>
-                <w:sz w:val="20"/>
-              </w:rPr>
-              <w:t xml:space="default">0.2</w:t>
             </w:r>
           </w:p>
         </w:tc>
@@ -1322,55 +1322,55 @@
                 <w:rFonts w:ascii="Calibri" w:hAnsi="Calibri"/>
                 <w:sz w:val="20"/>
               </w:rPr>
-              <w:t xml:space="default">    Hispanic</w:t>
-            </w:r>
-          </w:p>
-        </w:tc>
-        <w:tc>
-          <w:tcPr>
-            <w:tcBorders>
-              <w:top w:val="single" w:space="0" w:color="D3D3D3"/>
-              <w:bottom w:val="single" w:space="0" w:color="D3D3D3"/>
-              <w:start w:val="single" w:space="0" w:color="D3D3D3"/>
-              <w:end w:val="single" w:space="0" w:color="D3D3D3"/>
-            </w:tcBorders>
-          </w:tcPr>
-          <w:p>
-            <w:pPr>
-              <w:spacing w:before="0" w:after="60"/>
-              <w:keepNext/>
-              <w:jc w:val="center"/>
-            </w:pPr>
-            <w:r>
-              <w:rPr>
-                <w:rFonts w:ascii="Calibri" w:hAnsi="Calibri"/>
-                <w:sz w:val="20"/>
-              </w:rPr>
-              <w:t xml:space="default">742,358 (16%)</w:t>
-            </w:r>
-          </w:p>
-        </w:tc>
-        <w:tc>
-          <w:tcPr>
-            <w:tcBorders>
-              <w:top w:val="single" w:space="0" w:color="D3D3D3"/>
-              <w:bottom w:val="single" w:space="0" w:color="D3D3D3"/>
-              <w:start w:val="single" w:space="0" w:color="D3D3D3"/>
-              <w:end w:val="single" w:space="0" w:color="D3D3D3"/>
-            </w:tcBorders>
-          </w:tcPr>
-          <w:p>
-            <w:pPr>
-              <w:spacing w:before="0" w:after="60"/>
-              <w:keepNext/>
-              <w:jc w:val="center"/>
-            </w:pPr>
-            <w:r>
-              <w:rPr>
-                <w:rFonts w:ascii="Calibri" w:hAnsi="Calibri"/>
-                <w:sz w:val="20"/>
-              </w:rPr>
-              <w:t xml:space="default">726,424 (15%)</w:t>
+              <w:t xml:space="default">    Non-Hispanic</w:t>
+            </w:r>
+          </w:p>
+        </w:tc>
+        <w:tc>
+          <w:tcPr>
+            <w:tcBorders>
+              <w:top w:val="single" w:space="0" w:color="D3D3D3"/>
+              <w:bottom w:val="single" w:space="0" w:color="D3D3D3"/>
+              <w:start w:val="single" w:space="0" w:color="D3D3D3"/>
+              <w:end w:val="single" w:space="0" w:color="D3D3D3"/>
+            </w:tcBorders>
+          </w:tcPr>
+          <w:p>
+            <w:pPr>
+              <w:spacing w:before="0" w:after="60"/>
+              <w:keepNext/>
+              <w:jc w:val="center"/>
+            </w:pPr>
+            <w:r>
+              <w:rPr>
+                <w:rFonts w:ascii="Calibri" w:hAnsi="Calibri"/>
+                <w:sz w:val="20"/>
+              </w:rPr>
+              <w:t xml:space="default">3,919,444 (84%)</w:t>
+            </w:r>
+          </w:p>
+        </w:tc>
+        <w:tc>
+          <w:tcPr>
+            <w:tcBorders>
+              <w:top w:val="single" w:space="0" w:color="D3D3D3"/>
+              <w:bottom w:val="single" w:space="0" w:color="D3D3D3"/>
+              <w:start w:val="single" w:space="0" w:color="D3D3D3"/>
+              <w:end w:val="single" w:space="0" w:color="D3D3D3"/>
+            </w:tcBorders>
+          </w:tcPr>
+          <w:p>
+            <w:pPr>
+              <w:spacing w:before="0" w:after="60"/>
+              <w:keepNext/>
+              <w:jc w:val="center"/>
+            </w:pPr>
+            <w:r>
+              <w:rPr>
+                <w:rFonts w:ascii="Calibri" w:hAnsi="Calibri"/>
+                <w:sz w:val="20"/>
+              </w:rPr>
+              <w:t xml:space="default">4,260,946 (85%)</w:t>
             </w:r>
           </w:p>
         </w:tc>
@@ -1422,56 +1422,9 @@
               <w:rPr>
                 <w:rFonts w:ascii="Calibri" w:hAnsi="Calibri"/>
                 <w:sz w:val="20"/>
-              </w:rPr>
-              <w:t xml:space="default">    Non-Hispanic</w:t>
-            </w:r>
-          </w:p>
-        </w:tc>
-        <w:tc>
-          <w:tcPr>
-            <w:tcBorders>
-              <w:top w:val="single" w:space="0" w:color="D3D3D3"/>
-              <w:bottom w:val="single" w:space="0" w:color="D3D3D3"/>
-              <w:start w:val="single" w:space="0" w:color="D3D3D3"/>
-              <w:end w:val="single" w:space="0" w:color="D3D3D3"/>
-            </w:tcBorders>
-          </w:tcPr>
-          <w:p>
-            <w:pPr>
-              <w:spacing w:before="0" w:after="60"/>
-              <w:keepNext/>
-              <w:jc w:val="center"/>
-            </w:pPr>
-            <w:r>
-              <w:rPr>
-                <w:rFonts w:ascii="Calibri" w:hAnsi="Calibri"/>
-                <w:sz w:val="20"/>
-              </w:rPr>
-              <w:t xml:space="default">3,919,444 (84%)</w:t>
-            </w:r>
-          </w:p>
-        </w:tc>
-        <w:tc>
-          <w:tcPr>
-            <w:tcBorders>
-              <w:top w:val="single" w:space="0" w:color="D3D3D3"/>
-              <w:bottom w:val="single" w:space="0" w:color="D3D3D3"/>
-              <w:start w:val="single" w:space="0" w:color="D3D3D3"/>
-              <w:end w:val="single" w:space="0" w:color="D3D3D3"/>
-            </w:tcBorders>
-          </w:tcPr>
-          <w:p>
-            <w:pPr>
-              <w:spacing w:before="0" w:after="60"/>
-              <w:keepNext/>
-              <w:jc w:val="center"/>
-            </w:pPr>
-            <w:r>
-              <w:rPr>
-                <w:rFonts w:ascii="Calibri" w:hAnsi="Calibri"/>
-                <w:sz w:val="20"/>
-              </w:rPr>
-              <w:t xml:space="default">4,260,946 (85%)</w:t>
+                <w:b w:val="true"/>
+              </w:rPr>
+              <w:t xml:space="default">Education</w:t>
             </w:r>
           </w:p>
         </w:tc>
@@ -1496,6 +1449,54 @@
                 <w:sz w:val="20"/>
               </w:rPr>
               <w:t xml:space="default"/>
+            </w:r>
+          </w:p>
+        </w:tc>
+        <w:tc>
+          <w:tcPr>
+            <w:tcBorders>
+              <w:top w:val="single" w:space="0" w:color="D3D3D3"/>
+              <w:bottom w:val="single" w:space="0" w:color="D3D3D3"/>
+              <w:start w:val="single" w:space="0" w:color="D3D3D3"/>
+              <w:end w:val="single" w:space="0" w:color="D3D3D3"/>
+            </w:tcBorders>
+          </w:tcPr>
+          <w:p>
+            <w:pPr>
+              <w:spacing w:before="0" w:after="60"/>
+              <w:keepNext/>
+              <w:jc w:val="center"/>
+            </w:pPr>
+            <w:r>
+              <w:rPr>
+                <w:rFonts w:ascii="Calibri" w:hAnsi="Calibri"/>
+                <w:sz w:val="20"/>
+              </w:rPr>
+              <w:t xml:space="default"/>
+            </w:r>
+          </w:p>
+        </w:tc>
+        <w:tc>
+          <w:tcPr>
+            <w:tcBorders>
+              <w:top w:val="single" w:space="0" w:color="D3D3D3"/>
+              <w:bottom w:val="single" w:space="0" w:color="D3D3D3"/>
+              <w:start w:val="single" w:space="0" w:color="D3D3D3"/>
+              <w:end w:val="single" w:space="0" w:color="D3D3D3"/>
+            </w:tcBorders>
+          </w:tcPr>
+          <w:p>
+            <w:pPr>
+              <w:spacing w:before="0" w:after="60"/>
+              <w:keepNext/>
+              <w:jc w:val="center"/>
+            </w:pPr>
+            <w:r>
+              <w:rPr>
+                <w:rFonts w:ascii="Calibri" w:hAnsi="Calibri"/>
+                <w:sz w:val="20"/>
+              </w:rPr>
+              <w:t xml:space="default">0.4</w:t>
             </w:r>
           </w:p>
         </w:tc>
@@ -1523,9 +1524,56 @@
               <w:rPr>
                 <w:rFonts w:ascii="Calibri" w:hAnsi="Calibri"/>
                 <w:sz w:val="20"/>
-                <w:b w:val="true"/>
-              </w:rPr>
-              <w:t xml:space="default">Education</w:t>
+              </w:rPr>
+              <w:t xml:space="default">    College education or greater</w:t>
+            </w:r>
+          </w:p>
+        </w:tc>
+        <w:tc>
+          <w:tcPr>
+            <w:tcBorders>
+              <w:top w:val="single" w:space="0" w:color="D3D3D3"/>
+              <w:bottom w:val="single" w:space="0" w:color="D3D3D3"/>
+              <w:start w:val="single" w:space="0" w:color="D3D3D3"/>
+              <w:end w:val="single" w:space="0" w:color="D3D3D3"/>
+            </w:tcBorders>
+          </w:tcPr>
+          <w:p>
+            <w:pPr>
+              <w:spacing w:before="0" w:after="60"/>
+              <w:keepNext/>
+              <w:jc w:val="center"/>
+            </w:pPr>
+            <w:r>
+              <w:rPr>
+                <w:rFonts w:ascii="Calibri" w:hAnsi="Calibri"/>
+                <w:sz w:val="20"/>
+              </w:rPr>
+              <w:t xml:space="default">1,912,907 (75%)</w:t>
+            </w:r>
+          </w:p>
+        </w:tc>
+        <w:tc>
+          <w:tcPr>
+            <w:tcBorders>
+              <w:top w:val="single" w:space="0" w:color="D3D3D3"/>
+              <w:bottom w:val="single" w:space="0" w:color="D3D3D3"/>
+              <w:start w:val="single" w:space="0" w:color="D3D3D3"/>
+              <w:end w:val="single" w:space="0" w:color="D3D3D3"/>
+            </w:tcBorders>
+          </w:tcPr>
+          <w:p>
+            <w:pPr>
+              <w:spacing w:before="0" w:after="60"/>
+              <w:keepNext/>
+              <w:jc w:val="center"/>
+            </w:pPr>
+            <w:r>
+              <w:rPr>
+                <w:rFonts w:ascii="Calibri" w:hAnsi="Calibri"/>
+                <w:sz w:val="20"/>
+              </w:rPr>
+              <w:t xml:space="default">1,975,581 (73%)</w:t>
             </w:r>
           </w:p>
         </w:tc>
@@ -1550,54 +1598,6 @@
                 <w:sz w:val="20"/>
               </w:rPr>
               <w:t xml:space="default"/>
-            </w:r>
-          </w:p>
-        </w:tc>
-        <w:tc>
-          <w:tcPr>
-            <w:tcBorders>
-              <w:top w:val="single" w:space="0" w:color="D3D3D3"/>
-              <w:bottom w:val="single" w:space="0" w:color="D3D3D3"/>
-              <w:start w:val="single" w:space="0" w:color="D3D3D3"/>
-              <w:end w:val="single" w:space="0" w:color="D3D3D3"/>
-            </w:tcBorders>
-          </w:tcPr>
-          <w:p>
-            <w:pPr>
-              <w:spacing w:before="0" w:after="60"/>
-              <w:keepNext/>
-              <w:jc w:val="center"/>
-            </w:pPr>
-            <w:r>
-              <w:rPr>
-                <w:rFonts w:ascii="Calibri" w:hAnsi="Calibri"/>
-                <w:sz w:val="20"/>
-              </w:rPr>
-              <w:t xml:space="default"/>
-            </w:r>
-          </w:p>
-        </w:tc>
-        <w:tc>
-          <w:tcPr>
-            <w:tcBorders>
-              <w:top w:val="single" w:space="0" w:color="D3D3D3"/>
-              <w:bottom w:val="single" w:space="0" w:color="D3D3D3"/>
-              <w:start w:val="single" w:space="0" w:color="D3D3D3"/>
-              <w:end w:val="single" w:space="0" w:color="D3D3D3"/>
-            </w:tcBorders>
-          </w:tcPr>
-          <w:p>
-            <w:pPr>
-              <w:spacing w:before="0" w:after="60"/>
-              <w:keepNext/>
-              <w:jc w:val="center"/>
-            </w:pPr>
-            <w:r>
-              <w:rPr>
-                <w:rFonts w:ascii="Calibri" w:hAnsi="Calibri"/>
-                <w:sz w:val="20"/>
-              </w:rPr>
-              <w:t xml:space="default">0.4</w:t>
             </w:r>
           </w:p>
         </w:tc>
@@ -1626,55 +1626,55 @@
                 <w:rFonts w:ascii="Calibri" w:hAnsi="Calibri"/>
                 <w:sz w:val="20"/>
               </w:rPr>
-              <w:t xml:space="default">    College education or greater</w:t>
-            </w:r>
-          </w:p>
-        </w:tc>
-        <w:tc>
-          <w:tcPr>
-            <w:tcBorders>
-              <w:top w:val="single" w:space="0" w:color="D3D3D3"/>
-              <w:bottom w:val="single" w:space="0" w:color="D3D3D3"/>
-              <w:start w:val="single" w:space="0" w:color="D3D3D3"/>
-              <w:end w:val="single" w:space="0" w:color="D3D3D3"/>
-            </w:tcBorders>
-          </w:tcPr>
-          <w:p>
-            <w:pPr>
-              <w:spacing w:before="0" w:after="60"/>
-              <w:keepNext/>
-              <w:jc w:val="center"/>
-            </w:pPr>
-            <w:r>
-              <w:rPr>
-                <w:rFonts w:ascii="Calibri" w:hAnsi="Calibri"/>
-                <w:sz w:val="20"/>
-              </w:rPr>
-              <w:t xml:space="default">1,912,907 (75%)</w:t>
-            </w:r>
-          </w:p>
-        </w:tc>
-        <w:tc>
-          <w:tcPr>
-            <w:tcBorders>
-              <w:top w:val="single" w:space="0" w:color="D3D3D3"/>
-              <w:bottom w:val="single" w:space="0" w:color="D3D3D3"/>
-              <w:start w:val="single" w:space="0" w:color="D3D3D3"/>
-              <w:end w:val="single" w:space="0" w:color="D3D3D3"/>
-            </w:tcBorders>
-          </w:tcPr>
-          <w:p>
-            <w:pPr>
-              <w:spacing w:before="0" w:after="60"/>
-              <w:keepNext/>
-              <w:jc w:val="center"/>
-            </w:pPr>
-            <w:r>
-              <w:rPr>
-                <w:rFonts w:ascii="Calibri" w:hAnsi="Calibri"/>
-                <w:sz w:val="20"/>
-              </w:rPr>
-              <w:t xml:space="default">1,975,581 (73%)</w:t>
+              <w:t xml:space="default">    High school graduation or less</w:t>
+            </w:r>
+          </w:p>
+        </w:tc>
+        <w:tc>
+          <w:tcPr>
+            <w:tcBorders>
+              <w:top w:val="single" w:space="0" w:color="D3D3D3"/>
+              <w:bottom w:val="single" w:space="0" w:color="D3D3D3"/>
+              <w:start w:val="single" w:space="0" w:color="D3D3D3"/>
+              <w:end w:val="single" w:space="0" w:color="D3D3D3"/>
+            </w:tcBorders>
+          </w:tcPr>
+          <w:p>
+            <w:pPr>
+              <w:spacing w:before="0" w:after="60"/>
+              <w:keepNext/>
+              <w:jc w:val="center"/>
+            </w:pPr>
+            <w:r>
+              <w:rPr>
+                <w:rFonts w:ascii="Calibri" w:hAnsi="Calibri"/>
+                <w:sz w:val="20"/>
+              </w:rPr>
+              <w:t xml:space="default">638,763 (25%)</w:t>
+            </w:r>
+          </w:p>
+        </w:tc>
+        <w:tc>
+          <w:tcPr>
+            <w:tcBorders>
+              <w:top w:val="single" w:space="0" w:color="D3D3D3"/>
+              <w:bottom w:val="single" w:space="0" w:color="D3D3D3"/>
+              <w:start w:val="single" w:space="0" w:color="D3D3D3"/>
+              <w:end w:val="single" w:space="0" w:color="D3D3D3"/>
+            </w:tcBorders>
+          </w:tcPr>
+          <w:p>
+            <w:pPr>
+              <w:spacing w:before="0" w:after="60"/>
+              <w:keepNext/>
+              <w:jc w:val="center"/>
+            </w:pPr>
+            <w:r>
+              <w:rPr>
+                <w:rFonts w:ascii="Calibri" w:hAnsi="Calibri"/>
+                <w:sz w:val="20"/>
+              </w:rPr>
+              <w:t xml:space="default">715,513 (27%)</w:t>
             </w:r>
           </w:p>
         </w:tc>
@@ -1726,56 +1726,9 @@
               <w:rPr>
                 <w:rFonts w:ascii="Calibri" w:hAnsi="Calibri"/>
                 <w:sz w:val="20"/>
-              </w:rPr>
-              <w:t xml:space="default">    High school graduation or less</w:t>
-            </w:r>
-          </w:p>
-        </w:tc>
-        <w:tc>
-          <w:tcPr>
-            <w:tcBorders>
-              <w:top w:val="single" w:space="0" w:color="D3D3D3"/>
-              <w:bottom w:val="single" w:space="0" w:color="D3D3D3"/>
-              <w:start w:val="single" w:space="0" w:color="D3D3D3"/>
-              <w:end w:val="single" w:space="0" w:color="D3D3D3"/>
-            </w:tcBorders>
-          </w:tcPr>
-          <w:p>
-            <w:pPr>
-              <w:spacing w:before="0" w:after="60"/>
-              <w:keepNext/>
-              <w:jc w:val="center"/>
-            </w:pPr>
-            <w:r>
-              <w:rPr>
-                <w:rFonts w:ascii="Calibri" w:hAnsi="Calibri"/>
-                <w:sz w:val="20"/>
-              </w:rPr>
-              <w:t xml:space="default">638,763 (25%)</w:t>
-            </w:r>
-          </w:p>
-        </w:tc>
-        <w:tc>
-          <w:tcPr>
-            <w:tcBorders>
-              <w:top w:val="single" w:space="0" w:color="D3D3D3"/>
-              <w:bottom w:val="single" w:space="0" w:color="D3D3D3"/>
-              <w:start w:val="single" w:space="0" w:color="D3D3D3"/>
-              <w:end w:val="single" w:space="0" w:color="D3D3D3"/>
-            </w:tcBorders>
-          </w:tcPr>
-          <w:p>
-            <w:pPr>
-              <w:spacing w:before="0" w:after="60"/>
-              <w:keepNext/>
-              <w:jc w:val="center"/>
-            </w:pPr>
-            <w:r>
-              <w:rPr>
-                <w:rFonts w:ascii="Calibri" w:hAnsi="Calibri"/>
-                <w:sz w:val="20"/>
-              </w:rPr>
-              <w:t xml:space="default">715,513 (27%)</w:t>
+                <w:b w:val="true"/>
+              </w:rPr>
+              <w:t xml:space="default">Has insurance</w:t>
             </w:r>
           </w:p>
         </w:tc>
@@ -1800,6 +1753,54 @@
                 <w:sz w:val="20"/>
               </w:rPr>
               <w:t xml:space="default"/>
+            </w:r>
+          </w:p>
+        </w:tc>
+        <w:tc>
+          <w:tcPr>
+            <w:tcBorders>
+              <w:top w:val="single" w:space="0" w:color="D3D3D3"/>
+              <w:bottom w:val="single" w:space="0" w:color="D3D3D3"/>
+              <w:start w:val="single" w:space="0" w:color="D3D3D3"/>
+              <w:end w:val="single" w:space="0" w:color="D3D3D3"/>
+            </w:tcBorders>
+          </w:tcPr>
+          <w:p>
+            <w:pPr>
+              <w:spacing w:before="0" w:after="60"/>
+              <w:keepNext/>
+              <w:jc w:val="center"/>
+            </w:pPr>
+            <w:r>
+              <w:rPr>
+                <w:rFonts w:ascii="Calibri" w:hAnsi="Calibri"/>
+                <w:sz w:val="20"/>
+              </w:rPr>
+              <w:t xml:space="default"/>
+            </w:r>
+          </w:p>
+        </w:tc>
+        <w:tc>
+          <w:tcPr>
+            <w:tcBorders>
+              <w:top w:val="single" w:space="0" w:color="D3D3D3"/>
+              <w:bottom w:val="single" w:space="0" w:color="D3D3D3"/>
+              <w:start w:val="single" w:space="0" w:color="D3D3D3"/>
+              <w:end w:val="single" w:space="0" w:color="D3D3D3"/>
+            </w:tcBorders>
+          </w:tcPr>
+          <w:p>
+            <w:pPr>
+              <w:spacing w:before="0" w:after="60"/>
+              <w:keepNext/>
+              <w:jc w:val="center"/>
+            </w:pPr>
+            <w:r>
+              <w:rPr>
+                <w:rFonts w:ascii="Calibri" w:hAnsi="Calibri"/>
+                <w:sz w:val="20"/>
+              </w:rPr>
+              <w:t xml:space="default">0.8</w:t>
             </w:r>
           </w:p>
         </w:tc>
@@ -1828,55 +1829,55 @@
                 <w:rFonts w:ascii="Calibri" w:hAnsi="Calibri"/>
                 <w:sz w:val="20"/>
               </w:rPr>
-              <w:t xml:space="default">    Unknown</w:t>
-            </w:r>
-          </w:p>
-        </w:tc>
-        <w:tc>
-          <w:tcPr>
-            <w:tcBorders>
-              <w:top w:val="single" w:space="0" w:color="D3D3D3"/>
-              <w:bottom w:val="single" w:space="0" w:color="D3D3D3"/>
-              <w:start w:val="single" w:space="0" w:color="D3D3D3"/>
-              <w:end w:val="single" w:space="0" w:color="D3D3D3"/>
-            </w:tcBorders>
-          </w:tcPr>
-          <w:p>
-            <w:pPr>
-              <w:spacing w:before="0" w:after="60"/>
-              <w:keepNext/>
-              <w:jc w:val="center"/>
-            </w:pPr>
-            <w:r>
-              <w:rPr>
-                <w:rFonts w:ascii="Calibri" w:hAnsi="Calibri"/>
-                <w:sz w:val="20"/>
-              </w:rPr>
-              <w:t xml:space="default">2,110,131</w:t>
-            </w:r>
-          </w:p>
-        </w:tc>
-        <w:tc>
-          <w:tcPr>
-            <w:tcBorders>
-              <w:top w:val="single" w:space="0" w:color="D3D3D3"/>
-              <w:bottom w:val="single" w:space="0" w:color="D3D3D3"/>
-              <w:start w:val="single" w:space="0" w:color="D3D3D3"/>
-              <w:end w:val="single" w:space="0" w:color="D3D3D3"/>
-            </w:tcBorders>
-          </w:tcPr>
-          <w:p>
-            <w:pPr>
-              <w:spacing w:before="0" w:after="60"/>
-              <w:keepNext/>
-              <w:jc w:val="center"/>
-            </w:pPr>
-            <w:r>
-              <w:rPr>
-                <w:rFonts w:ascii="Calibri" w:hAnsi="Calibri"/>
-                <w:sz w:val="20"/>
-              </w:rPr>
-              <w:t xml:space="default">2,296,277</w:t>
+              <w:t xml:space="default">    Has insurance</w:t>
+            </w:r>
+          </w:p>
+        </w:tc>
+        <w:tc>
+          <w:tcPr>
+            <w:tcBorders>
+              <w:top w:val="single" w:space="0" w:color="D3D3D3"/>
+              <w:bottom w:val="single" w:space="0" w:color="D3D3D3"/>
+              <w:start w:val="single" w:space="0" w:color="D3D3D3"/>
+              <w:end w:val="single" w:space="0" w:color="D3D3D3"/>
+            </w:tcBorders>
+          </w:tcPr>
+          <w:p>
+            <w:pPr>
+              <w:spacing w:before="0" w:after="60"/>
+              <w:keepNext/>
+              <w:jc w:val="center"/>
+            </w:pPr>
+            <w:r>
+              <w:rPr>
+                <w:rFonts w:ascii="Calibri" w:hAnsi="Calibri"/>
+                <w:sz w:val="20"/>
+              </w:rPr>
+              <w:t xml:space="default">4,501,000 (97%)</w:t>
+            </w:r>
+          </w:p>
+        </w:tc>
+        <w:tc>
+          <w:tcPr>
+            <w:tcBorders>
+              <w:top w:val="single" w:space="0" w:color="D3D3D3"/>
+              <w:bottom w:val="single" w:space="0" w:color="D3D3D3"/>
+              <w:start w:val="single" w:space="0" w:color="D3D3D3"/>
+              <w:end w:val="single" w:space="0" w:color="D3D3D3"/>
+            </w:tcBorders>
+          </w:tcPr>
+          <w:p>
+            <w:pPr>
+              <w:spacing w:before="0" w:after="60"/>
+              <w:keepNext/>
+              <w:jc w:val="center"/>
+            </w:pPr>
+            <w:r>
+              <w:rPr>
+                <w:rFonts w:ascii="Calibri" w:hAnsi="Calibri"/>
+                <w:sz w:val="20"/>
+              </w:rPr>
+              <w:t xml:space="default">4,840,375 (97%)</w:t>
             </w:r>
           </w:p>
         </w:tc>
@@ -1928,9 +1929,56 @@
               <w:rPr>
                 <w:rFonts w:ascii="Calibri" w:hAnsi="Calibri"/>
                 <w:sz w:val="20"/>
-                <w:b w:val="true"/>
-              </w:rPr>
-              <w:t xml:space="default">Has insurance</w:t>
+              </w:rPr>
+              <w:t xml:space="default">    No insurance</w:t>
+            </w:r>
+          </w:p>
+        </w:tc>
+        <w:tc>
+          <w:tcPr>
+            <w:tcBorders>
+              <w:top w:val="single" w:space="0" w:color="D3D3D3"/>
+              <w:bottom w:val="single" w:space="0" w:color="D3D3D3"/>
+              <w:start w:val="single" w:space="0" w:color="D3D3D3"/>
+              <w:end w:val="single" w:space="0" w:color="D3D3D3"/>
+            </w:tcBorders>
+          </w:tcPr>
+          <w:p>
+            <w:pPr>
+              <w:spacing w:before="0" w:after="60"/>
+              <w:keepNext/>
+              <w:jc w:val="center"/>
+            </w:pPr>
+            <w:r>
+              <w:rPr>
+                <w:rFonts w:ascii="Calibri" w:hAnsi="Calibri"/>
+                <w:sz w:val="20"/>
+              </w:rPr>
+              <w:t xml:space="default">160,802 (3.4%)</w:t>
+            </w:r>
+          </w:p>
+        </w:tc>
+        <w:tc>
+          <w:tcPr>
+            <w:tcBorders>
+              <w:top w:val="single" w:space="0" w:color="D3D3D3"/>
+              <w:bottom w:val="single" w:space="0" w:color="D3D3D3"/>
+              <w:start w:val="single" w:space="0" w:color="D3D3D3"/>
+              <w:end w:val="single" w:space="0" w:color="D3D3D3"/>
+            </w:tcBorders>
+          </w:tcPr>
+          <w:p>
+            <w:pPr>
+              <w:spacing w:before="0" w:after="60"/>
+              <w:keepNext/>
+              <w:jc w:val="center"/>
+            </w:pPr>
+            <w:r>
+              <w:rPr>
+                <w:rFonts w:ascii="Calibri" w:hAnsi="Calibri"/>
+                <w:sz w:val="20"/>
+              </w:rPr>
+              <w:t xml:space="default">146,995 (2.9%)</w:t>
             </w:r>
           </w:p>
         </w:tc>
@@ -1955,54 +2003,6 @@
                 <w:sz w:val="20"/>
               </w:rPr>
               <w:t xml:space="default"/>
-            </w:r>
-          </w:p>
-        </w:tc>
-        <w:tc>
-          <w:tcPr>
-            <w:tcBorders>
-              <w:top w:val="single" w:space="0" w:color="D3D3D3"/>
-              <w:bottom w:val="single" w:space="0" w:color="D3D3D3"/>
-              <w:start w:val="single" w:space="0" w:color="D3D3D3"/>
-              <w:end w:val="single" w:space="0" w:color="D3D3D3"/>
-            </w:tcBorders>
-          </w:tcPr>
-          <w:p>
-            <w:pPr>
-              <w:spacing w:before="0" w:after="60"/>
-              <w:keepNext/>
-              <w:jc w:val="center"/>
-            </w:pPr>
-            <w:r>
-              <w:rPr>
-                <w:rFonts w:ascii="Calibri" w:hAnsi="Calibri"/>
-                <w:sz w:val="20"/>
-              </w:rPr>
-              <w:t xml:space="default"/>
-            </w:r>
-          </w:p>
-        </w:tc>
-        <w:tc>
-          <w:tcPr>
-            <w:tcBorders>
-              <w:top w:val="single" w:space="0" w:color="D3D3D3"/>
-              <w:bottom w:val="single" w:space="0" w:color="D3D3D3"/>
-              <w:start w:val="single" w:space="0" w:color="D3D3D3"/>
-              <w:end w:val="single" w:space="0" w:color="D3D3D3"/>
-            </w:tcBorders>
-          </w:tcPr>
-          <w:p>
-            <w:pPr>
-              <w:spacing w:before="0" w:after="60"/>
-              <w:keepNext/>
-              <w:jc w:val="center"/>
-            </w:pPr>
-            <w:r>
-              <w:rPr>
-                <w:rFonts w:ascii="Calibri" w:hAnsi="Calibri"/>
-                <w:sz w:val="20"/>
-              </w:rPr>
-              <w:t xml:space="default">0.8</w:t>
             </w:r>
           </w:p>
         </w:tc>
@@ -2030,56 +2030,57 @@
               <w:rPr>
                 <w:rFonts w:ascii="Calibri" w:hAnsi="Calibri"/>
                 <w:sz w:val="20"/>
-              </w:rPr>
-              <w:t xml:space="default">    Has insurance</w:t>
-            </w:r>
-          </w:p>
-        </w:tc>
-        <w:tc>
-          <w:tcPr>
-            <w:tcBorders>
-              <w:top w:val="single" w:space="0" w:color="D3D3D3"/>
-              <w:bottom w:val="single" w:space="0" w:color="D3D3D3"/>
-              <w:start w:val="single" w:space="0" w:color="D3D3D3"/>
-              <w:end w:val="single" w:space="0" w:color="D3D3D3"/>
-            </w:tcBorders>
-          </w:tcPr>
-          <w:p>
-            <w:pPr>
-              <w:spacing w:before="0" w:after="60"/>
-              <w:keepNext/>
-              <w:jc w:val="center"/>
-            </w:pPr>
-            <w:r>
-              <w:rPr>
-                <w:rFonts w:ascii="Calibri" w:hAnsi="Calibri"/>
-                <w:sz w:val="20"/>
-              </w:rPr>
-              <w:t xml:space="default">4,501,000 (97%)</w:t>
-            </w:r>
-          </w:p>
-        </w:tc>
-        <w:tc>
-          <w:tcPr>
-            <w:tcBorders>
-              <w:top w:val="single" w:space="0" w:color="D3D3D3"/>
-              <w:bottom w:val="single" w:space="0" w:color="D3D3D3"/>
-              <w:start w:val="single" w:space="0" w:color="D3D3D3"/>
-              <w:end w:val="single" w:space="0" w:color="D3D3D3"/>
-            </w:tcBorders>
-          </w:tcPr>
-          <w:p>
-            <w:pPr>
-              <w:spacing w:before="0" w:after="60"/>
-              <w:keepNext/>
-              <w:jc w:val="center"/>
-            </w:pPr>
-            <w:r>
-              <w:rPr>
-                <w:rFonts w:ascii="Calibri" w:hAnsi="Calibri"/>
-                <w:sz w:val="20"/>
-              </w:rPr>
-              <w:t xml:space="default">4,840,375 (97%)</w:t>
+                <w:b w:val="true"/>
+              </w:rPr>
+              <w:t xml:space="default">Type of insurance</w:t>
+            </w:r>
+          </w:p>
+        </w:tc>
+        <w:tc>
+          <w:tcPr>
+            <w:tcBorders>
+              <w:top w:val="single" w:space="0" w:color="D3D3D3"/>
+              <w:bottom w:val="single" w:space="0" w:color="D3D3D3"/>
+              <w:start w:val="single" w:space="0" w:color="D3D3D3"/>
+              <w:end w:val="single" w:space="0" w:color="D3D3D3"/>
+            </w:tcBorders>
+          </w:tcPr>
+          <w:p>
+            <w:pPr>
+              <w:spacing w:before="0" w:after="60"/>
+              <w:keepNext/>
+              <w:jc w:val="center"/>
+            </w:pPr>
+            <w:r>
+              <w:rPr>
+                <w:rFonts w:ascii="Calibri" w:hAnsi="Calibri"/>
+                <w:sz w:val="20"/>
+              </w:rPr>
+              <w:t xml:space="default"/>
+            </w:r>
+          </w:p>
+        </w:tc>
+        <w:tc>
+          <w:tcPr>
+            <w:tcBorders>
+              <w:top w:val="single" w:space="0" w:color="D3D3D3"/>
+              <w:bottom w:val="single" w:space="0" w:color="D3D3D3"/>
+              <w:start w:val="single" w:space="0" w:color="D3D3D3"/>
+              <w:end w:val="single" w:space="0" w:color="D3D3D3"/>
+            </w:tcBorders>
+          </w:tcPr>
+          <w:p>
+            <w:pPr>
+              <w:spacing w:before="0" w:after="60"/>
+              <w:keepNext/>
+              <w:jc w:val="center"/>
+            </w:pPr>
+            <w:r>
+              <w:rPr>
+                <w:rFonts w:ascii="Calibri" w:hAnsi="Calibri"/>
+                <w:sz w:val="20"/>
+              </w:rPr>
+              <w:t xml:space="default"/>
             </w:r>
           </w:p>
         </w:tc>
@@ -2132,55 +2133,55 @@
                 <w:rFonts w:ascii="Calibri" w:hAnsi="Calibri"/>
                 <w:sz w:val="20"/>
               </w:rPr>
-              <w:t xml:space="default">    No insurance</w:t>
-            </w:r>
-          </w:p>
-        </w:tc>
-        <w:tc>
-          <w:tcPr>
-            <w:tcBorders>
-              <w:top w:val="single" w:space="0" w:color="D3D3D3"/>
-              <w:bottom w:val="single" w:space="0" w:color="D3D3D3"/>
-              <w:start w:val="single" w:space="0" w:color="D3D3D3"/>
-              <w:end w:val="single" w:space="0" w:color="D3D3D3"/>
-            </w:tcBorders>
-          </w:tcPr>
-          <w:p>
-            <w:pPr>
-              <w:spacing w:before="0" w:after="60"/>
-              <w:keepNext/>
-              <w:jc w:val="center"/>
-            </w:pPr>
-            <w:r>
-              <w:rPr>
-                <w:rFonts w:ascii="Calibri" w:hAnsi="Calibri"/>
-                <w:sz w:val="20"/>
-              </w:rPr>
-              <w:t xml:space="default">160,802 (3.4%)</w:t>
-            </w:r>
-          </w:p>
-        </w:tc>
-        <w:tc>
-          <w:tcPr>
-            <w:tcBorders>
-              <w:top w:val="single" w:space="0" w:color="D3D3D3"/>
-              <w:bottom w:val="single" w:space="0" w:color="D3D3D3"/>
-              <w:start w:val="single" w:space="0" w:color="D3D3D3"/>
-              <w:end w:val="single" w:space="0" w:color="D3D3D3"/>
-            </w:tcBorders>
-          </w:tcPr>
-          <w:p>
-            <w:pPr>
-              <w:spacing w:before="0" w:after="60"/>
-              <w:keepNext/>
-              <w:jc w:val="center"/>
-            </w:pPr>
-            <w:r>
-              <w:rPr>
-                <w:rFonts w:ascii="Calibri" w:hAnsi="Calibri"/>
-                <w:sz w:val="20"/>
-              </w:rPr>
-              <w:t xml:space="default">146,995 (2.9%)</w:t>
+              <w:t xml:space="default">    Private only</w:t>
+            </w:r>
+          </w:p>
+        </w:tc>
+        <w:tc>
+          <w:tcPr>
+            <w:tcBorders>
+              <w:top w:val="single" w:space="0" w:color="D3D3D3"/>
+              <w:bottom w:val="single" w:space="0" w:color="D3D3D3"/>
+              <w:start w:val="single" w:space="0" w:color="D3D3D3"/>
+              <w:end w:val="single" w:space="0" w:color="D3D3D3"/>
+            </w:tcBorders>
+          </w:tcPr>
+          <w:p>
+            <w:pPr>
+              <w:spacing w:before="0" w:after="60"/>
+              <w:keepNext/>
+              <w:jc w:val="center"/>
+            </w:pPr>
+            <w:r>
+              <w:rPr>
+                <w:rFonts w:ascii="Calibri" w:hAnsi="Calibri"/>
+                <w:sz w:val="20"/>
+              </w:rPr>
+              <w:t xml:space="default">2,525,354 (54%)</w:t>
+            </w:r>
+          </w:p>
+        </w:tc>
+        <w:tc>
+          <w:tcPr>
+            <w:tcBorders>
+              <w:top w:val="single" w:space="0" w:color="D3D3D3"/>
+              <w:bottom w:val="single" w:space="0" w:color="D3D3D3"/>
+              <w:start w:val="single" w:space="0" w:color="D3D3D3"/>
+              <w:end w:val="single" w:space="0" w:color="D3D3D3"/>
+            </w:tcBorders>
+          </w:tcPr>
+          <w:p>
+            <w:pPr>
+              <w:spacing w:before="0" w:after="60"/>
+              <w:keepNext/>
+              <w:jc w:val="center"/>
+            </w:pPr>
+            <w:r>
+              <w:rPr>
+                <w:rFonts w:ascii="Calibri" w:hAnsi="Calibri"/>
+                <w:sz w:val="20"/>
+              </w:rPr>
+              <w:t xml:space="default">2,811,946 (56%)</w:t>
             </w:r>
           </w:p>
         </w:tc>
@@ -2232,9 +2233,56 @@
               <w:rPr>
                 <w:rFonts w:ascii="Calibri" w:hAnsi="Calibri"/>
                 <w:sz w:val="20"/>
-                <w:b w:val="true"/>
-              </w:rPr>
-              <w:t xml:space="default">Type of Insurance</w:t>
+              </w:rPr>
+              <w:t xml:space="default">    Medicaid only</w:t>
+            </w:r>
+          </w:p>
+        </w:tc>
+        <w:tc>
+          <w:tcPr>
+            <w:tcBorders>
+              <w:top w:val="single" w:space="0" w:color="D3D3D3"/>
+              <w:bottom w:val="single" w:space="0" w:color="D3D3D3"/>
+              <w:start w:val="single" w:space="0" w:color="D3D3D3"/>
+              <w:end w:val="single" w:space="0" w:color="D3D3D3"/>
+            </w:tcBorders>
+          </w:tcPr>
+          <w:p>
+            <w:pPr>
+              <w:spacing w:before="0" w:after="60"/>
+              <w:keepNext/>
+              <w:jc w:val="center"/>
+            </w:pPr>
+            <w:r>
+              <w:rPr>
+                <w:rFonts w:ascii="Calibri" w:hAnsi="Calibri"/>
+                <w:sz w:val="20"/>
+              </w:rPr>
+              <w:t xml:space="default">1,532,391 (33%)</w:t>
+            </w:r>
+          </w:p>
+        </w:tc>
+        <w:tc>
+          <w:tcPr>
+            <w:tcBorders>
+              <w:top w:val="single" w:space="0" w:color="D3D3D3"/>
+              <w:bottom w:val="single" w:space="0" w:color="D3D3D3"/>
+              <w:start w:val="single" w:space="0" w:color="D3D3D3"/>
+              <w:end w:val="single" w:space="0" w:color="D3D3D3"/>
+            </w:tcBorders>
+          </w:tcPr>
+          <w:p>
+            <w:pPr>
+              <w:spacing w:before="0" w:after="60"/>
+              <w:keepNext/>
+              <w:jc w:val="center"/>
+            </w:pPr>
+            <w:r>
+              <w:rPr>
+                <w:rFonts w:ascii="Calibri" w:hAnsi="Calibri"/>
+                <w:sz w:val="20"/>
+              </w:rPr>
+              <w:t xml:space="default">1,542,853 (31%)</w:t>
             </w:r>
           </w:p>
         </w:tc>
@@ -2259,54 +2307,6 @@
                 <w:sz w:val="20"/>
               </w:rPr>
               <w:t xml:space="default"/>
-            </w:r>
-          </w:p>
-        </w:tc>
-        <w:tc>
-          <w:tcPr>
-            <w:tcBorders>
-              <w:top w:val="single" w:space="0" w:color="D3D3D3"/>
-              <w:bottom w:val="single" w:space="0" w:color="D3D3D3"/>
-              <w:start w:val="single" w:space="0" w:color="D3D3D3"/>
-              <w:end w:val="single" w:space="0" w:color="D3D3D3"/>
-            </w:tcBorders>
-          </w:tcPr>
-          <w:p>
-            <w:pPr>
-              <w:spacing w:before="0" w:after="60"/>
-              <w:keepNext/>
-              <w:jc w:val="center"/>
-            </w:pPr>
-            <w:r>
-              <w:rPr>
-                <w:rFonts w:ascii="Calibri" w:hAnsi="Calibri"/>
-                <w:sz w:val="20"/>
-              </w:rPr>
-              <w:t xml:space="default"/>
-            </w:r>
-          </w:p>
-        </w:tc>
-        <w:tc>
-          <w:tcPr>
-            <w:tcBorders>
-              <w:top w:val="single" w:space="0" w:color="D3D3D3"/>
-              <w:bottom w:val="single" w:space="0" w:color="D3D3D3"/>
-              <w:start w:val="single" w:space="0" w:color="D3D3D3"/>
-              <w:end w:val="single" w:space="0" w:color="D3D3D3"/>
-            </w:tcBorders>
-          </w:tcPr>
-          <w:p>
-            <w:pPr>
-              <w:spacing w:before="0" w:after="60"/>
-              <w:keepNext/>
-              <w:jc w:val="center"/>
-            </w:pPr>
-            <w:r>
-              <w:rPr>
-                <w:rFonts w:ascii="Calibri" w:hAnsi="Calibri"/>
-                <w:sz w:val="20"/>
-              </w:rPr>
-              <w:t xml:space="default">0.9</w:t>
             </w:r>
           </w:p>
         </w:tc>
@@ -2335,55 +2335,55 @@
                 <w:rFonts w:ascii="Calibri" w:hAnsi="Calibri"/>
                 <w:sz w:val="20"/>
               </w:rPr>
-              <w:t xml:space="default">    Medicaid only</w:t>
-            </w:r>
-          </w:p>
-        </w:tc>
-        <w:tc>
-          <w:tcPr>
-            <w:tcBorders>
-              <w:top w:val="single" w:space="0" w:color="D3D3D3"/>
-              <w:bottom w:val="single" w:space="0" w:color="D3D3D3"/>
-              <w:start w:val="single" w:space="0" w:color="D3D3D3"/>
-              <w:end w:val="single" w:space="0" w:color="D3D3D3"/>
-            </w:tcBorders>
-          </w:tcPr>
-          <w:p>
-            <w:pPr>
-              <w:spacing w:before="0" w:after="60"/>
-              <w:keepNext/>
-              <w:jc w:val="center"/>
-            </w:pPr>
-            <w:r>
-              <w:rPr>
-                <w:rFonts w:ascii="Calibri" w:hAnsi="Calibri"/>
-                <w:sz w:val="20"/>
-              </w:rPr>
-              <w:t xml:space="default">1,532,391 (33%)</w:t>
-            </w:r>
-          </w:p>
-        </w:tc>
-        <w:tc>
-          <w:tcPr>
-            <w:tcBorders>
-              <w:top w:val="single" w:space="0" w:color="D3D3D3"/>
-              <w:bottom w:val="single" w:space="0" w:color="D3D3D3"/>
-              <w:start w:val="single" w:space="0" w:color="D3D3D3"/>
-              <w:end w:val="single" w:space="0" w:color="D3D3D3"/>
-            </w:tcBorders>
-          </w:tcPr>
-          <w:p>
-            <w:pPr>
-              <w:spacing w:before="0" w:after="60"/>
-              <w:keepNext/>
-              <w:jc w:val="center"/>
-            </w:pPr>
-            <w:r>
-              <w:rPr>
-                <w:rFonts w:ascii="Calibri" w:hAnsi="Calibri"/>
-                <w:sz w:val="20"/>
-              </w:rPr>
-              <w:t xml:space="default">1,542,853 (31%)</w:t>
+              <w:t xml:space="default">    Medicaid, with private</w:t>
+            </w:r>
+          </w:p>
+        </w:tc>
+        <w:tc>
+          <w:tcPr>
+            <w:tcBorders>
+              <w:top w:val="single" w:space="0" w:color="D3D3D3"/>
+              <w:bottom w:val="single" w:space="0" w:color="D3D3D3"/>
+              <w:start w:val="single" w:space="0" w:color="D3D3D3"/>
+              <w:end w:val="single" w:space="0" w:color="D3D3D3"/>
+            </w:tcBorders>
+          </w:tcPr>
+          <w:p>
+            <w:pPr>
+              <w:spacing w:before="0" w:after="60"/>
+              <w:keepNext/>
+              <w:jc w:val="center"/>
+            </w:pPr>
+            <w:r>
+              <w:rPr>
+                <w:rFonts w:ascii="Calibri" w:hAnsi="Calibri"/>
+                <w:sz w:val="20"/>
+              </w:rPr>
+              <w:t xml:space="default">254,956 (5.5%)</w:t>
+            </w:r>
+          </w:p>
+        </w:tc>
+        <w:tc>
+          <w:tcPr>
+            <w:tcBorders>
+              <w:top w:val="single" w:space="0" w:color="D3D3D3"/>
+              <w:bottom w:val="single" w:space="0" w:color="D3D3D3"/>
+              <w:start w:val="single" w:space="0" w:color="D3D3D3"/>
+              <w:end w:val="single" w:space="0" w:color="D3D3D3"/>
+            </w:tcBorders>
+          </w:tcPr>
+          <w:p>
+            <w:pPr>
+              <w:spacing w:before="0" w:after="60"/>
+              <w:keepNext/>
+              <w:jc w:val="center"/>
+            </w:pPr>
+            <w:r>
+              <w:rPr>
+                <w:rFonts w:ascii="Calibri" w:hAnsi="Calibri"/>
+                <w:sz w:val="20"/>
+              </w:rPr>
+              <w:t xml:space="default">246,461 (4.9%)</w:t>
             </w:r>
           </w:p>
         </w:tc>
@@ -2436,55 +2436,55 @@
                 <w:rFonts w:ascii="Calibri" w:hAnsi="Calibri"/>
                 <w:sz w:val="20"/>
               </w:rPr>
-              <w:t xml:space="default">    Medicaid, with private</w:t>
-            </w:r>
-          </w:p>
-        </w:tc>
-        <w:tc>
-          <w:tcPr>
-            <w:tcBorders>
-              <w:top w:val="single" w:space="0" w:color="D3D3D3"/>
-              <w:bottom w:val="single" w:space="0" w:color="D3D3D3"/>
-              <w:start w:val="single" w:space="0" w:color="D3D3D3"/>
-              <w:end w:val="single" w:space="0" w:color="D3D3D3"/>
-            </w:tcBorders>
-          </w:tcPr>
-          <w:p>
-            <w:pPr>
-              <w:spacing w:before="0" w:after="60"/>
-              <w:keepNext/>
-              <w:jc w:val="center"/>
-            </w:pPr>
-            <w:r>
-              <w:rPr>
-                <w:rFonts w:ascii="Calibri" w:hAnsi="Calibri"/>
-                <w:sz w:val="20"/>
-              </w:rPr>
-              <w:t xml:space="default">254,956 (5.5%)</w:t>
-            </w:r>
-          </w:p>
-        </w:tc>
-        <w:tc>
-          <w:tcPr>
-            <w:tcBorders>
-              <w:top w:val="single" w:space="0" w:color="D3D3D3"/>
-              <w:bottom w:val="single" w:space="0" w:color="D3D3D3"/>
-              <w:start w:val="single" w:space="0" w:color="D3D3D3"/>
-              <w:end w:val="single" w:space="0" w:color="D3D3D3"/>
-            </w:tcBorders>
-          </w:tcPr>
-          <w:p>
-            <w:pPr>
-              <w:spacing w:before="0" w:after="60"/>
-              <w:keepNext/>
-              <w:jc w:val="center"/>
-            </w:pPr>
-            <w:r>
-              <w:rPr>
-                <w:rFonts w:ascii="Calibri" w:hAnsi="Calibri"/>
-                <w:sz w:val="20"/>
-              </w:rPr>
-              <w:t xml:space="default">246,461 (4.9%)</w:t>
+              <w:t xml:space="default">    Medicare only</w:t>
+            </w:r>
+          </w:p>
+        </w:tc>
+        <w:tc>
+          <w:tcPr>
+            <w:tcBorders>
+              <w:top w:val="single" w:space="0" w:color="D3D3D3"/>
+              <w:bottom w:val="single" w:space="0" w:color="D3D3D3"/>
+              <w:start w:val="single" w:space="0" w:color="D3D3D3"/>
+              <w:end w:val="single" w:space="0" w:color="D3D3D3"/>
+            </w:tcBorders>
+          </w:tcPr>
+          <w:p>
+            <w:pPr>
+              <w:spacing w:before="0" w:after="60"/>
+              <w:keepNext/>
+              <w:jc w:val="center"/>
+            </w:pPr>
+            <w:r>
+              <w:rPr>
+                <w:rFonts w:ascii="Calibri" w:hAnsi="Calibri"/>
+                <w:sz w:val="20"/>
+              </w:rPr>
+              <w:t xml:space="default">32,495 (0.7%)</w:t>
+            </w:r>
+          </w:p>
+        </w:tc>
+        <w:tc>
+          <w:tcPr>
+            <w:tcBorders>
+              <w:top w:val="single" w:space="0" w:color="D3D3D3"/>
+              <w:bottom w:val="single" w:space="0" w:color="D3D3D3"/>
+              <w:start w:val="single" w:space="0" w:color="D3D3D3"/>
+              <w:end w:val="single" w:space="0" w:color="D3D3D3"/>
+            </w:tcBorders>
+          </w:tcPr>
+          <w:p>
+            <w:pPr>
+              <w:spacing w:before="0" w:after="60"/>
+              <w:keepNext/>
+              <w:jc w:val="center"/>
+            </w:pPr>
+            <w:r>
+              <w:rPr>
+                <w:rFonts w:ascii="Calibri" w:hAnsi="Calibri"/>
+                <w:sz w:val="20"/>
+              </w:rPr>
+              <w:t xml:space="default">53,338 (1.1%)</w:t>
             </w:r>
           </w:p>
         </w:tc>
@@ -2537,55 +2537,55 @@
                 <w:rFonts w:ascii="Calibri" w:hAnsi="Calibri"/>
                 <w:sz w:val="20"/>
               </w:rPr>
-              <w:t xml:space="default">    Medicare only</w:t>
-            </w:r>
-          </w:p>
-        </w:tc>
-        <w:tc>
-          <w:tcPr>
-            <w:tcBorders>
-              <w:top w:val="single" w:space="0" w:color="D3D3D3"/>
-              <w:bottom w:val="single" w:space="0" w:color="D3D3D3"/>
-              <w:start w:val="single" w:space="0" w:color="D3D3D3"/>
-              <w:end w:val="single" w:space="0" w:color="D3D3D3"/>
-            </w:tcBorders>
-          </w:tcPr>
-          <w:p>
-            <w:pPr>
-              <w:spacing w:before="0" w:after="60"/>
-              <w:keepNext/>
-              <w:jc w:val="center"/>
-            </w:pPr>
-            <w:r>
-              <w:rPr>
-                <w:rFonts w:ascii="Calibri" w:hAnsi="Calibri"/>
-                <w:sz w:val="20"/>
-              </w:rPr>
-              <w:t xml:space="default">32,495 (0.7%)</w:t>
-            </w:r>
-          </w:p>
-        </w:tc>
-        <w:tc>
-          <w:tcPr>
-            <w:tcBorders>
-              <w:top w:val="single" w:space="0" w:color="D3D3D3"/>
-              <w:bottom w:val="single" w:space="0" w:color="D3D3D3"/>
-              <w:start w:val="single" w:space="0" w:color="D3D3D3"/>
-              <w:end w:val="single" w:space="0" w:color="D3D3D3"/>
-            </w:tcBorders>
-          </w:tcPr>
-          <w:p>
-            <w:pPr>
-              <w:spacing w:before="0" w:after="60"/>
-              <w:keepNext/>
-              <w:jc w:val="center"/>
-            </w:pPr>
-            <w:r>
-              <w:rPr>
-                <w:rFonts w:ascii="Calibri" w:hAnsi="Calibri"/>
-                <w:sz w:val="20"/>
-              </w:rPr>
-              <w:t xml:space="default">53,338 (1.1%)</w:t>
+              <w:t xml:space="default">    Medicare, with private</w:t>
+            </w:r>
+          </w:p>
+        </w:tc>
+        <w:tc>
+          <w:tcPr>
+            <w:tcBorders>
+              <w:top w:val="single" w:space="0" w:color="D3D3D3"/>
+              <w:bottom w:val="single" w:space="0" w:color="D3D3D3"/>
+              <w:start w:val="single" w:space="0" w:color="D3D3D3"/>
+              <w:end w:val="single" w:space="0" w:color="D3D3D3"/>
+            </w:tcBorders>
+          </w:tcPr>
+          <w:p>
+            <w:pPr>
+              <w:spacing w:before="0" w:after="60"/>
+              <w:keepNext/>
+              <w:jc w:val="center"/>
+            </w:pPr>
+            <w:r>
+              <w:rPr>
+                <w:rFonts w:ascii="Calibri" w:hAnsi="Calibri"/>
+                <w:sz w:val="20"/>
+              </w:rPr>
+              <w:t xml:space="default">69,793 (1.5%)</w:t>
+            </w:r>
+          </w:p>
+        </w:tc>
+        <w:tc>
+          <w:tcPr>
+            <w:tcBorders>
+              <w:top w:val="single" w:space="0" w:color="D3D3D3"/>
+              <w:bottom w:val="single" w:space="0" w:color="D3D3D3"/>
+              <w:start w:val="single" w:space="0" w:color="D3D3D3"/>
+              <w:end w:val="single" w:space="0" w:color="D3D3D3"/>
+            </w:tcBorders>
+          </w:tcPr>
+          <w:p>
+            <w:pPr>
+              <w:spacing w:before="0" w:after="60"/>
+              <w:keepNext/>
+              <w:jc w:val="center"/>
+            </w:pPr>
+            <w:r>
+              <w:rPr>
+                <w:rFonts w:ascii="Calibri" w:hAnsi="Calibri"/>
+                <w:sz w:val="20"/>
+              </w:rPr>
+              <w:t xml:space="default">83,685 (1.7%)</w:t>
             </w:r>
           </w:p>
         </w:tc>
@@ -2638,55 +2638,55 @@
                 <w:rFonts w:ascii="Calibri" w:hAnsi="Calibri"/>
                 <w:sz w:val="20"/>
               </w:rPr>
-              <w:t xml:space="default">    Medicare, with private</w:t>
-            </w:r>
-          </w:p>
-        </w:tc>
-        <w:tc>
-          <w:tcPr>
-            <w:tcBorders>
-              <w:top w:val="single" w:space="0" w:color="D3D3D3"/>
-              <w:bottom w:val="single" w:space="0" w:color="D3D3D3"/>
-              <w:start w:val="single" w:space="0" w:color="D3D3D3"/>
-              <w:end w:val="single" w:space="0" w:color="D3D3D3"/>
-            </w:tcBorders>
-          </w:tcPr>
-          <w:p>
-            <w:pPr>
-              <w:spacing w:before="0" w:after="60"/>
-              <w:keepNext/>
-              <w:jc w:val="center"/>
-            </w:pPr>
-            <w:r>
-              <w:rPr>
-                <w:rFonts w:ascii="Calibri" w:hAnsi="Calibri"/>
-                <w:sz w:val="20"/>
-              </w:rPr>
-              <w:t xml:space="default">69,793 (1.5%)</w:t>
-            </w:r>
-          </w:p>
-        </w:tc>
-        <w:tc>
-          <w:tcPr>
-            <w:tcBorders>
-              <w:top w:val="single" w:space="0" w:color="D3D3D3"/>
-              <w:bottom w:val="single" w:space="0" w:color="D3D3D3"/>
-              <w:start w:val="single" w:space="0" w:color="D3D3D3"/>
-              <w:end w:val="single" w:space="0" w:color="D3D3D3"/>
-            </w:tcBorders>
-          </w:tcPr>
-          <w:p>
-            <w:pPr>
-              <w:spacing w:before="0" w:after="60"/>
-              <w:keepNext/>
-              <w:jc w:val="center"/>
-            </w:pPr>
-            <w:r>
-              <w:rPr>
-                <w:rFonts w:ascii="Calibri" w:hAnsi="Calibri"/>
-                <w:sz w:val="20"/>
-              </w:rPr>
-              <w:t xml:space="default">83,685 (1.7%)</w:t>
+              <w:t xml:space="default">    Medicare, with other public</w:t>
+            </w:r>
+          </w:p>
+        </w:tc>
+        <w:tc>
+          <w:tcPr>
+            <w:tcBorders>
+              <w:top w:val="single" w:space="0" w:color="D3D3D3"/>
+              <w:bottom w:val="single" w:space="0" w:color="D3D3D3"/>
+              <w:start w:val="single" w:space="0" w:color="D3D3D3"/>
+              <w:end w:val="single" w:space="0" w:color="D3D3D3"/>
+            </w:tcBorders>
+          </w:tcPr>
+          <w:p>
+            <w:pPr>
+              <w:spacing w:before="0" w:after="60"/>
+              <w:keepNext/>
+              <w:jc w:val="center"/>
+            </w:pPr>
+            <w:r>
+              <w:rPr>
+                <w:rFonts w:ascii="Calibri" w:hAnsi="Calibri"/>
+                <w:sz w:val="20"/>
+              </w:rPr>
+              <w:t xml:space="default">0 (0%)</w:t>
+            </w:r>
+          </w:p>
+        </w:tc>
+        <w:tc>
+          <w:tcPr>
+            <w:tcBorders>
+              <w:top w:val="single" w:space="0" w:color="D3D3D3"/>
+              <w:bottom w:val="single" w:space="0" w:color="D3D3D3"/>
+              <w:start w:val="single" w:space="0" w:color="D3D3D3"/>
+              <w:end w:val="single" w:space="0" w:color="D3D3D3"/>
+            </w:tcBorders>
+          </w:tcPr>
+          <w:p>
+            <w:pPr>
+              <w:spacing w:before="0" w:after="60"/>
+              <w:keepNext/>
+              <w:jc w:val="center"/>
+            </w:pPr>
+            <w:r>
+              <w:rPr>
+                <w:rFonts w:ascii="Calibri" w:hAnsi="Calibri"/>
+                <w:sz w:val="20"/>
+              </w:rPr>
+              <w:t xml:space="default">0 (0%)</w:t>
             </w:r>
           </w:p>
         </w:tc>
@@ -2739,55 +2739,55 @@
                 <w:rFonts w:ascii="Calibri" w:hAnsi="Calibri"/>
                 <w:sz w:val="20"/>
               </w:rPr>
-              <w:t xml:space="default">    Other public</w:t>
-            </w:r>
-          </w:p>
-        </w:tc>
-        <w:tc>
-          <w:tcPr>
-            <w:tcBorders>
-              <w:top w:val="single" w:space="0" w:color="D3D3D3"/>
-              <w:bottom w:val="single" w:space="0" w:color="D3D3D3"/>
-              <w:start w:val="single" w:space="0" w:color="D3D3D3"/>
-              <w:end w:val="single" w:space="0" w:color="D3D3D3"/>
-            </w:tcBorders>
-          </w:tcPr>
-          <w:p>
-            <w:pPr>
-              <w:spacing w:before="0" w:after="60"/>
-              <w:keepNext/>
-              <w:jc w:val="center"/>
-            </w:pPr>
-            <w:r>
-              <w:rPr>
-                <w:rFonts w:ascii="Calibri" w:hAnsi="Calibri"/>
-                <w:sz w:val="20"/>
-              </w:rPr>
-              <w:t xml:space="default">86,010 (1.8%)</w:t>
-            </w:r>
-          </w:p>
-        </w:tc>
-        <w:tc>
-          <w:tcPr>
-            <w:tcBorders>
-              <w:top w:val="single" w:space="0" w:color="D3D3D3"/>
-              <w:bottom w:val="single" w:space="0" w:color="D3D3D3"/>
-              <w:start w:val="single" w:space="0" w:color="D3D3D3"/>
-              <w:end w:val="single" w:space="0" w:color="D3D3D3"/>
-            </w:tcBorders>
-          </w:tcPr>
-          <w:p>
-            <w:pPr>
-              <w:spacing w:before="0" w:after="60"/>
-              <w:keepNext/>
-              <w:jc w:val="center"/>
-            </w:pPr>
-            <w:r>
-              <w:rPr>
-                <w:rFonts w:ascii="Calibri" w:hAnsi="Calibri"/>
-                <w:sz w:val="20"/>
-              </w:rPr>
-              <w:t xml:space="default">89,779 (1.8%)</w:t>
+              <w:t xml:space="default">    Medicare, dual-eligible</w:t>
+            </w:r>
+          </w:p>
+        </w:tc>
+        <w:tc>
+          <w:tcPr>
+            <w:tcBorders>
+              <w:top w:val="single" w:space="0" w:color="D3D3D3"/>
+              <w:bottom w:val="single" w:space="0" w:color="D3D3D3"/>
+              <w:start w:val="single" w:space="0" w:color="D3D3D3"/>
+              <w:end w:val="single" w:space="0" w:color="D3D3D3"/>
+            </w:tcBorders>
+          </w:tcPr>
+          <w:p>
+            <w:pPr>
+              <w:spacing w:before="0" w:after="60"/>
+              <w:keepNext/>
+              <w:jc w:val="center"/>
+            </w:pPr>
+            <w:r>
+              <w:rPr>
+                <w:rFonts w:ascii="Calibri" w:hAnsi="Calibri"/>
+                <w:sz w:val="20"/>
+              </w:rPr>
+              <w:t xml:space="default">0 (0%)</w:t>
+            </w:r>
+          </w:p>
+        </w:tc>
+        <w:tc>
+          <w:tcPr>
+            <w:tcBorders>
+              <w:top w:val="single" w:space="0" w:color="D3D3D3"/>
+              <w:bottom w:val="single" w:space="0" w:color="D3D3D3"/>
+              <w:start w:val="single" w:space="0" w:color="D3D3D3"/>
+              <w:end w:val="single" w:space="0" w:color="D3D3D3"/>
+            </w:tcBorders>
+          </w:tcPr>
+          <w:p>
+            <w:pPr>
+              <w:spacing w:before="0" w:after="60"/>
+              <w:keepNext/>
+              <w:jc w:val="center"/>
+            </w:pPr>
+            <w:r>
+              <w:rPr>
+                <w:rFonts w:ascii="Calibri" w:hAnsi="Calibri"/>
+                <w:sz w:val="20"/>
+              </w:rPr>
+              <w:t xml:space="default">12,313 (0.2%)</w:t>
             </w:r>
           </w:p>
         </w:tc>
@@ -2840,55 +2840,55 @@
                 <w:rFonts w:ascii="Calibri" w:hAnsi="Calibri"/>
                 <w:sz w:val="20"/>
               </w:rPr>
-              <w:t xml:space="default">    Private only</w:t>
-            </w:r>
-          </w:p>
-        </w:tc>
-        <w:tc>
-          <w:tcPr>
-            <w:tcBorders>
-              <w:top w:val="single" w:space="0" w:color="D3D3D3"/>
-              <w:bottom w:val="single" w:space="0" w:color="D3D3D3"/>
-              <w:start w:val="single" w:space="0" w:color="D3D3D3"/>
-              <w:end w:val="single" w:space="0" w:color="D3D3D3"/>
-            </w:tcBorders>
-          </w:tcPr>
-          <w:p>
-            <w:pPr>
-              <w:spacing w:before="0" w:after="60"/>
-              <w:keepNext/>
-              <w:jc w:val="center"/>
-            </w:pPr>
-            <w:r>
-              <w:rPr>
-                <w:rFonts w:ascii="Calibri" w:hAnsi="Calibri"/>
-                <w:sz w:val="20"/>
-              </w:rPr>
-              <w:t xml:space="default">2,525,354 (54%)</w:t>
-            </w:r>
-          </w:p>
-        </w:tc>
-        <w:tc>
-          <w:tcPr>
-            <w:tcBorders>
-              <w:top w:val="single" w:space="0" w:color="D3D3D3"/>
-              <w:bottom w:val="single" w:space="0" w:color="D3D3D3"/>
-              <w:start w:val="single" w:space="0" w:color="D3D3D3"/>
-              <w:end w:val="single" w:space="0" w:color="D3D3D3"/>
-            </w:tcBorders>
-          </w:tcPr>
-          <w:p>
-            <w:pPr>
-              <w:spacing w:before="0" w:after="60"/>
-              <w:keepNext/>
-              <w:jc w:val="center"/>
-            </w:pPr>
-            <w:r>
-              <w:rPr>
-                <w:rFonts w:ascii="Calibri" w:hAnsi="Calibri"/>
-                <w:sz w:val="20"/>
-              </w:rPr>
-              <w:t xml:space="default">2,811,946 (56%)</w:t>
+              <w:t xml:space="default">    Other public</w:t>
+            </w:r>
+          </w:p>
+        </w:tc>
+        <w:tc>
+          <w:tcPr>
+            <w:tcBorders>
+              <w:top w:val="single" w:space="0" w:color="D3D3D3"/>
+              <w:bottom w:val="single" w:space="0" w:color="D3D3D3"/>
+              <w:start w:val="single" w:space="0" w:color="D3D3D3"/>
+              <w:end w:val="single" w:space="0" w:color="D3D3D3"/>
+            </w:tcBorders>
+          </w:tcPr>
+          <w:p>
+            <w:pPr>
+              <w:spacing w:before="0" w:after="60"/>
+              <w:keepNext/>
+              <w:jc w:val="center"/>
+            </w:pPr>
+            <w:r>
+              <w:rPr>
+                <w:rFonts w:ascii="Calibri" w:hAnsi="Calibri"/>
+                <w:sz w:val="20"/>
+              </w:rPr>
+              <w:t xml:space="default">86,010 (1.8%)</w:t>
+            </w:r>
+          </w:p>
+        </w:tc>
+        <w:tc>
+          <w:tcPr>
+            <w:tcBorders>
+              <w:top w:val="single" w:space="0" w:color="D3D3D3"/>
+              <w:bottom w:val="single" w:space="0" w:color="D3D3D3"/>
+              <w:start w:val="single" w:space="0" w:color="D3D3D3"/>
+              <w:end w:val="single" w:space="0" w:color="D3D3D3"/>
+            </w:tcBorders>
+          </w:tcPr>
+          <w:p>
+            <w:pPr>
+              <w:spacing w:before="0" w:after="60"/>
+              <w:keepNext/>
+              <w:jc w:val="center"/>
+            </w:pPr>
+            <w:r>
+              <w:rPr>
+                <w:rFonts w:ascii="Calibri" w:hAnsi="Calibri"/>
+                <w:sz w:val="20"/>
+              </w:rPr>
+              <w:t xml:space="default">89,779 (1.8%)</w:t>
             </w:r>
           </w:p>
         </w:tc>
@@ -3041,107 +3041,6 @@
               <w:rPr>
                 <w:rFonts w:ascii="Calibri" w:hAnsi="Calibri"/>
                 <w:sz w:val="20"/>
-              </w:rPr>
-              <w:t xml:space="default">    Medicare, dual-eligible</w:t>
-            </w:r>
-          </w:p>
-        </w:tc>
-        <w:tc>
-          <w:tcPr>
-            <w:tcBorders>
-              <w:top w:val="single" w:space="0" w:color="D3D3D3"/>
-              <w:bottom w:val="single" w:space="0" w:color="D3D3D3"/>
-              <w:start w:val="single" w:space="0" w:color="D3D3D3"/>
-              <w:end w:val="single" w:space="0" w:color="D3D3D3"/>
-            </w:tcBorders>
-          </w:tcPr>
-          <w:p>
-            <w:pPr>
-              <w:spacing w:before="0" w:after="60"/>
-              <w:keepNext/>
-              <w:jc w:val="center"/>
-            </w:pPr>
-            <w:r>
-              <w:rPr>
-                <w:rFonts w:ascii="Calibri" w:hAnsi="Calibri"/>
-                <w:sz w:val="20"/>
-              </w:rPr>
-              <w:t xml:space="default">0 (0%)</w:t>
-            </w:r>
-          </w:p>
-        </w:tc>
-        <w:tc>
-          <w:tcPr>
-            <w:tcBorders>
-              <w:top w:val="single" w:space="0" w:color="D3D3D3"/>
-              <w:bottom w:val="single" w:space="0" w:color="D3D3D3"/>
-              <w:start w:val="single" w:space="0" w:color="D3D3D3"/>
-              <w:end w:val="single" w:space="0" w:color="D3D3D3"/>
-            </w:tcBorders>
-          </w:tcPr>
-          <w:p>
-            <w:pPr>
-              <w:spacing w:before="0" w:after="60"/>
-              <w:keepNext/>
-              <w:jc w:val="center"/>
-            </w:pPr>
-            <w:r>
-              <w:rPr>
-                <w:rFonts w:ascii="Calibri" w:hAnsi="Calibri"/>
-                <w:sz w:val="20"/>
-              </w:rPr>
-              <w:t xml:space="default">12,313 (0.2%)</w:t>
-            </w:r>
-          </w:p>
-        </w:tc>
-        <w:tc>
-          <w:tcPr>
-            <w:tcBorders>
-              <w:top w:val="single" w:space="0" w:color="D3D3D3"/>
-              <w:bottom w:val="single" w:space="0" w:color="D3D3D3"/>
-              <w:start w:val="single" w:space="0" w:color="D3D3D3"/>
-              <w:end w:val="single" w:space="0" w:color="D3D3D3"/>
-            </w:tcBorders>
-          </w:tcPr>
-          <w:p>
-            <w:pPr>
-              <w:spacing w:before="0" w:after="60"/>
-              <w:keepNext/>
-              <w:jc w:val="center"/>
-            </w:pPr>
-            <w:r>
-              <w:rPr>
-                <w:rFonts w:ascii="Calibri" w:hAnsi="Calibri"/>
-                <w:sz w:val="20"/>
-              </w:rPr>
-              <w:t xml:space="default"/>
-            </w:r>
-          </w:p>
-        </w:tc>
-      </w:tr>
-      <w:tr>
-        <w:trPr>
-          <w:cantSplit/>
-        </w:trPr>
-        <w:tc>
-          <w:tcPr>
-            <w:tcBorders>
-              <w:top w:val="single" w:space="0" w:color="D3D3D3"/>
-              <w:bottom w:val="single" w:space="0" w:color="D3D3D3"/>
-              <w:start w:val="single" w:space="0" w:color="D3D3D3"/>
-              <w:end w:val="single" w:space="0" w:color="D3D3D3"/>
-            </w:tcBorders>
-          </w:tcPr>
-          <w:p>
-            <w:pPr>
-              <w:spacing w:before="0" w:after="60"/>
-              <w:keepNext/>
-              <w:jc w:val="start"/>
-            </w:pPr>
-            <w:r>
-              <w:rPr>
-                <w:rFonts w:ascii="Calibri" w:hAnsi="Calibri"/>
-                <w:sz w:val="20"/>
                 <w:b w:val="true"/>
               </w:rPr>
               <w:t xml:space="default">Household (18+ years) income (2021 USD)</w:t>
@@ -3217,107 +3116,6 @@
                 <w:sz w:val="20"/>
               </w:rPr>
               <w:t xml:space="default">0.14</w:t>
-            </w:r>
-          </w:p>
-        </w:tc>
-      </w:tr>
-      <w:tr>
-        <w:trPr>
-          <w:cantSplit/>
-        </w:trPr>
-        <w:tc>
-          <w:tcPr>
-            <w:tcBorders>
-              <w:top w:val="single" w:space="0" w:color="D3D3D3"/>
-              <w:bottom w:val="single" w:space="0" w:color="D3D3D3"/>
-              <w:start w:val="single" w:space="0" w:color="D3D3D3"/>
-              <w:end w:val="single" w:space="0" w:color="D3D3D3"/>
-            </w:tcBorders>
-          </w:tcPr>
-          <w:p>
-            <w:pPr>
-              <w:spacing w:before="0" w:after="60"/>
-              <w:keepNext/>
-              <w:jc w:val="start"/>
-            </w:pPr>
-            <w:r>
-              <w:rPr>
-                <w:rFonts w:ascii="Calibri" w:hAnsi="Calibri"/>
-                <w:sz w:val="20"/>
-              </w:rPr>
-              <w:t xml:space="default">    Unknown</w:t>
-            </w:r>
-          </w:p>
-        </w:tc>
-        <w:tc>
-          <w:tcPr>
-            <w:tcBorders>
-              <w:top w:val="single" w:space="0" w:color="D3D3D3"/>
-              <w:bottom w:val="single" w:space="0" w:color="D3D3D3"/>
-              <w:start w:val="single" w:space="0" w:color="D3D3D3"/>
-              <w:end w:val="single" w:space="0" w:color="D3D3D3"/>
-            </w:tcBorders>
-          </w:tcPr>
-          <w:p>
-            <w:pPr>
-              <w:spacing w:before="0" w:after="60"/>
-              <w:keepNext/>
-              <w:jc w:val="center"/>
-            </w:pPr>
-            <w:r>
-              <w:rPr>
-                <w:rFonts w:ascii="Calibri" w:hAnsi="Calibri"/>
-                <w:sz w:val="20"/>
-              </w:rPr>
-              <w:t xml:space="default">2,145,531</w:t>
-            </w:r>
-          </w:p>
-        </w:tc>
-        <w:tc>
-          <w:tcPr>
-            <w:tcBorders>
-              <w:top w:val="single" w:space="0" w:color="D3D3D3"/>
-              <w:bottom w:val="single" w:space="0" w:color="D3D3D3"/>
-              <w:start w:val="single" w:space="0" w:color="D3D3D3"/>
-              <w:end w:val="single" w:space="0" w:color="D3D3D3"/>
-            </w:tcBorders>
-          </w:tcPr>
-          <w:p>
-            <w:pPr>
-              <w:spacing w:before="0" w:after="60"/>
-              <w:keepNext/>
-              <w:jc w:val="center"/>
-            </w:pPr>
-            <w:r>
-              <w:rPr>
-                <w:rFonts w:ascii="Calibri" w:hAnsi="Calibri"/>
-                <w:sz w:val="20"/>
-              </w:rPr>
-              <w:t xml:space="default">2,028,904</w:t>
-            </w:r>
-          </w:p>
-        </w:tc>
-        <w:tc>
-          <w:tcPr>
-            <w:tcBorders>
-              <w:top w:val="single" w:space="0" w:color="D3D3D3"/>
-              <w:bottom w:val="single" w:space="0" w:color="D3D3D3"/>
-              <w:start w:val="single" w:space="0" w:color="D3D3D3"/>
-              <w:end w:val="single" w:space="0" w:color="D3D3D3"/>
-            </w:tcBorders>
-          </w:tcPr>
-          <w:p>
-            <w:pPr>
-              <w:spacing w:before="0" w:after="60"/>
-              <w:keepNext/>
-              <w:jc w:val="center"/>
-            </w:pPr>
-            <w:r>
-              <w:rPr>
-                <w:rFonts w:ascii="Calibri" w:hAnsi="Calibri"/>
-                <w:sz w:val="20"/>
-              </w:rPr>
-              <w:t xml:space="default"/>
             </w:r>
           </w:p>
         </w:tc>

</xml_diff>

<commit_message>
created linkage code file
</commit_message>
<xml_diff>
--- a/exports/table1.docx
+++ b/exports/table1.docx
@@ -136,7 +136,7 @@
                 <w:rFonts w:ascii="Calibri" w:hAnsi="Calibri"/>
                 <w:sz w:val="20"/>
               </w:rPr>
-              <w:t xml:space="preserve">N = 4,838,034</w:t>
+              <w:t xml:space="preserve">N = 4,875,673</w:t>
             </w:r>
             <w:r>
               <w:rPr>
@@ -256,7 +256,7 @@
                 <w:rFonts w:ascii="Calibri" w:hAnsi="Calibri"/>
                 <w:sz w:val="20"/>
               </w:rPr>
-              <w:t xml:space="default">25 (14)</w:t>
+              <w:t xml:space="default">25 (15)</w:t>
             </w:r>
           </w:p>
         </w:tc>
@@ -382,7 +382,7 @@
                 <w:rFonts w:ascii="Calibri" w:hAnsi="Calibri"/>
                 <w:sz w:val="20"/>
               </w:rPr>
-              <w:t xml:space="default">0.5</w:t>
+              <w:t xml:space="default">0.7</w:t>
             </w:r>
           </w:p>
         </w:tc>
@@ -459,7 +459,7 @@
                 <w:rFonts w:ascii="Calibri" w:hAnsi="Calibri"/>
                 <w:sz w:val="20"/>
               </w:rPr>
-              <w:t xml:space="default">2,098,216 (43%)</w:t>
+              <w:t xml:space="default">2,135,856 (44%)</w:t>
             </w:r>
           </w:p>
         </w:tc>
@@ -560,7 +560,7 @@
                 <w:rFonts w:ascii="Calibri" w:hAnsi="Calibri"/>
                 <w:sz w:val="20"/>
               </w:rPr>
-              <w:t xml:space="default">2,739,817 (57%)</w:t>
+              <w:t xml:space="default">2,739,817 (56%)</w:t>
             </w:r>
           </w:p>
         </w:tc>
@@ -763,7 +763,7 @@
                 <w:rFonts w:ascii="Calibri" w:hAnsi="Calibri"/>
                 <w:sz w:val="20"/>
               </w:rPr>
-              <w:t xml:space="default">3,359,111 (81%)</w:t>
+              <w:t xml:space="default">3,390,658 (81%)</w:t>
             </w:r>
           </w:p>
         </w:tc>
@@ -864,7 +864,7 @@
                 <w:rFonts w:ascii="Calibri" w:hAnsi="Calibri"/>
                 <w:sz w:val="20"/>
               </w:rPr>
-              <w:t xml:space="default">436,114 (11%)</w:t>
+              <w:t xml:space="default">436,114 (10%)</w:t>
             </w:r>
           </w:p>
         </w:tc>
@@ -1066,7 +1066,7 @@
                 <w:rFonts w:ascii="Calibri" w:hAnsi="Calibri"/>
                 <w:sz w:val="20"/>
               </w:rPr>
-              <w:t xml:space="default">287,276 (7.0%)</w:t>
+              <w:t xml:space="default">293,369 (7.0%)</w:t>
             </w:r>
           </w:p>
         </w:tc>
@@ -1192,7 +1192,7 @@
                 <w:rFonts w:ascii="Calibri" w:hAnsi="Calibri"/>
                 <w:sz w:val="20"/>
               </w:rPr>
-              <w:t xml:space="default">0.2</w:t>
+              <w:t xml:space="default">0.13</w:t>
             </w:r>
           </w:p>
         </w:tc>
@@ -1370,7 +1370,7 @@
                 <w:rFonts w:ascii="Calibri" w:hAnsi="Calibri"/>
                 <w:sz w:val="20"/>
               </w:rPr>
-              <w:t xml:space="default">4,126,912 (85%)</w:t>
+              <w:t xml:space="default">4,164,552 (85%)</w:t>
             </w:r>
           </w:p>
         </w:tc>
@@ -1573,7 +1573,7 @@
                 <w:rFonts w:ascii="Calibri" w:hAnsi="Calibri"/>
                 <w:sz w:val="20"/>
               </w:rPr>
-              <w:t xml:space="default">1,830,565 (72%)</w:t>
+              <w:t xml:space="default">1,863,884 (72%)</w:t>
             </w:r>
           </w:p>
         </w:tc>
@@ -1674,7 +1674,7 @@
                 <w:rFonts w:ascii="Calibri" w:hAnsi="Calibri"/>
                 <w:sz w:val="20"/>
               </w:rPr>
-              <w:t xml:space="default">711,192 (28%)</w:t>
+              <w:t xml:space="default">715,513 (28%)</w:t>
             </w:r>
           </w:p>
         </w:tc>
@@ -1877,7 +1877,7 @@
                 <w:rFonts w:ascii="Calibri" w:hAnsi="Calibri"/>
                 <w:sz w:val="20"/>
               </w:rPr>
-              <w:t xml:space="default">4,691,039 (97%)</w:t>
+              <w:t xml:space="default">4,728,678 (97%)</w:t>
             </w:r>
           </w:p>
         </w:tc>
@@ -2104,7 +2104,7 @@
                 <w:rFonts w:ascii="Calibri" w:hAnsi="Calibri"/>
                 <w:sz w:val="20"/>
               </w:rPr>
-              <w:t xml:space="default"/>
+              <w:t xml:space="default">0.9</w:t>
             </w:r>
           </w:p>
         </w:tc>
@@ -2133,55 +2133,55 @@
                 <w:rFonts w:ascii="Calibri" w:hAnsi="Calibri"/>
                 <w:sz w:val="20"/>
               </w:rPr>
-              <w:t xml:space="default">    Private only</w:t>
-            </w:r>
-          </w:p>
-        </w:tc>
-        <w:tc>
-          <w:tcPr>
-            <w:tcBorders>
-              <w:top w:val="single" w:space="0" w:color="D3D3D3"/>
-              <w:bottom w:val="single" w:space="0" w:color="D3D3D3"/>
-              <w:start w:val="single" w:space="0" w:color="D3D3D3"/>
-              <w:end w:val="single" w:space="0" w:color="D3D3D3"/>
-            </w:tcBorders>
-          </w:tcPr>
-          <w:p>
-            <w:pPr>
-              <w:spacing w:before="0" w:after="60"/>
-              <w:keepNext/>
-              <w:jc w:val="center"/>
-            </w:pPr>
-            <w:r>
-              <w:rPr>
-                <w:rFonts w:ascii="Calibri" w:hAnsi="Calibri"/>
-                <w:sz w:val="20"/>
-              </w:rPr>
-              <w:t xml:space="default">2,506,164 (55%)</w:t>
-            </w:r>
-          </w:p>
-        </w:tc>
-        <w:tc>
-          <w:tcPr>
-            <w:tcBorders>
-              <w:top w:val="single" w:space="0" w:color="D3D3D3"/>
-              <w:bottom w:val="single" w:space="0" w:color="D3D3D3"/>
-              <w:start w:val="single" w:space="0" w:color="D3D3D3"/>
-              <w:end w:val="single" w:space="0" w:color="D3D3D3"/>
-            </w:tcBorders>
-          </w:tcPr>
-          <w:p>
-            <w:pPr>
-              <w:spacing w:before="0" w:after="60"/>
-              <w:keepNext/>
-              <w:jc w:val="center"/>
-            </w:pPr>
-            <w:r>
-              <w:rPr>
-                <w:rFonts w:ascii="Calibri" w:hAnsi="Calibri"/>
-                <w:sz w:val="20"/>
-              </w:rPr>
-              <w:t xml:space="default">2,811,946 (58%)</w:t>
+              <w:t xml:space="default">    Medicaid only</w:t>
+            </w:r>
+          </w:p>
+        </w:tc>
+        <w:tc>
+          <w:tcPr>
+            <w:tcBorders>
+              <w:top w:val="single" w:space="0" w:color="D3D3D3"/>
+              <w:bottom w:val="single" w:space="0" w:color="D3D3D3"/>
+              <w:start w:val="single" w:space="0" w:color="D3D3D3"/>
+              <w:end w:val="single" w:space="0" w:color="D3D3D3"/>
+            </w:tcBorders>
+          </w:tcPr>
+          <w:p>
+            <w:pPr>
+              <w:spacing w:before="0" w:after="60"/>
+              <w:keepNext/>
+              <w:jc w:val="center"/>
+            </w:pPr>
+            <w:r>
+              <w:rPr>
+                <w:rFonts w:ascii="Calibri" w:hAnsi="Calibri"/>
+                <w:sz w:val="20"/>
+              </w:rPr>
+              <w:t xml:space="default">1,532,391 (34%)</w:t>
+            </w:r>
+          </w:p>
+        </w:tc>
+        <w:tc>
+          <w:tcPr>
+            <w:tcBorders>
+              <w:top w:val="single" w:space="0" w:color="D3D3D3"/>
+              <w:bottom w:val="single" w:space="0" w:color="D3D3D3"/>
+              <w:start w:val="single" w:space="0" w:color="D3D3D3"/>
+              <w:end w:val="single" w:space="0" w:color="D3D3D3"/>
+            </w:tcBorders>
+          </w:tcPr>
+          <w:p>
+            <w:pPr>
+              <w:spacing w:before="0" w:after="60"/>
+              <w:keepNext/>
+              <w:jc w:val="center"/>
+            </w:pPr>
+            <w:r>
+              <w:rPr>
+                <w:rFonts w:ascii="Calibri" w:hAnsi="Calibri"/>
+                <w:sz w:val="20"/>
+              </w:rPr>
+              <w:t xml:space="default">1,542,853 (32%)</w:t>
             </w:r>
           </w:p>
         </w:tc>
@@ -2234,55 +2234,55 @@
                 <w:rFonts w:ascii="Calibri" w:hAnsi="Calibri"/>
                 <w:sz w:val="20"/>
               </w:rPr>
-              <w:t xml:space="default">    Medicaid only</w:t>
-            </w:r>
-          </w:p>
-        </w:tc>
-        <w:tc>
-          <w:tcPr>
-            <w:tcBorders>
-              <w:top w:val="single" w:space="0" w:color="D3D3D3"/>
-              <w:bottom w:val="single" w:space="0" w:color="D3D3D3"/>
-              <w:start w:val="single" w:space="0" w:color="D3D3D3"/>
-              <w:end w:val="single" w:space="0" w:color="D3D3D3"/>
-            </w:tcBorders>
-          </w:tcPr>
-          <w:p>
-            <w:pPr>
-              <w:spacing w:before="0" w:after="60"/>
-              <w:keepNext/>
-              <w:jc w:val="center"/>
-            </w:pPr>
-            <w:r>
-              <w:rPr>
-                <w:rFonts w:ascii="Calibri" w:hAnsi="Calibri"/>
-                <w:sz w:val="20"/>
-              </w:rPr>
-              <w:t xml:space="default">1,532,391 (34%)</w:t>
-            </w:r>
-          </w:p>
-        </w:tc>
-        <w:tc>
-          <w:tcPr>
-            <w:tcBorders>
-              <w:top w:val="single" w:space="0" w:color="D3D3D3"/>
-              <w:bottom w:val="single" w:space="0" w:color="D3D3D3"/>
-              <w:start w:val="single" w:space="0" w:color="D3D3D3"/>
-              <w:end w:val="single" w:space="0" w:color="D3D3D3"/>
-            </w:tcBorders>
-          </w:tcPr>
-          <w:p>
-            <w:pPr>
-              <w:spacing w:before="0" w:after="60"/>
-              <w:keepNext/>
-              <w:jc w:val="center"/>
-            </w:pPr>
-            <w:r>
-              <w:rPr>
-                <w:rFonts w:ascii="Calibri" w:hAnsi="Calibri"/>
-                <w:sz w:val="20"/>
-              </w:rPr>
-              <w:t xml:space="default">1,542,853 (32%)</w:t>
+              <w:t xml:space="default">    Medicaid, with private</w:t>
+            </w:r>
+          </w:p>
+        </w:tc>
+        <w:tc>
+          <w:tcPr>
+            <w:tcBorders>
+              <w:top w:val="single" w:space="0" w:color="D3D3D3"/>
+              <w:bottom w:val="single" w:space="0" w:color="D3D3D3"/>
+              <w:start w:val="single" w:space="0" w:color="D3D3D3"/>
+              <w:end w:val="single" w:space="0" w:color="D3D3D3"/>
+            </w:tcBorders>
+          </w:tcPr>
+          <w:p>
+            <w:pPr>
+              <w:spacing w:before="0" w:after="60"/>
+              <w:keepNext/>
+              <w:jc w:val="center"/>
+            </w:pPr>
+            <w:r>
+              <w:rPr>
+                <w:rFonts w:ascii="Calibri" w:hAnsi="Calibri"/>
+                <w:sz w:val="20"/>
+              </w:rPr>
+              <w:t xml:space="default">254,956 (5.6%)</w:t>
+            </w:r>
+          </w:p>
+        </w:tc>
+        <w:tc>
+          <w:tcPr>
+            <w:tcBorders>
+              <w:top w:val="single" w:space="0" w:color="D3D3D3"/>
+              <w:bottom w:val="single" w:space="0" w:color="D3D3D3"/>
+              <w:start w:val="single" w:space="0" w:color="D3D3D3"/>
+              <w:end w:val="single" w:space="0" w:color="D3D3D3"/>
+            </w:tcBorders>
+          </w:tcPr>
+          <w:p>
+            <w:pPr>
+              <w:spacing w:before="0" w:after="60"/>
+              <w:keepNext/>
+              <w:jc w:val="center"/>
+            </w:pPr>
+            <w:r>
+              <w:rPr>
+                <w:rFonts w:ascii="Calibri" w:hAnsi="Calibri"/>
+                <w:sz w:val="20"/>
+              </w:rPr>
+              <w:t xml:space="default">246,461 (5.1%)</w:t>
             </w:r>
           </w:p>
         </w:tc>
@@ -2335,55 +2335,55 @@
                 <w:rFonts w:ascii="Calibri" w:hAnsi="Calibri"/>
                 <w:sz w:val="20"/>
               </w:rPr>
-              <w:t xml:space="default">    Medicaid, with private</w:t>
-            </w:r>
-          </w:p>
-        </w:tc>
-        <w:tc>
-          <w:tcPr>
-            <w:tcBorders>
-              <w:top w:val="single" w:space="0" w:color="D3D3D3"/>
-              <w:bottom w:val="single" w:space="0" w:color="D3D3D3"/>
-              <w:start w:val="single" w:space="0" w:color="D3D3D3"/>
-              <w:end w:val="single" w:space="0" w:color="D3D3D3"/>
-            </w:tcBorders>
-          </w:tcPr>
-          <w:p>
-            <w:pPr>
-              <w:spacing w:before="0" w:after="60"/>
-              <w:keepNext/>
-              <w:jc w:val="center"/>
-            </w:pPr>
-            <w:r>
-              <w:rPr>
-                <w:rFonts w:ascii="Calibri" w:hAnsi="Calibri"/>
-                <w:sz w:val="20"/>
-              </w:rPr>
-              <w:t xml:space="default">254,956 (5.6%)</w:t>
-            </w:r>
-          </w:p>
-        </w:tc>
-        <w:tc>
-          <w:tcPr>
-            <w:tcBorders>
-              <w:top w:val="single" w:space="0" w:color="D3D3D3"/>
-              <w:bottom w:val="single" w:space="0" w:color="D3D3D3"/>
-              <w:start w:val="single" w:space="0" w:color="D3D3D3"/>
-              <w:end w:val="single" w:space="0" w:color="D3D3D3"/>
-            </w:tcBorders>
-          </w:tcPr>
-          <w:p>
-            <w:pPr>
-              <w:spacing w:before="0" w:after="60"/>
-              <w:keepNext/>
-              <w:jc w:val="center"/>
-            </w:pPr>
-            <w:r>
-              <w:rPr>
-                <w:rFonts w:ascii="Calibri" w:hAnsi="Calibri"/>
-                <w:sz w:val="20"/>
-              </w:rPr>
-              <w:t xml:space="default">246,461 (5.1%)</w:t>
+              <w:t xml:space="default">    Other public</w:t>
+            </w:r>
+          </w:p>
+        </w:tc>
+        <w:tc>
+          <w:tcPr>
+            <w:tcBorders>
+              <w:top w:val="single" w:space="0" w:color="D3D3D3"/>
+              <w:bottom w:val="single" w:space="0" w:color="D3D3D3"/>
+              <w:start w:val="single" w:space="0" w:color="D3D3D3"/>
+              <w:end w:val="single" w:space="0" w:color="D3D3D3"/>
+            </w:tcBorders>
+          </w:tcPr>
+          <w:p>
+            <w:pPr>
+              <w:spacing w:before="0" w:after="60"/>
+              <w:keepNext/>
+              <w:jc w:val="center"/>
+            </w:pPr>
+            <w:r>
+              <w:rPr>
+                <w:rFonts w:ascii="Calibri" w:hAnsi="Calibri"/>
+                <w:sz w:val="20"/>
+              </w:rPr>
+              <w:t xml:space="default">68,588 (1.5%)</w:t>
+            </w:r>
+          </w:p>
+        </w:tc>
+        <w:tc>
+          <w:tcPr>
+            <w:tcBorders>
+              <w:top w:val="single" w:space="0" w:color="D3D3D3"/>
+              <w:bottom w:val="single" w:space="0" w:color="D3D3D3"/>
+              <w:start w:val="single" w:space="0" w:color="D3D3D3"/>
+              <w:end w:val="single" w:space="0" w:color="D3D3D3"/>
+            </w:tcBorders>
+          </w:tcPr>
+          <w:p>
+            <w:pPr>
+              <w:spacing w:before="0" w:after="60"/>
+              <w:keepNext/>
+              <w:jc w:val="center"/>
+            </w:pPr>
+            <w:r>
+              <w:rPr>
+                <w:rFonts w:ascii="Calibri" w:hAnsi="Calibri"/>
+                <w:sz w:val="20"/>
+              </w:rPr>
+              <w:t xml:space="default">89,779 (1.9%)</w:t>
             </w:r>
           </w:p>
         </w:tc>
@@ -2436,55 +2436,55 @@
                 <w:rFonts w:ascii="Calibri" w:hAnsi="Calibri"/>
                 <w:sz w:val="20"/>
               </w:rPr>
-              <w:t xml:space="default">    Medicare only</w:t>
-            </w:r>
-          </w:p>
-        </w:tc>
-        <w:tc>
-          <w:tcPr>
-            <w:tcBorders>
-              <w:top w:val="single" w:space="0" w:color="D3D3D3"/>
-              <w:bottom w:val="single" w:space="0" w:color="D3D3D3"/>
-              <w:start w:val="single" w:space="0" w:color="D3D3D3"/>
-              <w:end w:val="single" w:space="0" w:color="D3D3D3"/>
-            </w:tcBorders>
-          </w:tcPr>
-          <w:p>
-            <w:pPr>
-              <w:spacing w:before="0" w:after="60"/>
-              <w:keepNext/>
-              <w:jc w:val="center"/>
-            </w:pPr>
-            <w:r>
-              <w:rPr>
-                <w:rFonts w:ascii="Calibri" w:hAnsi="Calibri"/>
-                <w:sz w:val="20"/>
-              </w:rPr>
-              <w:t xml:space="default">0 (0%)</w:t>
-            </w:r>
-          </w:p>
-        </w:tc>
-        <w:tc>
-          <w:tcPr>
-            <w:tcBorders>
-              <w:top w:val="single" w:space="0" w:color="D3D3D3"/>
-              <w:bottom w:val="single" w:space="0" w:color="D3D3D3"/>
-              <w:start w:val="single" w:space="0" w:color="D3D3D3"/>
-              <w:end w:val="single" w:space="0" w:color="D3D3D3"/>
-            </w:tcBorders>
-          </w:tcPr>
-          <w:p>
-            <w:pPr>
-              <w:spacing w:before="0" w:after="60"/>
-              <w:keepNext/>
-              <w:jc w:val="center"/>
-            </w:pPr>
-            <w:r>
-              <w:rPr>
-                <w:rFonts w:ascii="Calibri" w:hAnsi="Calibri"/>
-                <w:sz w:val="20"/>
-              </w:rPr>
-              <w:t xml:space="default">0 (0%)</w:t>
+              <w:t xml:space="default">    Private only</w:t>
+            </w:r>
+          </w:p>
+        </w:tc>
+        <w:tc>
+          <w:tcPr>
+            <w:tcBorders>
+              <w:top w:val="single" w:space="0" w:color="D3D3D3"/>
+              <w:bottom w:val="single" w:space="0" w:color="D3D3D3"/>
+              <w:start w:val="single" w:space="0" w:color="D3D3D3"/>
+              <w:end w:val="single" w:space="0" w:color="D3D3D3"/>
+            </w:tcBorders>
+          </w:tcPr>
+          <w:p>
+            <w:pPr>
+              <w:spacing w:before="0" w:after="60"/>
+              <w:keepNext/>
+              <w:jc w:val="center"/>
+            </w:pPr>
+            <w:r>
+              <w:rPr>
+                <w:rFonts w:ascii="Calibri" w:hAnsi="Calibri"/>
+                <w:sz w:val="20"/>
+              </w:rPr>
+              <w:t xml:space="default">2,506,164 (55%)</w:t>
+            </w:r>
+          </w:p>
+        </w:tc>
+        <w:tc>
+          <w:tcPr>
+            <w:tcBorders>
+              <w:top w:val="single" w:space="0" w:color="D3D3D3"/>
+              <w:bottom w:val="single" w:space="0" w:color="D3D3D3"/>
+              <w:start w:val="single" w:space="0" w:color="D3D3D3"/>
+              <w:end w:val="single" w:space="0" w:color="D3D3D3"/>
+            </w:tcBorders>
+          </w:tcPr>
+          <w:p>
+            <w:pPr>
+              <w:spacing w:before="0" w:after="60"/>
+              <w:keepNext/>
+              <w:jc w:val="center"/>
+            </w:pPr>
+            <w:r>
+              <w:rPr>
+                <w:rFonts w:ascii="Calibri" w:hAnsi="Calibri"/>
+                <w:sz w:val="20"/>
+              </w:rPr>
+              <w:t xml:space="default">2,811,946 (58%)</w:t>
             </w:r>
           </w:p>
         </w:tc>
@@ -2537,55 +2537,55 @@
                 <w:rFonts w:ascii="Calibri" w:hAnsi="Calibri"/>
                 <w:sz w:val="20"/>
               </w:rPr>
-              <w:t xml:space="default">    Medicare, with private</w:t>
-            </w:r>
-          </w:p>
-        </w:tc>
-        <w:tc>
-          <w:tcPr>
-            <w:tcBorders>
-              <w:top w:val="single" w:space="0" w:color="D3D3D3"/>
-              <w:bottom w:val="single" w:space="0" w:color="D3D3D3"/>
-              <w:start w:val="single" w:space="0" w:color="D3D3D3"/>
-              <w:end w:val="single" w:space="0" w:color="D3D3D3"/>
-            </w:tcBorders>
-          </w:tcPr>
-          <w:p>
-            <w:pPr>
-              <w:spacing w:before="0" w:after="60"/>
-              <w:keepNext/>
-              <w:jc w:val="center"/>
-            </w:pPr>
-            <w:r>
-              <w:rPr>
-                <w:rFonts w:ascii="Calibri" w:hAnsi="Calibri"/>
-                <w:sz w:val="20"/>
-              </w:rPr>
-              <w:t xml:space="default">0 (0%)</w:t>
-            </w:r>
-          </w:p>
-        </w:tc>
-        <w:tc>
-          <w:tcPr>
-            <w:tcBorders>
-              <w:top w:val="single" w:space="0" w:color="D3D3D3"/>
-              <w:bottom w:val="single" w:space="0" w:color="D3D3D3"/>
-              <w:start w:val="single" w:space="0" w:color="D3D3D3"/>
-              <w:end w:val="single" w:space="0" w:color="D3D3D3"/>
-            </w:tcBorders>
-          </w:tcPr>
-          <w:p>
-            <w:pPr>
-              <w:spacing w:before="0" w:after="60"/>
-              <w:keepNext/>
-              <w:jc w:val="center"/>
-            </w:pPr>
-            <w:r>
-              <w:rPr>
-                <w:rFonts w:ascii="Calibri" w:hAnsi="Calibri"/>
-                <w:sz w:val="20"/>
-              </w:rPr>
-              <w:t xml:space="default">0 (0%)</w:t>
+              <w:t xml:space="default">    Uninsured</w:t>
+            </w:r>
+          </w:p>
+        </w:tc>
+        <w:tc>
+          <w:tcPr>
+            <w:tcBorders>
+              <w:top w:val="single" w:space="0" w:color="D3D3D3"/>
+              <w:bottom w:val="single" w:space="0" w:color="D3D3D3"/>
+              <w:start w:val="single" w:space="0" w:color="D3D3D3"/>
+              <w:end w:val="single" w:space="0" w:color="D3D3D3"/>
+            </w:tcBorders>
+          </w:tcPr>
+          <w:p>
+            <w:pPr>
+              <w:spacing w:before="0" w:after="60"/>
+              <w:keepNext/>
+              <w:jc w:val="center"/>
+            </w:pPr>
+            <w:r>
+              <w:rPr>
+                <w:rFonts w:ascii="Calibri" w:hAnsi="Calibri"/>
+                <w:sz w:val="20"/>
+              </w:rPr>
+              <w:t xml:space="default">160,802 (3.6%)</w:t>
+            </w:r>
+          </w:p>
+        </w:tc>
+        <w:tc>
+          <w:tcPr>
+            <w:tcBorders>
+              <w:top w:val="single" w:space="0" w:color="D3D3D3"/>
+              <w:bottom w:val="single" w:space="0" w:color="D3D3D3"/>
+              <w:start w:val="single" w:space="0" w:color="D3D3D3"/>
+              <w:end w:val="single" w:space="0" w:color="D3D3D3"/>
+            </w:tcBorders>
+          </w:tcPr>
+          <w:p>
+            <w:pPr>
+              <w:spacing w:before="0" w:after="60"/>
+              <w:keepNext/>
+              <w:jc w:val="center"/>
+            </w:pPr>
+            <w:r>
+              <w:rPr>
+                <w:rFonts w:ascii="Calibri" w:hAnsi="Calibri"/>
+                <w:sz w:val="20"/>
+              </w:rPr>
+              <w:t xml:space="default">146,995 (3.0%)</w:t>
             </w:r>
           </w:p>
         </w:tc>
@@ -2637,80 +2637,81 @@
               <w:rPr>
                 <w:rFonts w:ascii="Calibri" w:hAnsi="Calibri"/>
                 <w:sz w:val="20"/>
-              </w:rPr>
-              <w:t xml:space="default">    Medicare, with other public</w:t>
-            </w:r>
-          </w:p>
-        </w:tc>
-        <w:tc>
-          <w:tcPr>
-            <w:tcBorders>
-              <w:top w:val="single" w:space="0" w:color="D3D3D3"/>
-              <w:bottom w:val="single" w:space="0" w:color="D3D3D3"/>
-              <w:start w:val="single" w:space="0" w:color="D3D3D3"/>
-              <w:end w:val="single" w:space="0" w:color="D3D3D3"/>
-            </w:tcBorders>
-          </w:tcPr>
-          <w:p>
-            <w:pPr>
-              <w:spacing w:before="0" w:after="60"/>
-              <w:keepNext/>
-              <w:jc w:val="center"/>
-            </w:pPr>
-            <w:r>
-              <w:rPr>
-                <w:rFonts w:ascii="Calibri" w:hAnsi="Calibri"/>
-                <w:sz w:val="20"/>
-              </w:rPr>
-              <w:t xml:space="default">0 (0%)</w:t>
-            </w:r>
-          </w:p>
-        </w:tc>
-        <w:tc>
-          <w:tcPr>
-            <w:tcBorders>
-              <w:top w:val="single" w:space="0" w:color="D3D3D3"/>
-              <w:bottom w:val="single" w:space="0" w:color="D3D3D3"/>
-              <w:start w:val="single" w:space="0" w:color="D3D3D3"/>
-              <w:end w:val="single" w:space="0" w:color="D3D3D3"/>
-            </w:tcBorders>
-          </w:tcPr>
-          <w:p>
-            <w:pPr>
-              <w:spacing w:before="0" w:after="60"/>
-              <w:keepNext/>
-              <w:jc w:val="center"/>
-            </w:pPr>
-            <w:r>
-              <w:rPr>
-                <w:rFonts w:ascii="Calibri" w:hAnsi="Calibri"/>
-                <w:sz w:val="20"/>
-              </w:rPr>
-              <w:t xml:space="default">0 (0%)</w:t>
-            </w:r>
-          </w:p>
-        </w:tc>
-        <w:tc>
-          <w:tcPr>
-            <w:tcBorders>
-              <w:top w:val="single" w:space="0" w:color="D3D3D3"/>
-              <w:bottom w:val="single" w:space="0" w:color="D3D3D3"/>
-              <w:start w:val="single" w:space="0" w:color="D3D3D3"/>
-              <w:end w:val="single" w:space="0" w:color="D3D3D3"/>
-            </w:tcBorders>
-          </w:tcPr>
-          <w:p>
-            <w:pPr>
-              <w:spacing w:before="0" w:after="60"/>
-              <w:keepNext/>
-              <w:jc w:val="center"/>
-            </w:pPr>
-            <w:r>
-              <w:rPr>
-                <w:rFonts w:ascii="Calibri" w:hAnsi="Calibri"/>
-                <w:sz w:val="20"/>
-              </w:rPr>
-              <w:t xml:space="default"/>
+                <w:b w:val="true"/>
+              </w:rPr>
+              <w:t xml:space="default">Household (18+ years) income (2021 USD)</w:t>
+            </w:r>
+          </w:p>
+        </w:tc>
+        <w:tc>
+          <w:tcPr>
+            <w:tcBorders>
+              <w:top w:val="single" w:space="0" w:color="D3D3D3"/>
+              <w:bottom w:val="single" w:space="0" w:color="D3D3D3"/>
+              <w:start w:val="single" w:space="0" w:color="D3D3D3"/>
+              <w:end w:val="single" w:space="0" w:color="D3D3D3"/>
+            </w:tcBorders>
+          </w:tcPr>
+          <w:p>
+            <w:pPr>
+              <w:spacing w:before="0" w:after="60"/>
+              <w:keepNext/>
+              <w:jc w:val="center"/>
+            </w:pPr>
+            <w:r>
+              <w:rPr>
+                <w:rFonts w:ascii="Calibri" w:hAnsi="Calibri"/>
+                <w:sz w:val="20"/>
+              </w:rPr>
+              <w:t xml:space="default">38,624 (13,768, 65,097)</w:t>
+            </w:r>
+          </w:p>
+        </w:tc>
+        <w:tc>
+          <w:tcPr>
+            <w:tcBorders>
+              <w:top w:val="single" w:space="0" w:color="D3D3D3"/>
+              <w:bottom w:val="single" w:space="0" w:color="D3D3D3"/>
+              <w:start w:val="single" w:space="0" w:color="D3D3D3"/>
+              <w:end w:val="single" w:space="0" w:color="D3D3D3"/>
+            </w:tcBorders>
+          </w:tcPr>
+          <w:p>
+            <w:pPr>
+              <w:spacing w:before="0" w:after="60"/>
+              <w:keepNext/>
+              <w:jc w:val="center"/>
+            </w:pPr>
+            <w:r>
+              <w:rPr>
+                <w:rFonts w:ascii="Calibri" w:hAnsi="Calibri"/>
+                <w:sz w:val="20"/>
+              </w:rPr>
+              <w:t xml:space="default">34,320 (11,000, 63,800)</w:t>
+            </w:r>
+          </w:p>
+        </w:tc>
+        <w:tc>
+          <w:tcPr>
+            <w:tcBorders>
+              <w:top w:val="single" w:space="0" w:color="D3D3D3"/>
+              <w:bottom w:val="single" w:space="0" w:color="D3D3D3"/>
+              <w:start w:val="single" w:space="0" w:color="D3D3D3"/>
+              <w:end w:val="single" w:space="0" w:color="D3D3D3"/>
+            </w:tcBorders>
+          </w:tcPr>
+          <w:p>
+            <w:pPr>
+              <w:spacing w:before="0" w:after="60"/>
+              <w:keepNext/>
+              <w:jc w:val="center"/>
+            </w:pPr>
+            <w:r>
+              <w:rPr>
+                <w:rFonts w:ascii="Calibri" w:hAnsi="Calibri"/>
+                <w:sz w:val="20"/>
+              </w:rPr>
+              <w:t xml:space="default">0.3</w:t>
             </w:r>
           </w:p>
         </w:tc>
@@ -2738,413 +2739,8 @@
               <w:rPr>
                 <w:rFonts w:ascii="Calibri" w:hAnsi="Calibri"/>
                 <w:sz w:val="20"/>
-              </w:rPr>
-              <w:t xml:space="default">    Medicare, dual-eligible</w:t>
-            </w:r>
-          </w:p>
-        </w:tc>
-        <w:tc>
-          <w:tcPr>
-            <w:tcBorders>
-              <w:top w:val="single" w:space="0" w:color="D3D3D3"/>
-              <w:bottom w:val="single" w:space="0" w:color="D3D3D3"/>
-              <w:start w:val="single" w:space="0" w:color="D3D3D3"/>
-              <w:end w:val="single" w:space="0" w:color="D3D3D3"/>
-            </w:tcBorders>
-          </w:tcPr>
-          <w:p>
-            <w:pPr>
-              <w:spacing w:before="0" w:after="60"/>
-              <w:keepNext/>
-              <w:jc w:val="center"/>
-            </w:pPr>
-            <w:r>
-              <w:rPr>
-                <w:rFonts w:ascii="Calibri" w:hAnsi="Calibri"/>
-                <w:sz w:val="20"/>
-              </w:rPr>
-              <w:t xml:space="default">0 (0%)</w:t>
-            </w:r>
-          </w:p>
-        </w:tc>
-        <w:tc>
-          <w:tcPr>
-            <w:tcBorders>
-              <w:top w:val="single" w:space="0" w:color="D3D3D3"/>
-              <w:bottom w:val="single" w:space="0" w:color="D3D3D3"/>
-              <w:start w:val="single" w:space="0" w:color="D3D3D3"/>
-              <w:end w:val="single" w:space="0" w:color="D3D3D3"/>
-            </w:tcBorders>
-          </w:tcPr>
-          <w:p>
-            <w:pPr>
-              <w:spacing w:before="0" w:after="60"/>
-              <w:keepNext/>
-              <w:jc w:val="center"/>
-            </w:pPr>
-            <w:r>
-              <w:rPr>
-                <w:rFonts w:ascii="Calibri" w:hAnsi="Calibri"/>
-                <w:sz w:val="20"/>
-              </w:rPr>
-              <w:t xml:space="default">0 (0%)</w:t>
-            </w:r>
-          </w:p>
-        </w:tc>
-        <w:tc>
-          <w:tcPr>
-            <w:tcBorders>
-              <w:top w:val="single" w:space="0" w:color="D3D3D3"/>
-              <w:bottom w:val="single" w:space="0" w:color="D3D3D3"/>
-              <w:start w:val="single" w:space="0" w:color="D3D3D3"/>
-              <w:end w:val="single" w:space="0" w:color="D3D3D3"/>
-            </w:tcBorders>
-          </w:tcPr>
-          <w:p>
-            <w:pPr>
-              <w:spacing w:before="0" w:after="60"/>
-              <w:keepNext/>
-              <w:jc w:val="center"/>
-            </w:pPr>
-            <w:r>
-              <w:rPr>
-                <w:rFonts w:ascii="Calibri" w:hAnsi="Calibri"/>
-                <w:sz w:val="20"/>
-              </w:rPr>
-              <w:t xml:space="default"/>
-            </w:r>
-          </w:p>
-        </w:tc>
-      </w:tr>
-      <w:tr>
-        <w:trPr>
-          <w:cantSplit/>
-        </w:trPr>
-        <w:tc>
-          <w:tcPr>
-            <w:tcBorders>
-              <w:top w:val="single" w:space="0" w:color="D3D3D3"/>
-              <w:bottom w:val="single" w:space="0" w:color="D3D3D3"/>
-              <w:start w:val="single" w:space="0" w:color="D3D3D3"/>
-              <w:end w:val="single" w:space="0" w:color="D3D3D3"/>
-            </w:tcBorders>
-          </w:tcPr>
-          <w:p>
-            <w:pPr>
-              <w:spacing w:before="0" w:after="60"/>
-              <w:keepNext/>
-              <w:jc w:val="start"/>
-            </w:pPr>
-            <w:r>
-              <w:rPr>
-                <w:rFonts w:ascii="Calibri" w:hAnsi="Calibri"/>
-                <w:sz w:val="20"/>
-              </w:rPr>
-              <w:t xml:space="default">    Other public</w:t>
-            </w:r>
-          </w:p>
-        </w:tc>
-        <w:tc>
-          <w:tcPr>
-            <w:tcBorders>
-              <w:top w:val="single" w:space="0" w:color="D3D3D3"/>
-              <w:bottom w:val="single" w:space="0" w:color="D3D3D3"/>
-              <w:start w:val="single" w:space="0" w:color="D3D3D3"/>
-              <w:end w:val="single" w:space="0" w:color="D3D3D3"/>
-            </w:tcBorders>
-          </w:tcPr>
-          <w:p>
-            <w:pPr>
-              <w:spacing w:before="0" w:after="60"/>
-              <w:keepNext/>
-              <w:jc w:val="center"/>
-            </w:pPr>
-            <w:r>
-              <w:rPr>
-                <w:rFonts w:ascii="Calibri" w:hAnsi="Calibri"/>
-                <w:sz w:val="20"/>
-              </w:rPr>
-              <w:t xml:space="default">68,588 (1.5%)</w:t>
-            </w:r>
-          </w:p>
-        </w:tc>
-        <w:tc>
-          <w:tcPr>
-            <w:tcBorders>
-              <w:top w:val="single" w:space="0" w:color="D3D3D3"/>
-              <w:bottom w:val="single" w:space="0" w:color="D3D3D3"/>
-              <w:start w:val="single" w:space="0" w:color="D3D3D3"/>
-              <w:end w:val="single" w:space="0" w:color="D3D3D3"/>
-            </w:tcBorders>
-          </w:tcPr>
-          <w:p>
-            <w:pPr>
-              <w:spacing w:before="0" w:after="60"/>
-              <w:keepNext/>
-              <w:jc w:val="center"/>
-            </w:pPr>
-            <w:r>
-              <w:rPr>
-                <w:rFonts w:ascii="Calibri" w:hAnsi="Calibri"/>
-                <w:sz w:val="20"/>
-              </w:rPr>
-              <w:t xml:space="default">89,779 (1.9%)</w:t>
-            </w:r>
-          </w:p>
-        </w:tc>
-        <w:tc>
-          <w:tcPr>
-            <w:tcBorders>
-              <w:top w:val="single" w:space="0" w:color="D3D3D3"/>
-              <w:bottom w:val="single" w:space="0" w:color="D3D3D3"/>
-              <w:start w:val="single" w:space="0" w:color="D3D3D3"/>
-              <w:end w:val="single" w:space="0" w:color="D3D3D3"/>
-            </w:tcBorders>
-          </w:tcPr>
-          <w:p>
-            <w:pPr>
-              <w:spacing w:before="0" w:after="60"/>
-              <w:keepNext/>
-              <w:jc w:val="center"/>
-            </w:pPr>
-            <w:r>
-              <w:rPr>
-                <w:rFonts w:ascii="Calibri" w:hAnsi="Calibri"/>
-                <w:sz w:val="20"/>
-              </w:rPr>
-              <w:t xml:space="default"/>
-            </w:r>
-          </w:p>
-        </w:tc>
-      </w:tr>
-      <w:tr>
-        <w:trPr>
-          <w:cantSplit/>
-        </w:trPr>
-        <w:tc>
-          <w:tcPr>
-            <w:tcBorders>
-              <w:top w:val="single" w:space="0" w:color="D3D3D3"/>
-              <w:bottom w:val="single" w:space="0" w:color="D3D3D3"/>
-              <w:start w:val="single" w:space="0" w:color="D3D3D3"/>
-              <w:end w:val="single" w:space="0" w:color="D3D3D3"/>
-            </w:tcBorders>
-          </w:tcPr>
-          <w:p>
-            <w:pPr>
-              <w:spacing w:before="0" w:after="60"/>
-              <w:keepNext/>
-              <w:jc w:val="start"/>
-            </w:pPr>
-            <w:r>
-              <w:rPr>
-                <w:rFonts w:ascii="Calibri" w:hAnsi="Calibri"/>
-                <w:sz w:val="20"/>
-              </w:rPr>
-              <w:t xml:space="default">    Uninsured</w:t>
-            </w:r>
-          </w:p>
-        </w:tc>
-        <w:tc>
-          <w:tcPr>
-            <w:tcBorders>
-              <w:top w:val="single" w:space="0" w:color="D3D3D3"/>
-              <w:bottom w:val="single" w:space="0" w:color="D3D3D3"/>
-              <w:start w:val="single" w:space="0" w:color="D3D3D3"/>
-              <w:end w:val="single" w:space="0" w:color="D3D3D3"/>
-            </w:tcBorders>
-          </w:tcPr>
-          <w:p>
-            <w:pPr>
-              <w:spacing w:before="0" w:after="60"/>
-              <w:keepNext/>
-              <w:jc w:val="center"/>
-            </w:pPr>
-            <w:r>
-              <w:rPr>
-                <w:rFonts w:ascii="Calibri" w:hAnsi="Calibri"/>
-                <w:sz w:val="20"/>
-              </w:rPr>
-              <w:t xml:space="default">160,802 (3.6%)</w:t>
-            </w:r>
-          </w:p>
-        </w:tc>
-        <w:tc>
-          <w:tcPr>
-            <w:tcBorders>
-              <w:top w:val="single" w:space="0" w:color="D3D3D3"/>
-              <w:bottom w:val="single" w:space="0" w:color="D3D3D3"/>
-              <w:start w:val="single" w:space="0" w:color="D3D3D3"/>
-              <w:end w:val="single" w:space="0" w:color="D3D3D3"/>
-            </w:tcBorders>
-          </w:tcPr>
-          <w:p>
-            <w:pPr>
-              <w:spacing w:before="0" w:after="60"/>
-              <w:keepNext/>
-              <w:jc w:val="center"/>
-            </w:pPr>
-            <w:r>
-              <w:rPr>
-                <w:rFonts w:ascii="Calibri" w:hAnsi="Calibri"/>
-                <w:sz w:val="20"/>
-              </w:rPr>
-              <w:t xml:space="default">146,995 (3.0%)</w:t>
-            </w:r>
-          </w:p>
-        </w:tc>
-        <w:tc>
-          <w:tcPr>
-            <w:tcBorders>
-              <w:top w:val="single" w:space="0" w:color="D3D3D3"/>
-              <w:bottom w:val="single" w:space="0" w:color="D3D3D3"/>
-              <w:start w:val="single" w:space="0" w:color="D3D3D3"/>
-              <w:end w:val="single" w:space="0" w:color="D3D3D3"/>
-            </w:tcBorders>
-          </w:tcPr>
-          <w:p>
-            <w:pPr>
-              <w:spacing w:before="0" w:after="60"/>
-              <w:keepNext/>
-              <w:jc w:val="center"/>
-            </w:pPr>
-            <w:r>
-              <w:rPr>
-                <w:rFonts w:ascii="Calibri" w:hAnsi="Calibri"/>
-                <w:sz w:val="20"/>
-              </w:rPr>
-              <w:t xml:space="default"/>
-            </w:r>
-          </w:p>
-        </w:tc>
-      </w:tr>
-      <w:tr>
-        <w:trPr>
-          <w:cantSplit/>
-        </w:trPr>
-        <w:tc>
-          <w:tcPr>
-            <w:tcBorders>
-              <w:top w:val="single" w:space="0" w:color="D3D3D3"/>
-              <w:bottom w:val="single" w:space="0" w:color="D3D3D3"/>
-              <w:start w:val="single" w:space="0" w:color="D3D3D3"/>
-              <w:end w:val="single" w:space="0" w:color="D3D3D3"/>
-            </w:tcBorders>
-          </w:tcPr>
-          <w:p>
-            <w:pPr>
-              <w:spacing w:before="0" w:after="60"/>
-              <w:keepNext/>
-              <w:jc w:val="start"/>
-            </w:pPr>
-            <w:r>
-              <w:rPr>
-                <w:rFonts w:ascii="Calibri" w:hAnsi="Calibri"/>
-                <w:sz w:val="20"/>
                 <w:b w:val="true"/>
               </w:rPr>
-              <w:t xml:space="default">Household (18+ years) income (2021 USD)</w:t>
-            </w:r>
-          </w:p>
-        </w:tc>
-        <w:tc>
-          <w:tcPr>
-            <w:tcBorders>
-              <w:top w:val="single" w:space="0" w:color="D3D3D3"/>
-              <w:bottom w:val="single" w:space="0" w:color="D3D3D3"/>
-              <w:start w:val="single" w:space="0" w:color="D3D3D3"/>
-              <w:end w:val="single" w:space="0" w:color="D3D3D3"/>
-            </w:tcBorders>
-          </w:tcPr>
-          <w:p>
-            <w:pPr>
-              <w:spacing w:before="0" w:after="60"/>
-              <w:keepNext/>
-              <w:jc w:val="center"/>
-            </w:pPr>
-            <w:r>
-              <w:rPr>
-                <w:rFonts w:ascii="Calibri" w:hAnsi="Calibri"/>
-                <w:sz w:val="20"/>
-              </w:rPr>
-              <w:t xml:space="default">38,624 (13,768, 65,097)</w:t>
-            </w:r>
-          </w:p>
-        </w:tc>
-        <w:tc>
-          <w:tcPr>
-            <w:tcBorders>
-              <w:top w:val="single" w:space="0" w:color="D3D3D3"/>
-              <w:bottom w:val="single" w:space="0" w:color="D3D3D3"/>
-              <w:start w:val="single" w:space="0" w:color="D3D3D3"/>
-              <w:end w:val="single" w:space="0" w:color="D3D3D3"/>
-            </w:tcBorders>
-          </w:tcPr>
-          <w:p>
-            <w:pPr>
-              <w:spacing w:before="0" w:after="60"/>
-              <w:keepNext/>
-              <w:jc w:val="center"/>
-            </w:pPr>
-            <w:r>
-              <w:rPr>
-                <w:rFonts w:ascii="Calibri" w:hAnsi="Calibri"/>
-                <w:sz w:val="20"/>
-              </w:rPr>
-              <w:t xml:space="default">34,320 (11,000, 64,002)</w:t>
-            </w:r>
-          </w:p>
-        </w:tc>
-        <w:tc>
-          <w:tcPr>
-            <w:tcBorders>
-              <w:top w:val="single" w:space="0" w:color="D3D3D3"/>
-              <w:bottom w:val="single" w:space="0" w:color="D3D3D3"/>
-              <w:start w:val="single" w:space="0" w:color="D3D3D3"/>
-              <w:end w:val="single" w:space="0" w:color="D3D3D3"/>
-            </w:tcBorders>
-          </w:tcPr>
-          <w:p>
-            <w:pPr>
-              <w:spacing w:before="0" w:after="60"/>
-              <w:keepNext/>
-              <w:jc w:val="center"/>
-            </w:pPr>
-            <w:r>
-              <w:rPr>
-                <w:rFonts w:ascii="Calibri" w:hAnsi="Calibri"/>
-                <w:sz w:val="20"/>
-              </w:rPr>
-              <w:t xml:space="default">0.3</w:t>
-            </w:r>
-          </w:p>
-        </w:tc>
-      </w:tr>
-      <w:tr>
-        <w:trPr>
-          <w:cantSplit/>
-        </w:trPr>
-        <w:tc>
-          <w:tcPr>
-            <w:tcBorders>
-              <w:top w:val="single" w:space="0" w:color="D3D3D3"/>
-              <w:bottom w:val="single" w:space="0" w:color="D3D3D3"/>
-              <w:start w:val="single" w:space="0" w:color="D3D3D3"/>
-              <w:end w:val="single" w:space="0" w:color="D3D3D3"/>
-            </w:tcBorders>
-          </w:tcPr>
-          <w:p>
-            <w:pPr>
-              <w:spacing w:before="0" w:after="60"/>
-              <w:keepNext/>
-              <w:jc w:val="start"/>
-            </w:pPr>
-            <w:r>
-              <w:rPr>
-                <w:rFonts w:ascii="Calibri" w:hAnsi="Calibri"/>
-                <w:sz w:val="20"/>
-                <w:b w:val="true"/>
-              </w:rPr>
               <w:t xml:space="default">Total spending (2021 USD)</w:t>
             </w:r>
           </w:p>
@@ -3193,7 +2789,7 @@
                 <w:rFonts w:ascii="Calibri" w:hAnsi="Calibri"/>
                 <w:sz w:val="20"/>
               </w:rPr>
-              <w:t xml:space="default">257 (0, 1,217)</w:t>
+              <w:t xml:space="default">265 (0, 1,257)</w:t>
             </w:r>
           </w:p>
         </w:tc>
@@ -3413,10 +3009,10 @@
   <w:docDefaults>
     <w:rPrDefault>
       <w:rPr>
-        <w:rFonts w:asciiTheme="minorHAnsi" w:cstheme="minorBidi" w:eastAsiaTheme="minorHAnsi" w:hAnsiTheme="minorHAnsi"/>
+        <w:rFonts w:asciiTheme="minorHAnsi" w:cstheme="minorBidi" w:eastAsiaTheme="minorEastAsia" w:hAnsiTheme="minorHAnsi"/>
         <w:sz w:val="24"/>
         <w:szCs w:val="24"/>
-        <w:lang w:bidi="ar-SA" w:eastAsia="en-US" w:val="en-US"/>
+        <w:lang w:bidi="ar-SA" w:eastAsia="zh-CN" w:val="en-US"/>
       </w:rPr>
     </w:rPrDefault>
     <w:pPrDefault>
@@ -3957,13 +3553,6 @@
       </w:tblCellMar>
     </w:tblPr>
     <w:tblStylePr w:type="firstRow">
-      <w:tblPr>
-        <w:jc w:val="left"/>
-        <w:tblInd w:type="dxa" w:w="0"/>
-      </w:tblPr>
-      <w:trPr>
-        <w:jc w:val="left"/>
-      </w:trPr>
       <w:tcPr>
         <w:tcBorders>
           <w:bottom w:val="single"/>

</xml_diff>

<commit_message>
major changes made to fix linkage
</commit_message>
<xml_diff>
--- a/exports/table1.docx
+++ b/exports/table1.docx
@@ -83,7 +83,7 @@
                 <w:rFonts w:ascii="Calibri" w:hAnsi="Calibri"/>
                 <w:sz w:val="20"/>
               </w:rPr>
-              <w:t xml:space="preserve">N = 4,522,902</w:t>
+              <w:t xml:space="preserve">N = 3,294,689</w:t>
             </w:r>
             <w:r>
               <w:rPr>
@@ -136,7 +136,7 @@
                 <w:rFonts w:ascii="Calibri" w:hAnsi="Calibri"/>
                 <w:sz w:val="20"/>
               </w:rPr>
-              <w:t xml:space="preserve">N = 4,875,673</w:t>
+              <w:t xml:space="preserve">N = 3,895,417</w:t>
             </w:r>
             <w:r>
               <w:rPr>
@@ -208,79 +208,79 @@
                 <w:sz w:val="20"/>
                 <w:b w:val="true"/>
               </w:rPr>
-              <w:t xml:space="default">Age group</w:t>
-            </w:r>
-          </w:p>
-        </w:tc>
-        <w:tc>
-          <w:tcPr>
-            <w:tcBorders>
-              <w:top w:val="single" w:space="0" w:color="D3D3D3"/>
-              <w:bottom w:val="single" w:space="0" w:color="D3D3D3"/>
-              <w:start w:val="single" w:space="0" w:color="D3D3D3"/>
-              <w:end w:val="single" w:space="0" w:color="D3D3D3"/>
-            </w:tcBorders>
-          </w:tcPr>
-          <w:p>
-            <w:pPr>
-              <w:spacing w:before="0" w:after="60"/>
-              <w:keepNext/>
-              <w:jc w:val="center"/>
-            </w:pPr>
-            <w:r>
-              <w:rPr>
-                <w:rFonts w:ascii="Calibri" w:hAnsi="Calibri"/>
-                <w:sz w:val="20"/>
-              </w:rPr>
-              <w:t xml:space="default"/>
-            </w:r>
-          </w:p>
-        </w:tc>
-        <w:tc>
-          <w:tcPr>
-            <w:tcBorders>
-              <w:top w:val="single" w:space="0" w:color="D3D3D3"/>
-              <w:bottom w:val="single" w:space="0" w:color="D3D3D3"/>
-              <w:start w:val="single" w:space="0" w:color="D3D3D3"/>
-              <w:end w:val="single" w:space="0" w:color="D3D3D3"/>
-            </w:tcBorders>
-          </w:tcPr>
-          <w:p>
-            <w:pPr>
-              <w:spacing w:before="0" w:after="60"/>
-              <w:keepNext/>
-              <w:jc w:val="center"/>
-            </w:pPr>
-            <w:r>
-              <w:rPr>
-                <w:rFonts w:ascii="Calibri" w:hAnsi="Calibri"/>
-                <w:sz w:val="20"/>
-              </w:rPr>
-              <w:t xml:space="default"/>
-            </w:r>
-          </w:p>
-        </w:tc>
-        <w:tc>
-          <w:tcPr>
-            <w:tcBorders>
-              <w:top w:val="single" w:space="0" w:color="D3D3D3"/>
-              <w:bottom w:val="single" w:space="0" w:color="D3D3D3"/>
-              <w:start w:val="single" w:space="0" w:color="D3D3D3"/>
-              <w:end w:val="single" w:space="0" w:color="D3D3D3"/>
-            </w:tcBorders>
-          </w:tcPr>
-          <w:p>
-            <w:pPr>
-              <w:spacing w:before="0" w:after="60"/>
-              <w:keepNext/>
-              <w:jc w:val="center"/>
-            </w:pPr>
-            <w:r>
-              <w:rPr>
-                <w:rFonts w:ascii="Calibri" w:hAnsi="Calibri"/>
-                <w:sz w:val="20"/>
-              </w:rPr>
-              <w:t xml:space="default">0.005</w:t>
+              <w:t xml:space="default">Age (years)</w:t>
+            </w:r>
+          </w:p>
+        </w:tc>
+        <w:tc>
+          <w:tcPr>
+            <w:tcBorders>
+              <w:top w:val="single" w:space="0" w:color="D3D3D3"/>
+              <w:bottom w:val="single" w:space="0" w:color="D3D3D3"/>
+              <w:start w:val="single" w:space="0" w:color="D3D3D3"/>
+              <w:end w:val="single" w:space="0" w:color="D3D3D3"/>
+            </w:tcBorders>
+          </w:tcPr>
+          <w:p>
+            <w:pPr>
+              <w:spacing w:before="0" w:after="60"/>
+              <w:keepNext/>
+              <w:jc w:val="center"/>
+            </w:pPr>
+            <w:r>
+              <w:rPr>
+                <w:rFonts w:ascii="Calibri" w:hAnsi="Calibri"/>
+                <w:sz w:val="20"/>
+              </w:rPr>
+              <w:t xml:space="default">24 (16)</w:t>
+            </w:r>
+          </w:p>
+        </w:tc>
+        <w:tc>
+          <w:tcPr>
+            <w:tcBorders>
+              <w:top w:val="single" w:space="0" w:color="D3D3D3"/>
+              <w:bottom w:val="single" w:space="0" w:color="D3D3D3"/>
+              <w:start w:val="single" w:space="0" w:color="D3D3D3"/>
+              <w:end w:val="single" w:space="0" w:color="D3D3D3"/>
+            </w:tcBorders>
+          </w:tcPr>
+          <w:p>
+            <w:pPr>
+              <w:spacing w:before="0" w:after="60"/>
+              <w:keepNext/>
+              <w:jc w:val="center"/>
+            </w:pPr>
+            <w:r>
+              <w:rPr>
+                <w:rFonts w:ascii="Calibri" w:hAnsi="Calibri"/>
+                <w:sz w:val="20"/>
+              </w:rPr>
+              <w:t xml:space="default">25 (15)</w:t>
+            </w:r>
+          </w:p>
+        </w:tc>
+        <w:tc>
+          <w:tcPr>
+            <w:tcBorders>
+              <w:top w:val="single" w:space="0" w:color="D3D3D3"/>
+              <w:bottom w:val="single" w:space="0" w:color="D3D3D3"/>
+              <w:start w:val="single" w:space="0" w:color="D3D3D3"/>
+              <w:end w:val="single" w:space="0" w:color="D3D3D3"/>
+            </w:tcBorders>
+          </w:tcPr>
+          <w:p>
+            <w:pPr>
+              <w:spacing w:before="0" w:after="60"/>
+              <w:keepNext/>
+              <w:jc w:val="center"/>
+            </w:pPr>
+            <w:r>
+              <w:rPr>
+                <w:rFonts w:ascii="Calibri" w:hAnsi="Calibri"/>
+                <w:sz w:val="20"/>
+              </w:rPr>
+              <w:t xml:space="default">0.044</w:t>
             </w:r>
           </w:p>
         </w:tc>
@@ -308,56 +308,9 @@
               <w:rPr>
                 <w:rFonts w:ascii="Calibri" w:hAnsi="Calibri"/>
                 <w:sz w:val="20"/>
-              </w:rPr>
-              <w:t xml:space="default">    Child (&lt;18 years)</w:t>
-            </w:r>
-          </w:p>
-        </w:tc>
-        <w:tc>
-          <w:tcPr>
-            <w:tcBorders>
-              <w:top w:val="single" w:space="0" w:color="D3D3D3"/>
-              <w:bottom w:val="single" w:space="0" w:color="D3D3D3"/>
-              <w:start w:val="single" w:space="0" w:color="D3D3D3"/>
-              <w:end w:val="single" w:space="0" w:color="D3D3D3"/>
-            </w:tcBorders>
-          </w:tcPr>
-          <w:p>
-            <w:pPr>
-              <w:spacing w:before="0" w:after="60"/>
-              <w:keepNext/>
-              <w:jc w:val="center"/>
-            </w:pPr>
-            <w:r>
-              <w:rPr>
-                <w:rFonts w:ascii="Calibri" w:hAnsi="Calibri"/>
-                <w:sz w:val="20"/>
-              </w:rPr>
-              <w:t xml:space="default">2,145,531 (47%)</w:t>
-            </w:r>
-          </w:p>
-        </w:tc>
-        <w:tc>
-          <w:tcPr>
-            <w:tcBorders>
-              <w:top w:val="single" w:space="0" w:color="D3D3D3"/>
-              <w:bottom w:val="single" w:space="0" w:color="D3D3D3"/>
-              <w:start w:val="single" w:space="0" w:color="D3D3D3"/>
-              <w:end w:val="single" w:space="0" w:color="D3D3D3"/>
-            </w:tcBorders>
-          </w:tcPr>
-          <w:p>
-            <w:pPr>
-              <w:spacing w:before="0" w:after="60"/>
-              <w:keepNext/>
-              <w:jc w:val="center"/>
-            </w:pPr>
-            <w:r>
-              <w:rPr>
-                <w:rFonts w:ascii="Calibri" w:hAnsi="Calibri"/>
-                <w:sz w:val="20"/>
-              </w:rPr>
-              <w:t xml:space="default">2,028,904 (42%)</w:t>
+                <w:b w:val="true"/>
+              </w:rPr>
+              <w:t xml:space="default">Age group</w:t>
             </w:r>
           </w:p>
         </w:tc>
@@ -382,6 +335,54 @@
                 <w:sz w:val="20"/>
               </w:rPr>
               <w:t xml:space="default"/>
+            </w:r>
+          </w:p>
+        </w:tc>
+        <w:tc>
+          <w:tcPr>
+            <w:tcBorders>
+              <w:top w:val="single" w:space="0" w:color="D3D3D3"/>
+              <w:bottom w:val="single" w:space="0" w:color="D3D3D3"/>
+              <w:start w:val="single" w:space="0" w:color="D3D3D3"/>
+              <w:end w:val="single" w:space="0" w:color="D3D3D3"/>
+            </w:tcBorders>
+          </w:tcPr>
+          <w:p>
+            <w:pPr>
+              <w:spacing w:before="0" w:after="60"/>
+              <w:keepNext/>
+              <w:jc w:val="center"/>
+            </w:pPr>
+            <w:r>
+              <w:rPr>
+                <w:rFonts w:ascii="Calibri" w:hAnsi="Calibri"/>
+                <w:sz w:val="20"/>
+              </w:rPr>
+              <w:t xml:space="default"/>
+            </w:r>
+          </w:p>
+        </w:tc>
+        <w:tc>
+          <w:tcPr>
+            <w:tcBorders>
+              <w:top w:val="single" w:space="0" w:color="D3D3D3"/>
+              <w:bottom w:val="single" w:space="0" w:color="D3D3D3"/>
+              <w:start w:val="single" w:space="0" w:color="D3D3D3"/>
+              <w:end w:val="single" w:space="0" w:color="D3D3D3"/>
+            </w:tcBorders>
+          </w:tcPr>
+          <w:p>
+            <w:pPr>
+              <w:spacing w:before="0" w:after="60"/>
+              <w:keepNext/>
+              <w:jc w:val="center"/>
+            </w:pPr>
+            <w:r>
+              <w:rPr>
+                <w:rFonts w:ascii="Calibri" w:hAnsi="Calibri"/>
+                <w:sz w:val="20"/>
+              </w:rPr>
+              <w:t xml:space="default">0.021</w:t>
             </w:r>
           </w:p>
         </w:tc>
@@ -410,55 +411,55 @@
                 <w:rFonts w:ascii="Calibri" w:hAnsi="Calibri"/>
                 <w:sz w:val="20"/>
               </w:rPr>
-              <w:t xml:space="default">    Adult (18+ years)</w:t>
-            </w:r>
-          </w:p>
-        </w:tc>
-        <w:tc>
-          <w:tcPr>
-            <w:tcBorders>
-              <w:top w:val="single" w:space="0" w:color="D3D3D3"/>
-              <w:bottom w:val="single" w:space="0" w:color="D3D3D3"/>
-              <w:start w:val="single" w:space="0" w:color="D3D3D3"/>
-              <w:end w:val="single" w:space="0" w:color="D3D3D3"/>
-            </w:tcBorders>
-          </w:tcPr>
-          <w:p>
-            <w:pPr>
-              <w:spacing w:before="0" w:after="60"/>
-              <w:keepNext/>
-              <w:jc w:val="center"/>
-            </w:pPr>
-            <w:r>
-              <w:rPr>
-                <w:rFonts w:ascii="Calibri" w:hAnsi="Calibri"/>
-                <w:sz w:val="20"/>
-              </w:rPr>
-              <w:t xml:space="default">2,377,371 (53%)</w:t>
-            </w:r>
-          </w:p>
-        </w:tc>
-        <w:tc>
-          <w:tcPr>
-            <w:tcBorders>
-              <w:top w:val="single" w:space="0" w:color="D3D3D3"/>
-              <w:bottom w:val="single" w:space="0" w:color="D3D3D3"/>
-              <w:start w:val="single" w:space="0" w:color="D3D3D3"/>
-              <w:end w:val="single" w:space="0" w:color="D3D3D3"/>
-            </w:tcBorders>
-          </w:tcPr>
-          <w:p>
-            <w:pPr>
-              <w:spacing w:before="0" w:after="60"/>
-              <w:keepNext/>
-              <w:jc w:val="center"/>
-            </w:pPr>
-            <w:r>
-              <w:rPr>
-                <w:rFonts w:ascii="Calibri" w:hAnsi="Calibri"/>
-                <w:sz w:val="20"/>
-              </w:rPr>
-              <w:t xml:space="default">2,846,769 (58%)</w:t>
+              <w:t xml:space="default">    Child (&lt;18 years)</w:t>
+            </w:r>
+          </w:p>
+        </w:tc>
+        <w:tc>
+          <w:tcPr>
+            <w:tcBorders>
+              <w:top w:val="single" w:space="0" w:color="D3D3D3"/>
+              <w:bottom w:val="single" w:space="0" w:color="D3D3D3"/>
+              <w:start w:val="single" w:space="0" w:color="D3D3D3"/>
+              <w:end w:val="single" w:space="0" w:color="D3D3D3"/>
+            </w:tcBorders>
+          </w:tcPr>
+          <w:p>
+            <w:pPr>
+              <w:spacing w:before="0" w:after="60"/>
+              <w:keepNext/>
+              <w:jc w:val="center"/>
+            </w:pPr>
+            <w:r>
+              <w:rPr>
+                <w:rFonts w:ascii="Calibri" w:hAnsi="Calibri"/>
+                <w:sz w:val="20"/>
+              </w:rPr>
+              <w:t xml:space="default">1,607,714 (49%)</w:t>
+            </w:r>
+          </w:p>
+        </w:tc>
+        <w:tc>
+          <w:tcPr>
+            <w:tcBorders>
+              <w:top w:val="single" w:space="0" w:color="D3D3D3"/>
+              <w:bottom w:val="single" w:space="0" w:color="D3D3D3"/>
+              <w:start w:val="single" w:space="0" w:color="D3D3D3"/>
+              <w:end w:val="single" w:space="0" w:color="D3D3D3"/>
+            </w:tcBorders>
+          </w:tcPr>
+          <w:p>
+            <w:pPr>
+              <w:spacing w:before="0" w:after="60"/>
+              <w:keepNext/>
+              <w:jc w:val="center"/>
+            </w:pPr>
+            <w:r>
+              <w:rPr>
+                <w:rFonts w:ascii="Calibri" w:hAnsi="Calibri"/>
+                <w:sz w:val="20"/>
+              </w:rPr>
+              <w:t xml:space="default">1,600,934 (41%)</w:t>
             </w:r>
           </w:p>
         </w:tc>
@@ -510,9 +511,56 @@
               <w:rPr>
                 <w:rFonts w:ascii="Calibri" w:hAnsi="Calibri"/>
                 <w:sz w:val="20"/>
-                <w:b w:val="true"/>
-              </w:rPr>
-              <w:t xml:space="default">Age-sex subgroup</w:t>
+              </w:rPr>
+              <w:t xml:space="default">    Adult (18+ years)</w:t>
+            </w:r>
+          </w:p>
+        </w:tc>
+        <w:tc>
+          <w:tcPr>
+            <w:tcBorders>
+              <w:top w:val="single" w:space="0" w:color="D3D3D3"/>
+              <w:bottom w:val="single" w:space="0" w:color="D3D3D3"/>
+              <w:start w:val="single" w:space="0" w:color="D3D3D3"/>
+              <w:end w:val="single" w:space="0" w:color="D3D3D3"/>
+            </w:tcBorders>
+          </w:tcPr>
+          <w:p>
+            <w:pPr>
+              <w:spacing w:before="0" w:after="60"/>
+              <w:keepNext/>
+              <w:jc w:val="center"/>
+            </w:pPr>
+            <w:r>
+              <w:rPr>
+                <w:rFonts w:ascii="Calibri" w:hAnsi="Calibri"/>
+                <w:sz w:val="20"/>
+              </w:rPr>
+              <w:t xml:space="default">1,686,975 (51%)</w:t>
+            </w:r>
+          </w:p>
+        </w:tc>
+        <w:tc>
+          <w:tcPr>
+            <w:tcBorders>
+              <w:top w:val="single" w:space="0" w:color="D3D3D3"/>
+              <w:bottom w:val="single" w:space="0" w:color="D3D3D3"/>
+              <w:start w:val="single" w:space="0" w:color="D3D3D3"/>
+              <w:end w:val="single" w:space="0" w:color="D3D3D3"/>
+            </w:tcBorders>
+          </w:tcPr>
+          <w:p>
+            <w:pPr>
+              <w:spacing w:before="0" w:after="60"/>
+              <w:keepNext/>
+              <w:jc w:val="center"/>
+            </w:pPr>
+            <w:r>
+              <w:rPr>
+                <w:rFonts w:ascii="Calibri" w:hAnsi="Calibri"/>
+                <w:sz w:val="20"/>
+              </w:rPr>
+              <w:t xml:space="default">2,294,483 (59%)</w:t>
             </w:r>
           </w:p>
         </w:tc>
@@ -537,54 +585,6 @@
                 <w:sz w:val="20"/>
               </w:rPr>
               <w:t xml:space="default"/>
-            </w:r>
-          </w:p>
-        </w:tc>
-        <w:tc>
-          <w:tcPr>
-            <w:tcBorders>
-              <w:top w:val="single" w:space="0" w:color="D3D3D3"/>
-              <w:bottom w:val="single" w:space="0" w:color="D3D3D3"/>
-              <w:start w:val="single" w:space="0" w:color="D3D3D3"/>
-              <w:end w:val="single" w:space="0" w:color="D3D3D3"/>
-            </w:tcBorders>
-          </w:tcPr>
-          <w:p>
-            <w:pPr>
-              <w:spacing w:before="0" w:after="60"/>
-              <w:keepNext/>
-              <w:jc w:val="center"/>
-            </w:pPr>
-            <w:r>
-              <w:rPr>
-                <w:rFonts w:ascii="Calibri" w:hAnsi="Calibri"/>
-                <w:sz w:val="20"/>
-              </w:rPr>
-              <w:t xml:space="default"/>
-            </w:r>
-          </w:p>
-        </w:tc>
-        <w:tc>
-          <w:tcPr>
-            <w:tcBorders>
-              <w:top w:val="single" w:space="0" w:color="D3D3D3"/>
-              <w:bottom w:val="single" w:space="0" w:color="D3D3D3"/>
-              <w:start w:val="single" w:space="0" w:color="D3D3D3"/>
-              <w:end w:val="single" w:space="0" w:color="D3D3D3"/>
-            </w:tcBorders>
-          </w:tcPr>
-          <w:p>
-            <w:pPr>
-              <w:spacing w:before="0" w:after="60"/>
-              <w:keepNext/>
-              <w:jc w:val="center"/>
-            </w:pPr>
-            <w:r>
-              <w:rPr>
-                <w:rFonts w:ascii="Calibri" w:hAnsi="Calibri"/>
-                <w:sz w:val="20"/>
-              </w:rPr>
-              <w:t xml:space="default">0.011</w:t>
             </w:r>
           </w:p>
         </w:tc>
@@ -612,56 +612,9 @@
               <w:rPr>
                 <w:rFonts w:ascii="Calibri" w:hAnsi="Calibri"/>
                 <w:sz w:val="20"/>
-              </w:rPr>
-              <w:t xml:space="default">    Child, male</w:t>
-            </w:r>
-          </w:p>
-        </w:tc>
-        <w:tc>
-          <w:tcPr>
-            <w:tcBorders>
-              <w:top w:val="single" w:space="0" w:color="D3D3D3"/>
-              <w:bottom w:val="single" w:space="0" w:color="D3D3D3"/>
-              <w:start w:val="single" w:space="0" w:color="D3D3D3"/>
-              <w:end w:val="single" w:space="0" w:color="D3D3D3"/>
-            </w:tcBorders>
-          </w:tcPr>
-          <w:p>
-            <w:pPr>
-              <w:spacing w:before="0" w:after="60"/>
-              <w:keepNext/>
-              <w:jc w:val="center"/>
-            </w:pPr>
-            <w:r>
-              <w:rPr>
-                <w:rFonts w:ascii="Calibri" w:hAnsi="Calibri"/>
-                <w:sz w:val="20"/>
-              </w:rPr>
-              <w:t xml:space="default">1,432,162 (32%)</w:t>
-            </w:r>
-          </w:p>
-        </w:tc>
-        <w:tc>
-          <w:tcPr>
-            <w:tcBorders>
-              <w:top w:val="single" w:space="0" w:color="D3D3D3"/>
-              <w:bottom w:val="single" w:space="0" w:color="D3D3D3"/>
-              <w:start w:val="single" w:space="0" w:color="D3D3D3"/>
-              <w:end w:val="single" w:space="0" w:color="D3D3D3"/>
-            </w:tcBorders>
-          </w:tcPr>
-          <w:p>
-            <w:pPr>
-              <w:spacing w:before="0" w:after="60"/>
-              <w:keepNext/>
-              <w:jc w:val="center"/>
-            </w:pPr>
-            <w:r>
-              <w:rPr>
-                <w:rFonts w:ascii="Calibri" w:hAnsi="Calibri"/>
-                <w:sz w:val="20"/>
-              </w:rPr>
-              <w:t xml:space="default">1,351,622 (28%)</w:t>
+                <w:b w:val="true"/>
+              </w:rPr>
+              <w:t xml:space="default">Age-sex subgroup</w:t>
             </w:r>
           </w:p>
         </w:tc>
@@ -686,6 +639,54 @@
                 <w:sz w:val="20"/>
               </w:rPr>
               <w:t xml:space="default"/>
+            </w:r>
+          </w:p>
+        </w:tc>
+        <w:tc>
+          <w:tcPr>
+            <w:tcBorders>
+              <w:top w:val="single" w:space="0" w:color="D3D3D3"/>
+              <w:bottom w:val="single" w:space="0" w:color="D3D3D3"/>
+              <w:start w:val="single" w:space="0" w:color="D3D3D3"/>
+              <w:end w:val="single" w:space="0" w:color="D3D3D3"/>
+            </w:tcBorders>
+          </w:tcPr>
+          <w:p>
+            <w:pPr>
+              <w:spacing w:before="0" w:after="60"/>
+              <w:keepNext/>
+              <w:jc w:val="center"/>
+            </w:pPr>
+            <w:r>
+              <w:rPr>
+                <w:rFonts w:ascii="Calibri" w:hAnsi="Calibri"/>
+                <w:sz w:val="20"/>
+              </w:rPr>
+              <w:t xml:space="default"/>
+            </w:r>
+          </w:p>
+        </w:tc>
+        <w:tc>
+          <w:tcPr>
+            <w:tcBorders>
+              <w:top w:val="single" w:space="0" w:color="D3D3D3"/>
+              <w:bottom w:val="single" w:space="0" w:color="D3D3D3"/>
+              <w:start w:val="single" w:space="0" w:color="D3D3D3"/>
+              <w:end w:val="single" w:space="0" w:color="D3D3D3"/>
+            </w:tcBorders>
+          </w:tcPr>
+          <w:p>
+            <w:pPr>
+              <w:spacing w:before="0" w:after="60"/>
+              <w:keepNext/>
+              <w:jc w:val="center"/>
+            </w:pPr>
+            <w:r>
+              <w:rPr>
+                <w:rFonts w:ascii="Calibri" w:hAnsi="Calibri"/>
+                <w:sz w:val="20"/>
+              </w:rPr>
+              <w:t xml:space="default">0.13</w:t>
             </w:r>
           </w:p>
         </w:tc>
@@ -714,55 +715,55 @@
                 <w:rFonts w:ascii="Calibri" w:hAnsi="Calibri"/>
                 <w:sz w:val="20"/>
               </w:rPr>
-              <w:t xml:space="default">    Child, female</w:t>
-            </w:r>
-          </w:p>
-        </w:tc>
-        <w:tc>
-          <w:tcPr>
-            <w:tcBorders>
-              <w:top w:val="single" w:space="0" w:color="D3D3D3"/>
-              <w:bottom w:val="single" w:space="0" w:color="D3D3D3"/>
-              <w:start w:val="single" w:space="0" w:color="D3D3D3"/>
-              <w:end w:val="single" w:space="0" w:color="D3D3D3"/>
-            </w:tcBorders>
-          </w:tcPr>
-          <w:p>
-            <w:pPr>
-              <w:spacing w:before="0" w:after="60"/>
-              <w:keepNext/>
-              <w:jc w:val="center"/>
-            </w:pPr>
-            <w:r>
-              <w:rPr>
-                <w:rFonts w:ascii="Calibri" w:hAnsi="Calibri"/>
-                <w:sz w:val="20"/>
-              </w:rPr>
-              <w:t xml:space="default">713,368 (16%)</w:t>
-            </w:r>
-          </w:p>
-        </w:tc>
-        <w:tc>
-          <w:tcPr>
-            <w:tcBorders>
-              <w:top w:val="single" w:space="0" w:color="D3D3D3"/>
-              <w:bottom w:val="single" w:space="0" w:color="D3D3D3"/>
-              <w:start w:val="single" w:space="0" w:color="D3D3D3"/>
-              <w:end w:val="single" w:space="0" w:color="D3D3D3"/>
-            </w:tcBorders>
-          </w:tcPr>
-          <w:p>
-            <w:pPr>
-              <w:spacing w:before="0" w:after="60"/>
-              <w:keepNext/>
-              <w:jc w:val="center"/>
-            </w:pPr>
-            <w:r>
-              <w:rPr>
-                <w:rFonts w:ascii="Calibri" w:hAnsi="Calibri"/>
-                <w:sz w:val="20"/>
-              </w:rPr>
-              <w:t xml:space="default">677,282 (14%)</w:t>
+              <w:t xml:space="default">    Child, male</w:t>
+            </w:r>
+          </w:p>
+        </w:tc>
+        <w:tc>
+          <w:tcPr>
+            <w:tcBorders>
+              <w:top w:val="single" w:space="0" w:color="D3D3D3"/>
+              <w:bottom w:val="single" w:space="0" w:color="D3D3D3"/>
+              <w:start w:val="single" w:space="0" w:color="D3D3D3"/>
+              <w:end w:val="single" w:space="0" w:color="D3D3D3"/>
+            </w:tcBorders>
+          </w:tcPr>
+          <w:p>
+            <w:pPr>
+              <w:spacing w:before="0" w:after="60"/>
+              <w:keepNext/>
+              <w:jc w:val="center"/>
+            </w:pPr>
+            <w:r>
+              <w:rPr>
+                <w:rFonts w:ascii="Calibri" w:hAnsi="Calibri"/>
+                <w:sz w:val="20"/>
+              </w:rPr>
+              <w:t xml:space="default">1,031,338 (31%)</w:t>
+            </w:r>
+          </w:p>
+        </w:tc>
+        <w:tc>
+          <w:tcPr>
+            <w:tcBorders>
+              <w:top w:val="single" w:space="0" w:color="D3D3D3"/>
+              <w:bottom w:val="single" w:space="0" w:color="D3D3D3"/>
+              <w:start w:val="single" w:space="0" w:color="D3D3D3"/>
+              <w:end w:val="single" w:space="0" w:color="D3D3D3"/>
+            </w:tcBorders>
+          </w:tcPr>
+          <w:p>
+            <w:pPr>
+              <w:spacing w:before="0" w:after="60"/>
+              <w:keepNext/>
+              <w:jc w:val="center"/>
+            </w:pPr>
+            <w:r>
+              <w:rPr>
+                <w:rFonts w:ascii="Calibri" w:hAnsi="Calibri"/>
+                <w:sz w:val="20"/>
+              </w:rPr>
+              <w:t xml:space="default">1,058,660 (27%)</w:t>
             </w:r>
           </w:p>
         </w:tc>
@@ -815,55 +816,55 @@
                 <w:rFonts w:ascii="Calibri" w:hAnsi="Calibri"/>
                 <w:sz w:val="20"/>
               </w:rPr>
-              <w:t xml:space="default">    Adult, male</w:t>
-            </w:r>
-          </w:p>
-        </w:tc>
-        <w:tc>
-          <w:tcPr>
-            <w:tcBorders>
-              <w:top w:val="single" w:space="0" w:color="D3D3D3"/>
-              <w:bottom w:val="single" w:space="0" w:color="D3D3D3"/>
-              <w:start w:val="single" w:space="0" w:color="D3D3D3"/>
-              <w:end w:val="single" w:space="0" w:color="D3D3D3"/>
-            </w:tcBorders>
-          </w:tcPr>
-          <w:p>
-            <w:pPr>
-              <w:spacing w:before="0" w:after="60"/>
-              <w:keepNext/>
-              <w:jc w:val="center"/>
-            </w:pPr>
-            <w:r>
-              <w:rPr>
-                <w:rFonts w:ascii="Calibri" w:hAnsi="Calibri"/>
-                <w:sz w:val="20"/>
-              </w:rPr>
-              <w:t xml:space="default">1,075,992 (24%)</w:t>
-            </w:r>
-          </w:p>
-        </w:tc>
-        <w:tc>
-          <w:tcPr>
-            <w:tcBorders>
-              <w:top w:val="single" w:space="0" w:color="D3D3D3"/>
-              <w:bottom w:val="single" w:space="0" w:color="D3D3D3"/>
-              <w:start w:val="single" w:space="0" w:color="D3D3D3"/>
-              <w:end w:val="single" w:space="0" w:color="D3D3D3"/>
-            </w:tcBorders>
-          </w:tcPr>
-          <w:p>
-            <w:pPr>
-              <w:spacing w:before="0" w:after="60"/>
-              <w:keepNext/>
-              <w:jc w:val="center"/>
-            </w:pPr>
-            <w:r>
-              <w:rPr>
-                <w:rFonts w:ascii="Calibri" w:hAnsi="Calibri"/>
-                <w:sz w:val="20"/>
-              </w:rPr>
-              <w:t xml:space="default">1,388,196 (28%)</w:t>
+              <w:t xml:space="default">    Child, female</w:t>
+            </w:r>
+          </w:p>
+        </w:tc>
+        <w:tc>
+          <w:tcPr>
+            <w:tcBorders>
+              <w:top w:val="single" w:space="0" w:color="D3D3D3"/>
+              <w:bottom w:val="single" w:space="0" w:color="D3D3D3"/>
+              <w:start w:val="single" w:space="0" w:color="D3D3D3"/>
+              <w:end w:val="single" w:space="0" w:color="D3D3D3"/>
+            </w:tcBorders>
+          </w:tcPr>
+          <w:p>
+            <w:pPr>
+              <w:spacing w:before="0" w:after="60"/>
+              <w:keepNext/>
+              <w:jc w:val="center"/>
+            </w:pPr>
+            <w:r>
+              <w:rPr>
+                <w:rFonts w:ascii="Calibri" w:hAnsi="Calibri"/>
+                <w:sz w:val="20"/>
+              </w:rPr>
+              <w:t xml:space="default">576,376 (17%)</w:t>
+            </w:r>
+          </w:p>
+        </w:tc>
+        <w:tc>
+          <w:tcPr>
+            <w:tcBorders>
+              <w:top w:val="single" w:space="0" w:color="D3D3D3"/>
+              <w:bottom w:val="single" w:space="0" w:color="D3D3D3"/>
+              <w:start w:val="single" w:space="0" w:color="D3D3D3"/>
+              <w:end w:val="single" w:space="0" w:color="D3D3D3"/>
+            </w:tcBorders>
+          </w:tcPr>
+          <w:p>
+            <w:pPr>
+              <w:spacing w:before="0" w:after="60"/>
+              <w:keepNext/>
+              <w:jc w:val="center"/>
+            </w:pPr>
+            <w:r>
+              <w:rPr>
+                <w:rFonts w:ascii="Calibri" w:hAnsi="Calibri"/>
+                <w:sz w:val="20"/>
+              </w:rPr>
+              <w:t xml:space="default">542,275 (14%)</w:t>
             </w:r>
           </w:p>
         </w:tc>
@@ -916,55 +917,55 @@
                 <w:rFonts w:ascii="Calibri" w:hAnsi="Calibri"/>
                 <w:sz w:val="20"/>
               </w:rPr>
-              <w:t xml:space="default">    Adult, female</w:t>
-            </w:r>
-          </w:p>
-        </w:tc>
-        <w:tc>
-          <w:tcPr>
-            <w:tcBorders>
-              <w:top w:val="single" w:space="0" w:color="D3D3D3"/>
-              <w:bottom w:val="single" w:space="0" w:color="D3D3D3"/>
-              <w:start w:val="single" w:space="0" w:color="D3D3D3"/>
-              <w:end w:val="single" w:space="0" w:color="D3D3D3"/>
-            </w:tcBorders>
-          </w:tcPr>
-          <w:p>
-            <w:pPr>
-              <w:spacing w:before="0" w:after="60"/>
-              <w:keepNext/>
-              <w:jc w:val="center"/>
-            </w:pPr>
-            <w:r>
-              <w:rPr>
-                <w:rFonts w:ascii="Calibri" w:hAnsi="Calibri"/>
-                <w:sz w:val="20"/>
-              </w:rPr>
-              <w:t xml:space="default">1,301,379 (29%)</w:t>
-            </w:r>
-          </w:p>
-        </w:tc>
-        <w:tc>
-          <w:tcPr>
-            <w:tcBorders>
-              <w:top w:val="single" w:space="0" w:color="D3D3D3"/>
-              <w:bottom w:val="single" w:space="0" w:color="D3D3D3"/>
-              <w:start w:val="single" w:space="0" w:color="D3D3D3"/>
-              <w:end w:val="single" w:space="0" w:color="D3D3D3"/>
-            </w:tcBorders>
-          </w:tcPr>
-          <w:p>
-            <w:pPr>
-              <w:spacing w:before="0" w:after="60"/>
-              <w:keepNext/>
-              <w:jc w:val="center"/>
-            </w:pPr>
-            <w:r>
-              <w:rPr>
-                <w:rFonts w:ascii="Calibri" w:hAnsi="Calibri"/>
-                <w:sz w:val="20"/>
-              </w:rPr>
-              <w:t xml:space="default">1,458,574 (30%)</w:t>
+              <w:t xml:space="default">    Adult, male</w:t>
+            </w:r>
+          </w:p>
+        </w:tc>
+        <w:tc>
+          <w:tcPr>
+            <w:tcBorders>
+              <w:top w:val="single" w:space="0" w:color="D3D3D3"/>
+              <w:bottom w:val="single" w:space="0" w:color="D3D3D3"/>
+              <w:start w:val="single" w:space="0" w:color="D3D3D3"/>
+              <w:end w:val="single" w:space="0" w:color="D3D3D3"/>
+            </w:tcBorders>
+          </w:tcPr>
+          <w:p>
+            <w:pPr>
+              <w:spacing w:before="0" w:after="60"/>
+              <w:keepNext/>
+              <w:jc w:val="center"/>
+            </w:pPr>
+            <w:r>
+              <w:rPr>
+                <w:rFonts w:ascii="Calibri" w:hAnsi="Calibri"/>
+                <w:sz w:val="20"/>
+              </w:rPr>
+              <w:t xml:space="default">787,764 (24%)</w:t>
+            </w:r>
+          </w:p>
+        </w:tc>
+        <w:tc>
+          <w:tcPr>
+            <w:tcBorders>
+              <w:top w:val="single" w:space="0" w:color="D3D3D3"/>
+              <w:bottom w:val="single" w:space="0" w:color="D3D3D3"/>
+              <w:start w:val="single" w:space="0" w:color="D3D3D3"/>
+              <w:end w:val="single" w:space="0" w:color="D3D3D3"/>
+            </w:tcBorders>
+          </w:tcPr>
+          <w:p>
+            <w:pPr>
+              <w:spacing w:before="0" w:after="60"/>
+              <w:keepNext/>
+              <w:jc w:val="center"/>
+            </w:pPr>
+            <w:r>
+              <w:rPr>
+                <w:rFonts w:ascii="Calibri" w:hAnsi="Calibri"/>
+                <w:sz w:val="20"/>
+              </w:rPr>
+              <w:t xml:space="default">1,002,164 (26%)</w:t>
             </w:r>
           </w:p>
         </w:tc>
@@ -1016,9 +1017,56 @@
               <w:rPr>
                 <w:rFonts w:ascii="Calibri" w:hAnsi="Calibri"/>
                 <w:sz w:val="20"/>
-                <w:b w:val="true"/>
-              </w:rPr>
-              <w:t xml:space="default">Race</w:t>
+              </w:rPr>
+              <w:t xml:space="default">    Adult, female</w:t>
+            </w:r>
+          </w:p>
+        </w:tc>
+        <w:tc>
+          <w:tcPr>
+            <w:tcBorders>
+              <w:top w:val="single" w:space="0" w:color="D3D3D3"/>
+              <w:bottom w:val="single" w:space="0" w:color="D3D3D3"/>
+              <w:start w:val="single" w:space="0" w:color="D3D3D3"/>
+              <w:end w:val="single" w:space="0" w:color="D3D3D3"/>
+            </w:tcBorders>
+          </w:tcPr>
+          <w:p>
+            <w:pPr>
+              <w:spacing w:before="0" w:after="60"/>
+              <w:keepNext/>
+              <w:jc w:val="center"/>
+            </w:pPr>
+            <w:r>
+              <w:rPr>
+                <w:rFonts w:ascii="Calibri" w:hAnsi="Calibri"/>
+                <w:sz w:val="20"/>
+              </w:rPr>
+              <w:t xml:space="default">899,211 (27%)</w:t>
+            </w:r>
+          </w:p>
+        </w:tc>
+        <w:tc>
+          <w:tcPr>
+            <w:tcBorders>
+              <w:top w:val="single" w:space="0" w:color="D3D3D3"/>
+              <w:bottom w:val="single" w:space="0" w:color="D3D3D3"/>
+              <w:start w:val="single" w:space="0" w:color="D3D3D3"/>
+              <w:end w:val="single" w:space="0" w:color="D3D3D3"/>
+            </w:tcBorders>
+          </w:tcPr>
+          <w:p>
+            <w:pPr>
+              <w:spacing w:before="0" w:after="60"/>
+              <w:keepNext/>
+              <w:jc w:val="center"/>
+            </w:pPr>
+            <w:r>
+              <w:rPr>
+                <w:rFonts w:ascii="Calibri" w:hAnsi="Calibri"/>
+                <w:sz w:val="20"/>
+              </w:rPr>
+              <w:t xml:space="default">1,292,319 (33%)</w:t>
             </w:r>
           </w:p>
         </w:tc>
@@ -1043,54 +1091,6 @@
                 <w:sz w:val="20"/>
               </w:rPr>
               <w:t xml:space="default"/>
-            </w:r>
-          </w:p>
-        </w:tc>
-        <w:tc>
-          <w:tcPr>
-            <w:tcBorders>
-              <w:top w:val="single" w:space="0" w:color="D3D3D3"/>
-              <w:bottom w:val="single" w:space="0" w:color="D3D3D3"/>
-              <w:start w:val="single" w:space="0" w:color="D3D3D3"/>
-              <w:end w:val="single" w:space="0" w:color="D3D3D3"/>
-            </w:tcBorders>
-          </w:tcPr>
-          <w:p>
-            <w:pPr>
-              <w:spacing w:before="0" w:after="60"/>
-              <w:keepNext/>
-              <w:jc w:val="center"/>
-            </w:pPr>
-            <w:r>
-              <w:rPr>
-                <w:rFonts w:ascii="Calibri" w:hAnsi="Calibri"/>
-                <w:sz w:val="20"/>
-              </w:rPr>
-              <w:t xml:space="default"/>
-            </w:r>
-          </w:p>
-        </w:tc>
-        <w:tc>
-          <w:tcPr>
-            <w:tcBorders>
-              <w:top w:val="single" w:space="0" w:color="D3D3D3"/>
-              <w:bottom w:val="single" w:space="0" w:color="D3D3D3"/>
-              <w:start w:val="single" w:space="0" w:color="D3D3D3"/>
-              <w:end w:val="single" w:space="0" w:color="D3D3D3"/>
-            </w:tcBorders>
-          </w:tcPr>
-          <w:p>
-            <w:pPr>
-              <w:spacing w:before="0" w:after="60"/>
-              <w:keepNext/>
-              <w:jc w:val="center"/>
-            </w:pPr>
-            <w:r>
-              <w:rPr>
-                <w:rFonts w:ascii="Calibri" w:hAnsi="Calibri"/>
-                <w:sz w:val="20"/>
-              </w:rPr>
-              <w:t xml:space="default">0.4</w:t>
             </w:r>
           </w:p>
         </w:tc>
@@ -1118,56 +1118,9 @@
               <w:rPr>
                 <w:rFonts w:ascii="Calibri" w:hAnsi="Calibri"/>
                 <w:sz w:val="20"/>
-              </w:rPr>
-              <w:t xml:space="default">    White</w:t>
-            </w:r>
-          </w:p>
-        </w:tc>
-        <w:tc>
-          <w:tcPr>
-            <w:tcBorders>
-              <w:top w:val="single" w:space="0" w:color="D3D3D3"/>
-              <w:bottom w:val="single" w:space="0" w:color="D3D3D3"/>
-              <w:start w:val="single" w:space="0" w:color="D3D3D3"/>
-              <w:end w:val="single" w:space="0" w:color="D3D3D3"/>
-            </w:tcBorders>
-          </w:tcPr>
-          <w:p>
-            <w:pPr>
-              <w:spacing w:before="0" w:after="60"/>
-              <w:keepNext/>
-              <w:jc w:val="center"/>
-            </w:pPr>
-            <w:r>
-              <w:rPr>
-                <w:rFonts w:ascii="Calibri" w:hAnsi="Calibri"/>
-                <w:sz w:val="20"/>
-              </w:rPr>
-              <w:t xml:space="default">3,055,504 (81%)</w:t>
-            </w:r>
-          </w:p>
-        </w:tc>
-        <w:tc>
-          <w:tcPr>
-            <w:tcBorders>
-              <w:top w:val="single" w:space="0" w:color="D3D3D3"/>
-              <w:bottom w:val="single" w:space="0" w:color="D3D3D3"/>
-              <w:start w:val="single" w:space="0" w:color="D3D3D3"/>
-              <w:end w:val="single" w:space="0" w:color="D3D3D3"/>
-            </w:tcBorders>
-          </w:tcPr>
-          <w:p>
-            <w:pPr>
-              <w:spacing w:before="0" w:after="60"/>
-              <w:keepNext/>
-              <w:jc w:val="center"/>
-            </w:pPr>
-            <w:r>
-              <w:rPr>
-                <w:rFonts w:ascii="Calibri" w:hAnsi="Calibri"/>
-                <w:sz w:val="20"/>
-              </w:rPr>
-              <w:t xml:space="default">3,390,658 (81%)</w:t>
+                <w:b w:val="true"/>
+              </w:rPr>
+              <w:t xml:space="default">Race</w:t>
             </w:r>
           </w:p>
         </w:tc>
@@ -1192,6 +1145,54 @@
                 <w:sz w:val="20"/>
               </w:rPr>
               <w:t xml:space="default"/>
+            </w:r>
+          </w:p>
+        </w:tc>
+        <w:tc>
+          <w:tcPr>
+            <w:tcBorders>
+              <w:top w:val="single" w:space="0" w:color="D3D3D3"/>
+              <w:bottom w:val="single" w:space="0" w:color="D3D3D3"/>
+              <w:start w:val="single" w:space="0" w:color="D3D3D3"/>
+              <w:end w:val="single" w:space="0" w:color="D3D3D3"/>
+            </w:tcBorders>
+          </w:tcPr>
+          <w:p>
+            <w:pPr>
+              <w:spacing w:before="0" w:after="60"/>
+              <w:keepNext/>
+              <w:jc w:val="center"/>
+            </w:pPr>
+            <w:r>
+              <w:rPr>
+                <w:rFonts w:ascii="Calibri" w:hAnsi="Calibri"/>
+                <w:sz w:val="20"/>
+              </w:rPr>
+              <w:t xml:space="default"/>
+            </w:r>
+          </w:p>
+        </w:tc>
+        <w:tc>
+          <w:tcPr>
+            <w:tcBorders>
+              <w:top w:val="single" w:space="0" w:color="D3D3D3"/>
+              <w:bottom w:val="single" w:space="0" w:color="D3D3D3"/>
+              <w:start w:val="single" w:space="0" w:color="D3D3D3"/>
+              <w:end w:val="single" w:space="0" w:color="D3D3D3"/>
+            </w:tcBorders>
+          </w:tcPr>
+          <w:p>
+            <w:pPr>
+              <w:spacing w:before="0" w:after="60"/>
+              <w:keepNext/>
+              <w:jc w:val="center"/>
+            </w:pPr>
+            <w:r>
+              <w:rPr>
+                <w:rFonts w:ascii="Calibri" w:hAnsi="Calibri"/>
+                <w:sz w:val="20"/>
+              </w:rPr>
+              <w:t xml:space="default">0.058</w:t>
             </w:r>
           </w:p>
         </w:tc>
@@ -1220,55 +1221,55 @@
                 <w:rFonts w:ascii="Calibri" w:hAnsi="Calibri"/>
                 <w:sz w:val="20"/>
               </w:rPr>
-              <w:t xml:space="default">    Black</w:t>
-            </w:r>
-          </w:p>
-        </w:tc>
-        <w:tc>
-          <w:tcPr>
-            <w:tcBorders>
-              <w:top w:val="single" w:space="0" w:color="D3D3D3"/>
-              <w:bottom w:val="single" w:space="0" w:color="D3D3D3"/>
-              <w:start w:val="single" w:space="0" w:color="D3D3D3"/>
-              <w:end w:val="single" w:space="0" w:color="D3D3D3"/>
-            </w:tcBorders>
-          </w:tcPr>
-          <w:p>
-            <w:pPr>
-              <w:spacing w:before="0" w:after="60"/>
-              <w:keepNext/>
-              <w:jc w:val="center"/>
-            </w:pPr>
-            <w:r>
-              <w:rPr>
-                <w:rFonts w:ascii="Calibri" w:hAnsi="Calibri"/>
-                <w:sz w:val="20"/>
-              </w:rPr>
-              <w:t xml:space="default">434,069 (11%)</w:t>
-            </w:r>
-          </w:p>
-        </w:tc>
-        <w:tc>
-          <w:tcPr>
-            <w:tcBorders>
-              <w:top w:val="single" w:space="0" w:color="D3D3D3"/>
-              <w:bottom w:val="single" w:space="0" w:color="D3D3D3"/>
-              <w:start w:val="single" w:space="0" w:color="D3D3D3"/>
-              <w:end w:val="single" w:space="0" w:color="D3D3D3"/>
-            </w:tcBorders>
-          </w:tcPr>
-          <w:p>
-            <w:pPr>
-              <w:spacing w:before="0" w:after="60"/>
-              <w:keepNext/>
-              <w:jc w:val="center"/>
-            </w:pPr>
-            <w:r>
-              <w:rPr>
-                <w:rFonts w:ascii="Calibri" w:hAnsi="Calibri"/>
-                <w:sz w:val="20"/>
-              </w:rPr>
-              <w:t xml:space="default">436,114 (10%)</w:t>
+              <w:t xml:space="default">    White</w:t>
+            </w:r>
+          </w:p>
+        </w:tc>
+        <w:tc>
+          <w:tcPr>
+            <w:tcBorders>
+              <w:top w:val="single" w:space="0" w:color="D3D3D3"/>
+              <w:bottom w:val="single" w:space="0" w:color="D3D3D3"/>
+              <w:start w:val="single" w:space="0" w:color="D3D3D3"/>
+              <w:end w:val="single" w:space="0" w:color="D3D3D3"/>
+            </w:tcBorders>
+          </w:tcPr>
+          <w:p>
+            <w:pPr>
+              <w:spacing w:before="0" w:after="60"/>
+              <w:keepNext/>
+              <w:jc w:val="center"/>
+            </w:pPr>
+            <w:r>
+              <w:rPr>
+                <w:rFonts w:ascii="Calibri" w:hAnsi="Calibri"/>
+                <w:sz w:val="20"/>
+              </w:rPr>
+              <w:t xml:space="default">2,327,977 (83%)</w:t>
+            </w:r>
+          </w:p>
+        </w:tc>
+        <w:tc>
+          <w:tcPr>
+            <w:tcBorders>
+              <w:top w:val="single" w:space="0" w:color="D3D3D3"/>
+              <w:bottom w:val="single" w:space="0" w:color="D3D3D3"/>
+              <w:start w:val="single" w:space="0" w:color="D3D3D3"/>
+              <w:end w:val="single" w:space="0" w:color="D3D3D3"/>
+            </w:tcBorders>
+          </w:tcPr>
+          <w:p>
+            <w:pPr>
+              <w:spacing w:before="0" w:after="60"/>
+              <w:keepNext/>
+              <w:jc w:val="center"/>
+            </w:pPr>
+            <w:r>
+              <w:rPr>
+                <w:rFonts w:ascii="Calibri" w:hAnsi="Calibri"/>
+                <w:sz w:val="20"/>
+              </w:rPr>
+              <w:t xml:space="default">2,818,480 (83%)</w:t>
             </w:r>
           </w:p>
         </w:tc>
@@ -1321,55 +1322,55 @@
                 <w:rFonts w:ascii="Calibri" w:hAnsi="Calibri"/>
                 <w:sz w:val="20"/>
               </w:rPr>
-              <w:t xml:space="default">    Asian</w:t>
-            </w:r>
-          </w:p>
-        </w:tc>
-        <w:tc>
-          <w:tcPr>
-            <w:tcBorders>
-              <w:top w:val="single" w:space="0" w:color="D3D3D3"/>
-              <w:bottom w:val="single" w:space="0" w:color="D3D3D3"/>
-              <w:start w:val="single" w:space="0" w:color="D3D3D3"/>
-              <w:end w:val="single" w:space="0" w:color="D3D3D3"/>
-            </w:tcBorders>
-          </w:tcPr>
-          <w:p>
-            <w:pPr>
-              <w:spacing w:before="0" w:after="60"/>
-              <w:keepNext/>
-              <w:jc w:val="center"/>
-            </w:pPr>
-            <w:r>
-              <w:rPr>
-                <w:rFonts w:ascii="Calibri" w:hAnsi="Calibri"/>
-                <w:sz w:val="20"/>
-              </w:rPr>
-              <w:t xml:space="default">54,212 (1.4%)</w:t>
-            </w:r>
-          </w:p>
-        </w:tc>
-        <w:tc>
-          <w:tcPr>
-            <w:tcBorders>
-              <w:top w:val="single" w:space="0" w:color="D3D3D3"/>
-              <w:bottom w:val="single" w:space="0" w:color="D3D3D3"/>
-              <w:start w:val="single" w:space="0" w:color="D3D3D3"/>
-              <w:end w:val="single" w:space="0" w:color="D3D3D3"/>
-            </w:tcBorders>
-          </w:tcPr>
-          <w:p>
-            <w:pPr>
-              <w:spacing w:before="0" w:after="60"/>
-              <w:keepNext/>
-              <w:jc w:val="center"/>
-            </w:pPr>
-            <w:r>
-              <w:rPr>
-                <w:rFonts w:ascii="Calibri" w:hAnsi="Calibri"/>
-                <w:sz w:val="20"/>
-              </w:rPr>
-              <w:t xml:space="default">44,411 (1.1%)</w:t>
+              <w:t xml:space="default">    Black</w:t>
+            </w:r>
+          </w:p>
+        </w:tc>
+        <w:tc>
+          <w:tcPr>
+            <w:tcBorders>
+              <w:top w:val="single" w:space="0" w:color="D3D3D3"/>
+              <w:bottom w:val="single" w:space="0" w:color="D3D3D3"/>
+              <w:start w:val="single" w:space="0" w:color="D3D3D3"/>
+              <w:end w:val="single" w:space="0" w:color="D3D3D3"/>
+            </w:tcBorders>
+          </w:tcPr>
+          <w:p>
+            <w:pPr>
+              <w:spacing w:before="0" w:after="60"/>
+              <w:keepNext/>
+              <w:jc w:val="center"/>
+            </w:pPr>
+            <w:r>
+              <w:rPr>
+                <w:rFonts w:ascii="Calibri" w:hAnsi="Calibri"/>
+                <w:sz w:val="20"/>
+              </w:rPr>
+              <w:t xml:space="default">318,823 (11%)</w:t>
+            </w:r>
+          </w:p>
+        </w:tc>
+        <w:tc>
+          <w:tcPr>
+            <w:tcBorders>
+              <w:top w:val="single" w:space="0" w:color="D3D3D3"/>
+              <w:bottom w:val="single" w:space="0" w:color="D3D3D3"/>
+              <w:start w:val="single" w:space="0" w:color="D3D3D3"/>
+              <w:end w:val="single" w:space="0" w:color="D3D3D3"/>
+            </w:tcBorders>
+          </w:tcPr>
+          <w:p>
+            <w:pPr>
+              <w:spacing w:before="0" w:after="60"/>
+              <w:keepNext/>
+              <w:jc w:val="center"/>
+            </w:pPr>
+            <w:r>
+              <w:rPr>
+                <w:rFonts w:ascii="Calibri" w:hAnsi="Calibri"/>
+                <w:sz w:val="20"/>
+              </w:rPr>
+              <w:t xml:space="default">270,620 (8.0%)</w:t>
             </w:r>
           </w:p>
         </w:tc>
@@ -1422,55 +1423,55 @@
                 <w:rFonts w:ascii="Calibri" w:hAnsi="Calibri"/>
                 <w:sz w:val="20"/>
               </w:rPr>
-              <w:t xml:space="default">    Other</w:t>
-            </w:r>
-          </w:p>
-        </w:tc>
-        <w:tc>
-          <w:tcPr>
-            <w:tcBorders>
-              <w:top w:val="single" w:space="0" w:color="D3D3D3"/>
-              <w:bottom w:val="single" w:space="0" w:color="D3D3D3"/>
-              <w:start w:val="single" w:space="0" w:color="D3D3D3"/>
-              <w:end w:val="single" w:space="0" w:color="D3D3D3"/>
-            </w:tcBorders>
-          </w:tcPr>
-          <w:p>
-            <w:pPr>
-              <w:spacing w:before="0" w:after="60"/>
-              <w:keepNext/>
-              <w:jc w:val="center"/>
-            </w:pPr>
-            <w:r>
-              <w:rPr>
-                <w:rFonts w:ascii="Calibri" w:hAnsi="Calibri"/>
-                <w:sz w:val="20"/>
-              </w:rPr>
-              <w:t xml:space="default">247,815 (6.5%)</w:t>
-            </w:r>
-          </w:p>
-        </w:tc>
-        <w:tc>
-          <w:tcPr>
-            <w:tcBorders>
-              <w:top w:val="single" w:space="0" w:color="D3D3D3"/>
-              <w:bottom w:val="single" w:space="0" w:color="D3D3D3"/>
-              <w:start w:val="single" w:space="0" w:color="D3D3D3"/>
-              <w:end w:val="single" w:space="0" w:color="D3D3D3"/>
-            </w:tcBorders>
-          </w:tcPr>
-          <w:p>
-            <w:pPr>
-              <w:spacing w:before="0" w:after="60"/>
-              <w:keepNext/>
-              <w:jc w:val="center"/>
-            </w:pPr>
-            <w:r>
-              <w:rPr>
-                <w:rFonts w:ascii="Calibri" w:hAnsi="Calibri"/>
-                <w:sz w:val="20"/>
-              </w:rPr>
-              <w:t xml:space="default">293,369 (7.0%)</w:t>
+              <w:t xml:space="default">    Asian</w:t>
+            </w:r>
+          </w:p>
+        </w:tc>
+        <w:tc>
+          <w:tcPr>
+            <w:tcBorders>
+              <w:top w:val="single" w:space="0" w:color="D3D3D3"/>
+              <w:bottom w:val="single" w:space="0" w:color="D3D3D3"/>
+              <w:start w:val="single" w:space="0" w:color="D3D3D3"/>
+              <w:end w:val="single" w:space="0" w:color="D3D3D3"/>
+            </w:tcBorders>
+          </w:tcPr>
+          <w:p>
+            <w:pPr>
+              <w:spacing w:before="0" w:after="60"/>
+              <w:keepNext/>
+              <w:jc w:val="center"/>
+            </w:pPr>
+            <w:r>
+              <w:rPr>
+                <w:rFonts w:ascii="Calibri" w:hAnsi="Calibri"/>
+                <w:sz w:val="20"/>
+              </w:rPr>
+              <w:t xml:space="default">40,888 (1.5%)</w:t>
+            </w:r>
+          </w:p>
+        </w:tc>
+        <w:tc>
+          <w:tcPr>
+            <w:tcBorders>
+              <w:top w:val="single" w:space="0" w:color="D3D3D3"/>
+              <w:bottom w:val="single" w:space="0" w:color="D3D3D3"/>
+              <w:start w:val="single" w:space="0" w:color="D3D3D3"/>
+              <w:end w:val="single" w:space="0" w:color="D3D3D3"/>
+            </w:tcBorders>
+          </w:tcPr>
+          <w:p>
+            <w:pPr>
+              <w:spacing w:before="0" w:after="60"/>
+              <w:keepNext/>
+              <w:jc w:val="center"/>
+            </w:pPr>
+            <w:r>
+              <w:rPr>
+                <w:rFonts w:ascii="Calibri" w:hAnsi="Calibri"/>
+                <w:sz w:val="20"/>
+              </w:rPr>
+              <w:t xml:space="default">41,552 (1.2%)</w:t>
             </w:r>
           </w:p>
         </w:tc>
@@ -1522,9 +1523,56 @@
               <w:rPr>
                 <w:rFonts w:ascii="Calibri" w:hAnsi="Calibri"/>
                 <w:sz w:val="20"/>
-                <w:b w:val="true"/>
-              </w:rPr>
-              <w:t xml:space="default">Ethnicity</w:t>
+              </w:rPr>
+              <w:t xml:space="default">    Other</w:t>
+            </w:r>
+          </w:p>
+        </w:tc>
+        <w:tc>
+          <w:tcPr>
+            <w:tcBorders>
+              <w:top w:val="single" w:space="0" w:color="D3D3D3"/>
+              <w:bottom w:val="single" w:space="0" w:color="D3D3D3"/>
+              <w:start w:val="single" w:space="0" w:color="D3D3D3"/>
+              <w:end w:val="single" w:space="0" w:color="D3D3D3"/>
+            </w:tcBorders>
+          </w:tcPr>
+          <w:p>
+            <w:pPr>
+              <w:spacing w:before="0" w:after="60"/>
+              <w:keepNext/>
+              <w:jc w:val="center"/>
+            </w:pPr>
+            <w:r>
+              <w:rPr>
+                <w:rFonts w:ascii="Calibri" w:hAnsi="Calibri"/>
+                <w:sz w:val="20"/>
+              </w:rPr>
+              <w:t xml:space="default">130,130 (4.6%)</w:t>
+            </w:r>
+          </w:p>
+        </w:tc>
+        <w:tc>
+          <w:tcPr>
+            <w:tcBorders>
+              <w:top w:val="single" w:space="0" w:color="D3D3D3"/>
+              <w:bottom w:val="single" w:space="0" w:color="D3D3D3"/>
+              <w:start w:val="single" w:space="0" w:color="D3D3D3"/>
+              <w:end w:val="single" w:space="0" w:color="D3D3D3"/>
+            </w:tcBorders>
+          </w:tcPr>
+          <w:p>
+            <w:pPr>
+              <w:spacing w:before="0" w:after="60"/>
+              <w:keepNext/>
+              <w:jc w:val="center"/>
+            </w:pPr>
+            <w:r>
+              <w:rPr>
+                <w:rFonts w:ascii="Calibri" w:hAnsi="Calibri"/>
+                <w:sz w:val="20"/>
+              </w:rPr>
+              <w:t xml:space="default">269,956 (7.9%)</w:t>
             </w:r>
           </w:p>
         </w:tc>
@@ -1549,54 +1597,6 @@
                 <w:sz w:val="20"/>
               </w:rPr>
               <w:t xml:space="default"/>
-            </w:r>
-          </w:p>
-        </w:tc>
-        <w:tc>
-          <w:tcPr>
-            <w:tcBorders>
-              <w:top w:val="single" w:space="0" w:color="D3D3D3"/>
-              <w:bottom w:val="single" w:space="0" w:color="D3D3D3"/>
-              <w:start w:val="single" w:space="0" w:color="D3D3D3"/>
-              <w:end w:val="single" w:space="0" w:color="D3D3D3"/>
-            </w:tcBorders>
-          </w:tcPr>
-          <w:p>
-            <w:pPr>
-              <w:spacing w:before="0" w:after="60"/>
-              <w:keepNext/>
-              <w:jc w:val="center"/>
-            </w:pPr>
-            <w:r>
-              <w:rPr>
-                <w:rFonts w:ascii="Calibri" w:hAnsi="Calibri"/>
-                <w:sz w:val="20"/>
-              </w:rPr>
-              <w:t xml:space="default"/>
-            </w:r>
-          </w:p>
-        </w:tc>
-        <w:tc>
-          <w:tcPr>
-            <w:tcBorders>
-              <w:top w:val="single" w:space="0" w:color="D3D3D3"/>
-              <w:bottom w:val="single" w:space="0" w:color="D3D3D3"/>
-              <w:start w:val="single" w:space="0" w:color="D3D3D3"/>
-              <w:end w:val="single" w:space="0" w:color="D3D3D3"/>
-            </w:tcBorders>
-          </w:tcPr>
-          <w:p>
-            <w:pPr>
-              <w:spacing w:before="0" w:after="60"/>
-              <w:keepNext/>
-              <w:jc w:val="center"/>
-            </w:pPr>
-            <w:r>
-              <w:rPr>
-                <w:rFonts w:ascii="Calibri" w:hAnsi="Calibri"/>
-                <w:sz w:val="20"/>
-              </w:rPr>
-              <w:t xml:space="default">0.13</w:t>
             </w:r>
           </w:p>
         </w:tc>
@@ -1624,56 +1624,9 @@
               <w:rPr>
                 <w:rFonts w:ascii="Calibri" w:hAnsi="Calibri"/>
                 <w:sz w:val="20"/>
-              </w:rPr>
-              <w:t xml:space="default">    Hispanic</w:t>
-            </w:r>
-          </w:p>
-        </w:tc>
-        <w:tc>
-          <w:tcPr>
-            <w:tcBorders>
-              <w:top w:val="single" w:space="0" w:color="D3D3D3"/>
-              <w:bottom w:val="single" w:space="0" w:color="D3D3D3"/>
-              <w:start w:val="single" w:space="0" w:color="D3D3D3"/>
-              <w:end w:val="single" w:space="0" w:color="D3D3D3"/>
-            </w:tcBorders>
-          </w:tcPr>
-          <w:p>
-            <w:pPr>
-              <w:spacing w:before="0" w:after="60"/>
-              <w:keepNext/>
-              <w:jc w:val="center"/>
-            </w:pPr>
-            <w:r>
-              <w:rPr>
-                <w:rFonts w:ascii="Calibri" w:hAnsi="Calibri"/>
-                <w:sz w:val="20"/>
-              </w:rPr>
-              <w:t xml:space="default">731,302 (16%)</w:t>
-            </w:r>
-          </w:p>
-        </w:tc>
-        <w:tc>
-          <w:tcPr>
-            <w:tcBorders>
-              <w:top w:val="single" w:space="0" w:color="D3D3D3"/>
-              <w:bottom w:val="single" w:space="0" w:color="D3D3D3"/>
-              <w:start w:val="single" w:space="0" w:color="D3D3D3"/>
-              <w:end w:val="single" w:space="0" w:color="D3D3D3"/>
-            </w:tcBorders>
-          </w:tcPr>
-          <w:p>
-            <w:pPr>
-              <w:spacing w:before="0" w:after="60"/>
-              <w:keepNext/>
-              <w:jc w:val="center"/>
-            </w:pPr>
-            <w:r>
-              <w:rPr>
-                <w:rFonts w:ascii="Calibri" w:hAnsi="Calibri"/>
-                <w:sz w:val="20"/>
-              </w:rPr>
-              <w:t xml:space="default">711,122 (15%)</w:t>
+                <w:b w:val="true"/>
+              </w:rPr>
+              <w:t xml:space="default">Ethnicity</w:t>
             </w:r>
           </w:p>
         </w:tc>
@@ -1698,6 +1651,54 @@
                 <w:sz w:val="20"/>
               </w:rPr>
               <w:t xml:space="default"/>
+            </w:r>
+          </w:p>
+        </w:tc>
+        <w:tc>
+          <w:tcPr>
+            <w:tcBorders>
+              <w:top w:val="single" w:space="0" w:color="D3D3D3"/>
+              <w:bottom w:val="single" w:space="0" w:color="D3D3D3"/>
+              <w:start w:val="single" w:space="0" w:color="D3D3D3"/>
+              <w:end w:val="single" w:space="0" w:color="D3D3D3"/>
+            </w:tcBorders>
+          </w:tcPr>
+          <w:p>
+            <w:pPr>
+              <w:spacing w:before="0" w:after="60"/>
+              <w:keepNext/>
+              <w:jc w:val="center"/>
+            </w:pPr>
+            <w:r>
+              <w:rPr>
+                <w:rFonts w:ascii="Calibri" w:hAnsi="Calibri"/>
+                <w:sz w:val="20"/>
+              </w:rPr>
+              <w:t xml:space="default"/>
+            </w:r>
+          </w:p>
+        </w:tc>
+        <w:tc>
+          <w:tcPr>
+            <w:tcBorders>
+              <w:top w:val="single" w:space="0" w:color="D3D3D3"/>
+              <w:bottom w:val="single" w:space="0" w:color="D3D3D3"/>
+              <w:start w:val="single" w:space="0" w:color="D3D3D3"/>
+              <w:end w:val="single" w:space="0" w:color="D3D3D3"/>
+            </w:tcBorders>
+          </w:tcPr>
+          <w:p>
+            <w:pPr>
+              <w:spacing w:before="0" w:after="60"/>
+              <w:keepNext/>
+              <w:jc w:val="center"/>
+            </w:pPr>
+            <w:r>
+              <w:rPr>
+                <w:rFonts w:ascii="Calibri" w:hAnsi="Calibri"/>
+                <w:sz w:val="20"/>
+              </w:rPr>
+              <w:t xml:space="default">0.5</w:t>
             </w:r>
           </w:p>
         </w:tc>
@@ -1726,55 +1727,55 @@
                 <w:rFonts w:ascii="Calibri" w:hAnsi="Calibri"/>
                 <w:sz w:val="20"/>
               </w:rPr>
-              <w:t xml:space="default">    Non-Hispanic</w:t>
-            </w:r>
-          </w:p>
-        </w:tc>
-        <w:tc>
-          <w:tcPr>
-            <w:tcBorders>
-              <w:top w:val="single" w:space="0" w:color="D3D3D3"/>
-              <w:bottom w:val="single" w:space="0" w:color="D3D3D3"/>
-              <w:start w:val="single" w:space="0" w:color="D3D3D3"/>
-              <w:end w:val="single" w:space="0" w:color="D3D3D3"/>
-            </w:tcBorders>
-          </w:tcPr>
-          <w:p>
-            <w:pPr>
-              <w:spacing w:before="0" w:after="60"/>
-              <w:keepNext/>
-              <w:jc w:val="center"/>
-            </w:pPr>
-            <w:r>
-              <w:rPr>
-                <w:rFonts w:ascii="Calibri" w:hAnsi="Calibri"/>
-                <w:sz w:val="20"/>
-              </w:rPr>
-              <w:t xml:space="default">3,791,600 (84%)</w:t>
-            </w:r>
-          </w:p>
-        </w:tc>
-        <w:tc>
-          <w:tcPr>
-            <w:tcBorders>
-              <w:top w:val="single" w:space="0" w:color="D3D3D3"/>
-              <w:bottom w:val="single" w:space="0" w:color="D3D3D3"/>
-              <w:start w:val="single" w:space="0" w:color="D3D3D3"/>
-              <w:end w:val="single" w:space="0" w:color="D3D3D3"/>
-            </w:tcBorders>
-          </w:tcPr>
-          <w:p>
-            <w:pPr>
-              <w:spacing w:before="0" w:after="60"/>
-              <w:keepNext/>
-              <w:jc w:val="center"/>
-            </w:pPr>
-            <w:r>
-              <w:rPr>
-                <w:rFonts w:ascii="Calibri" w:hAnsi="Calibri"/>
-                <w:sz w:val="20"/>
-              </w:rPr>
-              <w:t xml:space="default">4,164,552 (85%)</w:t>
+              <w:t xml:space="default">    Hispanic</w:t>
+            </w:r>
+          </w:p>
+        </w:tc>
+        <w:tc>
+          <w:tcPr>
+            <w:tcBorders>
+              <w:top w:val="single" w:space="0" w:color="D3D3D3"/>
+              <w:bottom w:val="single" w:space="0" w:color="D3D3D3"/>
+              <w:start w:val="single" w:space="0" w:color="D3D3D3"/>
+              <w:end w:val="single" w:space="0" w:color="D3D3D3"/>
+            </w:tcBorders>
+          </w:tcPr>
+          <w:p>
+            <w:pPr>
+              <w:spacing w:before="0" w:after="60"/>
+              <w:keepNext/>
+              <w:jc w:val="center"/>
+            </w:pPr>
+            <w:r>
+              <w:rPr>
+                <w:rFonts w:ascii="Calibri" w:hAnsi="Calibri"/>
+                <w:sz w:val="20"/>
+              </w:rPr>
+              <w:t xml:space="default">476,871 (14%)</w:t>
+            </w:r>
+          </w:p>
+        </w:tc>
+        <w:tc>
+          <w:tcPr>
+            <w:tcBorders>
+              <w:top w:val="single" w:space="0" w:color="D3D3D3"/>
+              <w:bottom w:val="single" w:space="0" w:color="D3D3D3"/>
+              <w:start w:val="single" w:space="0" w:color="D3D3D3"/>
+              <w:end w:val="single" w:space="0" w:color="D3D3D3"/>
+            </w:tcBorders>
+          </w:tcPr>
+          <w:p>
+            <w:pPr>
+              <w:spacing w:before="0" w:after="60"/>
+              <w:keepNext/>
+              <w:jc w:val="center"/>
+            </w:pPr>
+            <w:r>
+              <w:rPr>
+                <w:rFonts w:ascii="Calibri" w:hAnsi="Calibri"/>
+                <w:sz w:val="20"/>
+              </w:rPr>
+              <w:t xml:space="default">494,808 (13%)</w:t>
             </w:r>
           </w:p>
         </w:tc>
@@ -1826,9 +1827,56 @@
               <w:rPr>
                 <w:rFonts w:ascii="Calibri" w:hAnsi="Calibri"/>
                 <w:sz w:val="20"/>
-                <w:b w:val="true"/>
-              </w:rPr>
-              <w:t xml:space="default">Education</w:t>
+              </w:rPr>
+              <w:t xml:space="default">    Non-Hispanic</w:t>
+            </w:r>
+          </w:p>
+        </w:tc>
+        <w:tc>
+          <w:tcPr>
+            <w:tcBorders>
+              <w:top w:val="single" w:space="0" w:color="D3D3D3"/>
+              <w:bottom w:val="single" w:space="0" w:color="D3D3D3"/>
+              <w:start w:val="single" w:space="0" w:color="D3D3D3"/>
+              <w:end w:val="single" w:space="0" w:color="D3D3D3"/>
+            </w:tcBorders>
+          </w:tcPr>
+          <w:p>
+            <w:pPr>
+              <w:spacing w:before="0" w:after="60"/>
+              <w:keepNext/>
+              <w:jc w:val="center"/>
+            </w:pPr>
+            <w:r>
+              <w:rPr>
+                <w:rFonts w:ascii="Calibri" w:hAnsi="Calibri"/>
+                <w:sz w:val="20"/>
+              </w:rPr>
+              <w:t xml:space="default">2,817,818 (86%)</w:t>
+            </w:r>
+          </w:p>
+        </w:tc>
+        <w:tc>
+          <w:tcPr>
+            <w:tcBorders>
+              <w:top w:val="single" w:space="0" w:color="D3D3D3"/>
+              <w:bottom w:val="single" w:space="0" w:color="D3D3D3"/>
+              <w:start w:val="single" w:space="0" w:color="D3D3D3"/>
+              <w:end w:val="single" w:space="0" w:color="D3D3D3"/>
+            </w:tcBorders>
+          </w:tcPr>
+          <w:p>
+            <w:pPr>
+              <w:spacing w:before="0" w:after="60"/>
+              <w:keepNext/>
+              <w:jc w:val="center"/>
+            </w:pPr>
+            <w:r>
+              <w:rPr>
+                <w:rFonts w:ascii="Calibri" w:hAnsi="Calibri"/>
+                <w:sz w:val="20"/>
+              </w:rPr>
+              <w:t xml:space="default">3,400,609 (87%)</w:t>
             </w:r>
           </w:p>
         </w:tc>
@@ -1853,54 +1901,6 @@
                 <w:sz w:val="20"/>
               </w:rPr>
               <w:t xml:space="default"/>
-            </w:r>
-          </w:p>
-        </w:tc>
-        <w:tc>
-          <w:tcPr>
-            <w:tcBorders>
-              <w:top w:val="single" w:space="0" w:color="D3D3D3"/>
-              <w:bottom w:val="single" w:space="0" w:color="D3D3D3"/>
-              <w:start w:val="single" w:space="0" w:color="D3D3D3"/>
-              <w:end w:val="single" w:space="0" w:color="D3D3D3"/>
-            </w:tcBorders>
-          </w:tcPr>
-          <w:p>
-            <w:pPr>
-              <w:spacing w:before="0" w:after="60"/>
-              <w:keepNext/>
-              <w:jc w:val="center"/>
-            </w:pPr>
-            <w:r>
-              <w:rPr>
-                <w:rFonts w:ascii="Calibri" w:hAnsi="Calibri"/>
-                <w:sz w:val="20"/>
-              </w:rPr>
-              <w:t xml:space="default"/>
-            </w:r>
-          </w:p>
-        </w:tc>
-        <w:tc>
-          <w:tcPr>
-            <w:tcBorders>
-              <w:top w:val="single" w:space="0" w:color="D3D3D3"/>
-              <w:bottom w:val="single" w:space="0" w:color="D3D3D3"/>
-              <w:start w:val="single" w:space="0" w:color="D3D3D3"/>
-              <w:end w:val="single" w:space="0" w:color="D3D3D3"/>
-            </w:tcBorders>
-          </w:tcPr>
-          <w:p>
-            <w:pPr>
-              <w:spacing w:before="0" w:after="60"/>
-              <w:keepNext/>
-              <w:jc w:val="center"/>
-            </w:pPr>
-            <w:r>
-              <w:rPr>
-                <w:rFonts w:ascii="Calibri" w:hAnsi="Calibri"/>
-                <w:sz w:val="20"/>
-              </w:rPr>
-              <w:t xml:space="default">0.5</w:t>
             </w:r>
           </w:p>
         </w:tc>
@@ -1928,56 +1928,9 @@
               <w:rPr>
                 <w:rFonts w:ascii="Calibri" w:hAnsi="Calibri"/>
                 <w:sz w:val="20"/>
-              </w:rPr>
-              <w:t xml:space="default">    College education or greater</w:t>
-            </w:r>
-          </w:p>
-        </w:tc>
-        <w:tc>
-          <w:tcPr>
-            <w:tcBorders>
-              <w:top w:val="single" w:space="0" w:color="D3D3D3"/>
-              <w:bottom w:val="single" w:space="0" w:color="D3D3D3"/>
-              <w:start w:val="single" w:space="0" w:color="D3D3D3"/>
-              <w:end w:val="single" w:space="0" w:color="D3D3D3"/>
-            </w:tcBorders>
-          </w:tcPr>
-          <w:p>
-            <w:pPr>
-              <w:spacing w:before="0" w:after="60"/>
-              <w:keepNext/>
-              <w:jc w:val="center"/>
-            </w:pPr>
-            <w:r>
-              <w:rPr>
-                <w:rFonts w:ascii="Calibri" w:hAnsi="Calibri"/>
-                <w:sz w:val="20"/>
-              </w:rPr>
-              <w:t xml:space="default">1,774,007 (74%)</w:t>
-            </w:r>
-          </w:p>
-        </w:tc>
-        <w:tc>
-          <w:tcPr>
-            <w:tcBorders>
-              <w:top w:val="single" w:space="0" w:color="D3D3D3"/>
-              <w:bottom w:val="single" w:space="0" w:color="D3D3D3"/>
-              <w:start w:val="single" w:space="0" w:color="D3D3D3"/>
-              <w:end w:val="single" w:space="0" w:color="D3D3D3"/>
-            </w:tcBorders>
-          </w:tcPr>
-          <w:p>
-            <w:pPr>
-              <w:spacing w:before="0" w:after="60"/>
-              <w:keepNext/>
-              <w:jc w:val="center"/>
-            </w:pPr>
-            <w:r>
-              <w:rPr>
-                <w:rFonts w:ascii="Calibri" w:hAnsi="Calibri"/>
-                <w:sz w:val="20"/>
-              </w:rPr>
-              <w:t xml:space="default">1,863,884 (72%)</w:t>
+                <w:b w:val="true"/>
+              </w:rPr>
+              <w:t xml:space="default">Education</w:t>
             </w:r>
           </w:p>
         </w:tc>
@@ -2002,6 +1955,54 @@
                 <w:sz w:val="20"/>
               </w:rPr>
               <w:t xml:space="default"/>
+            </w:r>
+          </w:p>
+        </w:tc>
+        <w:tc>
+          <w:tcPr>
+            <w:tcBorders>
+              <w:top w:val="single" w:space="0" w:color="D3D3D3"/>
+              <w:bottom w:val="single" w:space="0" w:color="D3D3D3"/>
+              <w:start w:val="single" w:space="0" w:color="D3D3D3"/>
+              <w:end w:val="single" w:space="0" w:color="D3D3D3"/>
+            </w:tcBorders>
+          </w:tcPr>
+          <w:p>
+            <w:pPr>
+              <w:spacing w:before="0" w:after="60"/>
+              <w:keepNext/>
+              <w:jc w:val="center"/>
+            </w:pPr>
+            <w:r>
+              <w:rPr>
+                <w:rFonts w:ascii="Calibri" w:hAnsi="Calibri"/>
+                <w:sz w:val="20"/>
+              </w:rPr>
+              <w:t xml:space="default"/>
+            </w:r>
+          </w:p>
+        </w:tc>
+        <w:tc>
+          <w:tcPr>
+            <w:tcBorders>
+              <w:top w:val="single" w:space="0" w:color="D3D3D3"/>
+              <w:bottom w:val="single" w:space="0" w:color="D3D3D3"/>
+              <w:start w:val="single" w:space="0" w:color="D3D3D3"/>
+              <w:end w:val="single" w:space="0" w:color="D3D3D3"/>
+            </w:tcBorders>
+          </w:tcPr>
+          <w:p>
+            <w:pPr>
+              <w:spacing w:before="0" w:after="60"/>
+              <w:keepNext/>
+              <w:jc w:val="center"/>
+            </w:pPr>
+            <w:r>
+              <w:rPr>
+                <w:rFonts w:ascii="Calibri" w:hAnsi="Calibri"/>
+                <w:sz w:val="20"/>
+              </w:rPr>
+              <w:t xml:space="default">0.4</w:t>
             </w:r>
           </w:p>
         </w:tc>
@@ -2030,55 +2031,55 @@
                 <w:rFonts w:ascii="Calibri" w:hAnsi="Calibri"/>
                 <w:sz w:val="20"/>
               </w:rPr>
-              <w:t xml:space="default">    High school graduation or less</w:t>
-            </w:r>
-          </w:p>
-        </w:tc>
-        <w:tc>
-          <w:tcPr>
-            <w:tcBorders>
-              <w:top w:val="single" w:space="0" w:color="D3D3D3"/>
-              <w:bottom w:val="single" w:space="0" w:color="D3D3D3"/>
-              <w:start w:val="single" w:space="0" w:color="D3D3D3"/>
-              <w:end w:val="single" w:space="0" w:color="D3D3D3"/>
-            </w:tcBorders>
-          </w:tcPr>
-          <w:p>
-            <w:pPr>
-              <w:spacing w:before="0" w:after="60"/>
-              <w:keepNext/>
-              <w:jc w:val="center"/>
-            </w:pPr>
-            <w:r>
-              <w:rPr>
-                <w:rFonts w:ascii="Calibri" w:hAnsi="Calibri"/>
-                <w:sz w:val="20"/>
-              </w:rPr>
-              <w:t xml:space="default">638,763 (26%)</w:t>
-            </w:r>
-          </w:p>
-        </w:tc>
-        <w:tc>
-          <w:tcPr>
-            <w:tcBorders>
-              <w:top w:val="single" w:space="0" w:color="D3D3D3"/>
-              <w:bottom w:val="single" w:space="0" w:color="D3D3D3"/>
-              <w:start w:val="single" w:space="0" w:color="D3D3D3"/>
-              <w:end w:val="single" w:space="0" w:color="D3D3D3"/>
-            </w:tcBorders>
-          </w:tcPr>
-          <w:p>
-            <w:pPr>
-              <w:spacing w:before="0" w:after="60"/>
-              <w:keepNext/>
-              <w:jc w:val="center"/>
-            </w:pPr>
-            <w:r>
-              <w:rPr>
-                <w:rFonts w:ascii="Calibri" w:hAnsi="Calibri"/>
-                <w:sz w:val="20"/>
-              </w:rPr>
-              <w:t xml:space="default">715,513 (28%)</w:t>
+              <w:t xml:space="default">    College education or greater</w:t>
+            </w:r>
+          </w:p>
+        </w:tc>
+        <w:tc>
+          <w:tcPr>
+            <w:tcBorders>
+              <w:top w:val="single" w:space="0" w:color="D3D3D3"/>
+              <w:bottom w:val="single" w:space="0" w:color="D3D3D3"/>
+              <w:start w:val="single" w:space="0" w:color="D3D3D3"/>
+              <w:end w:val="single" w:space="0" w:color="D3D3D3"/>
+            </w:tcBorders>
+          </w:tcPr>
+          <w:p>
+            <w:pPr>
+              <w:spacing w:before="0" w:after="60"/>
+              <w:keepNext/>
+              <w:jc w:val="center"/>
+            </w:pPr>
+            <w:r>
+              <w:rPr>
+                <w:rFonts w:ascii="Calibri" w:hAnsi="Calibri"/>
+                <w:sz w:val="20"/>
+              </w:rPr>
+              <w:t xml:space="default">1,223,092 (72%)</w:t>
+            </w:r>
+          </w:p>
+        </w:tc>
+        <w:tc>
+          <w:tcPr>
+            <w:tcBorders>
+              <w:top w:val="single" w:space="0" w:color="D3D3D3"/>
+              <w:bottom w:val="single" w:space="0" w:color="D3D3D3"/>
+              <w:start w:val="single" w:space="0" w:color="D3D3D3"/>
+              <w:end w:val="single" w:space="0" w:color="D3D3D3"/>
+            </w:tcBorders>
+          </w:tcPr>
+          <w:p>
+            <w:pPr>
+              <w:spacing w:before="0" w:after="60"/>
+              <w:keepNext/>
+              <w:jc w:val="center"/>
+            </w:pPr>
+            <w:r>
+              <w:rPr>
+                <w:rFonts w:ascii="Calibri" w:hAnsi="Calibri"/>
+                <w:sz w:val="20"/>
+              </w:rPr>
+              <w:t xml:space="default">1,585,392 (76%)</w:t>
             </w:r>
           </w:p>
         </w:tc>
@@ -2130,9 +2131,56 @@
               <w:rPr>
                 <w:rFonts w:ascii="Calibri" w:hAnsi="Calibri"/>
                 <w:sz w:val="20"/>
-                <w:b w:val="true"/>
-              </w:rPr>
-              <w:t xml:space="default">Has insurance</w:t>
+              </w:rPr>
+              <w:t xml:space="default">    High school graduation or less</w:t>
+            </w:r>
+          </w:p>
+        </w:tc>
+        <w:tc>
+          <w:tcPr>
+            <w:tcBorders>
+              <w:top w:val="single" w:space="0" w:color="D3D3D3"/>
+              <w:bottom w:val="single" w:space="0" w:color="D3D3D3"/>
+              <w:start w:val="single" w:space="0" w:color="D3D3D3"/>
+              <w:end w:val="single" w:space="0" w:color="D3D3D3"/>
+            </w:tcBorders>
+          </w:tcPr>
+          <w:p>
+            <w:pPr>
+              <w:spacing w:before="0" w:after="60"/>
+              <w:keepNext/>
+              <w:jc w:val="center"/>
+            </w:pPr>
+            <w:r>
+              <w:rPr>
+                <w:rFonts w:ascii="Calibri" w:hAnsi="Calibri"/>
+                <w:sz w:val="20"/>
+              </w:rPr>
+              <w:t xml:space="default">468,700 (28%)</w:t>
+            </w:r>
+          </w:p>
+        </w:tc>
+        <w:tc>
+          <w:tcPr>
+            <w:tcBorders>
+              <w:top w:val="single" w:space="0" w:color="D3D3D3"/>
+              <w:bottom w:val="single" w:space="0" w:color="D3D3D3"/>
+              <w:start w:val="single" w:space="0" w:color="D3D3D3"/>
+              <w:end w:val="single" w:space="0" w:color="D3D3D3"/>
+            </w:tcBorders>
+          </w:tcPr>
+          <w:p>
+            <w:pPr>
+              <w:spacing w:before="0" w:after="60"/>
+              <w:keepNext/>
+              <w:jc w:val="center"/>
+            </w:pPr>
+            <w:r>
+              <w:rPr>
+                <w:rFonts w:ascii="Calibri" w:hAnsi="Calibri"/>
+                <w:sz w:val="20"/>
+              </w:rPr>
+              <w:t xml:space="default">501,185 (24%)</w:t>
             </w:r>
           </w:p>
         </w:tc>
@@ -2157,54 +2205,6 @@
                 <w:sz w:val="20"/>
               </w:rPr>
               <w:t xml:space="default"/>
-            </w:r>
-          </w:p>
-        </w:tc>
-        <w:tc>
-          <w:tcPr>
-            <w:tcBorders>
-              <w:top w:val="single" w:space="0" w:color="D3D3D3"/>
-              <w:bottom w:val="single" w:space="0" w:color="D3D3D3"/>
-              <w:start w:val="single" w:space="0" w:color="D3D3D3"/>
-              <w:end w:val="single" w:space="0" w:color="D3D3D3"/>
-            </w:tcBorders>
-          </w:tcPr>
-          <w:p>
-            <w:pPr>
-              <w:spacing w:before="0" w:after="60"/>
-              <w:keepNext/>
-              <w:jc w:val="center"/>
-            </w:pPr>
-            <w:r>
-              <w:rPr>
-                <w:rFonts w:ascii="Calibri" w:hAnsi="Calibri"/>
-                <w:sz w:val="20"/>
-              </w:rPr>
-              <w:t xml:space="default"/>
-            </w:r>
-          </w:p>
-        </w:tc>
-        <w:tc>
-          <w:tcPr>
-            <w:tcBorders>
-              <w:top w:val="single" w:space="0" w:color="D3D3D3"/>
-              <w:bottom w:val="single" w:space="0" w:color="D3D3D3"/>
-              <w:start w:val="single" w:space="0" w:color="D3D3D3"/>
-              <w:end w:val="single" w:space="0" w:color="D3D3D3"/>
-            </w:tcBorders>
-          </w:tcPr>
-          <w:p>
-            <w:pPr>
-              <w:spacing w:before="0" w:after="60"/>
-              <w:keepNext/>
-              <w:jc w:val="center"/>
-            </w:pPr>
-            <w:r>
-              <w:rPr>
-                <w:rFonts w:ascii="Calibri" w:hAnsi="Calibri"/>
-                <w:sz w:val="20"/>
-              </w:rPr>
-              <w:t xml:space="default">0.8</w:t>
             </w:r>
           </w:p>
         </w:tc>
@@ -2232,56 +2232,9 @@
               <w:rPr>
                 <w:rFonts w:ascii="Calibri" w:hAnsi="Calibri"/>
                 <w:sz w:val="20"/>
-              </w:rPr>
-              <w:t xml:space="default">    Has insurance</w:t>
-            </w:r>
-          </w:p>
-        </w:tc>
-        <w:tc>
-          <w:tcPr>
-            <w:tcBorders>
-              <w:top w:val="single" w:space="0" w:color="D3D3D3"/>
-              <w:bottom w:val="single" w:space="0" w:color="D3D3D3"/>
-              <w:start w:val="single" w:space="0" w:color="D3D3D3"/>
-              <w:end w:val="single" w:space="0" w:color="D3D3D3"/>
-            </w:tcBorders>
-          </w:tcPr>
-          <w:p>
-            <w:pPr>
-              <w:spacing w:before="0" w:after="60"/>
-              <w:keepNext/>
-              <w:jc w:val="center"/>
-            </w:pPr>
-            <w:r>
-              <w:rPr>
-                <w:rFonts w:ascii="Calibri" w:hAnsi="Calibri"/>
-                <w:sz w:val="20"/>
-              </w:rPr>
-              <w:t xml:space="default">4,362,100 (96%)</w:t>
-            </w:r>
-          </w:p>
-        </w:tc>
-        <w:tc>
-          <w:tcPr>
-            <w:tcBorders>
-              <w:top w:val="single" w:space="0" w:color="D3D3D3"/>
-              <w:bottom w:val="single" w:space="0" w:color="D3D3D3"/>
-              <w:start w:val="single" w:space="0" w:color="D3D3D3"/>
-              <w:end w:val="single" w:space="0" w:color="D3D3D3"/>
-            </w:tcBorders>
-          </w:tcPr>
-          <w:p>
-            <w:pPr>
-              <w:spacing w:before="0" w:after="60"/>
-              <w:keepNext/>
-              <w:jc w:val="center"/>
-            </w:pPr>
-            <w:r>
-              <w:rPr>
-                <w:rFonts w:ascii="Calibri" w:hAnsi="Calibri"/>
-                <w:sz w:val="20"/>
-              </w:rPr>
-              <w:t xml:space="default">4,728,678 (97%)</w:t>
+                <w:b w:val="true"/>
+              </w:rPr>
+              <w:t xml:space="default">Has insurance</w:t>
             </w:r>
           </w:p>
         </w:tc>
@@ -2306,6 +2259,54 @@
                 <w:sz w:val="20"/>
               </w:rPr>
               <w:t xml:space="default"/>
+            </w:r>
+          </w:p>
+        </w:tc>
+        <w:tc>
+          <w:tcPr>
+            <w:tcBorders>
+              <w:top w:val="single" w:space="0" w:color="D3D3D3"/>
+              <w:bottom w:val="single" w:space="0" w:color="D3D3D3"/>
+              <w:start w:val="single" w:space="0" w:color="D3D3D3"/>
+              <w:end w:val="single" w:space="0" w:color="D3D3D3"/>
+            </w:tcBorders>
+          </w:tcPr>
+          <w:p>
+            <w:pPr>
+              <w:spacing w:before="0" w:after="60"/>
+              <w:keepNext/>
+              <w:jc w:val="center"/>
+            </w:pPr>
+            <w:r>
+              <w:rPr>
+                <w:rFonts w:ascii="Calibri" w:hAnsi="Calibri"/>
+                <w:sz w:val="20"/>
+              </w:rPr>
+              <w:t xml:space="default"/>
+            </w:r>
+          </w:p>
+        </w:tc>
+        <w:tc>
+          <w:tcPr>
+            <w:tcBorders>
+              <w:top w:val="single" w:space="0" w:color="D3D3D3"/>
+              <w:bottom w:val="single" w:space="0" w:color="D3D3D3"/>
+              <w:start w:val="single" w:space="0" w:color="D3D3D3"/>
+              <w:end w:val="single" w:space="0" w:color="D3D3D3"/>
+            </w:tcBorders>
+          </w:tcPr>
+          <w:p>
+            <w:pPr>
+              <w:spacing w:before="0" w:after="60"/>
+              <w:keepNext/>
+              <w:jc w:val="center"/>
+            </w:pPr>
+            <w:r>
+              <w:rPr>
+                <w:rFonts w:ascii="Calibri" w:hAnsi="Calibri"/>
+                <w:sz w:val="20"/>
+              </w:rPr>
+              <w:t xml:space="default">&gt;0.9</w:t>
             </w:r>
           </w:p>
         </w:tc>
@@ -2334,55 +2335,55 @@
                 <w:rFonts w:ascii="Calibri" w:hAnsi="Calibri"/>
                 <w:sz w:val="20"/>
               </w:rPr>
-              <w:t xml:space="default">    No insurance</w:t>
-            </w:r>
-          </w:p>
-        </w:tc>
-        <w:tc>
-          <w:tcPr>
-            <w:tcBorders>
-              <w:top w:val="single" w:space="0" w:color="D3D3D3"/>
-              <w:bottom w:val="single" w:space="0" w:color="D3D3D3"/>
-              <w:start w:val="single" w:space="0" w:color="D3D3D3"/>
-              <w:end w:val="single" w:space="0" w:color="D3D3D3"/>
-            </w:tcBorders>
-          </w:tcPr>
-          <w:p>
-            <w:pPr>
-              <w:spacing w:before="0" w:after="60"/>
-              <w:keepNext/>
-              <w:jc w:val="center"/>
-            </w:pPr>
-            <w:r>
-              <w:rPr>
-                <w:rFonts w:ascii="Calibri" w:hAnsi="Calibri"/>
-                <w:sz w:val="20"/>
-              </w:rPr>
-              <w:t xml:space="default">160,802 (3.6%)</w:t>
-            </w:r>
-          </w:p>
-        </w:tc>
-        <w:tc>
-          <w:tcPr>
-            <w:tcBorders>
-              <w:top w:val="single" w:space="0" w:color="D3D3D3"/>
-              <w:bottom w:val="single" w:space="0" w:color="D3D3D3"/>
-              <w:start w:val="single" w:space="0" w:color="D3D3D3"/>
-              <w:end w:val="single" w:space="0" w:color="D3D3D3"/>
-            </w:tcBorders>
-          </w:tcPr>
-          <w:p>
-            <w:pPr>
-              <w:spacing w:before="0" w:after="60"/>
-              <w:keepNext/>
-              <w:jc w:val="center"/>
-            </w:pPr>
-            <w:r>
-              <w:rPr>
-                <w:rFonts w:ascii="Calibri" w:hAnsi="Calibri"/>
-                <w:sz w:val="20"/>
-              </w:rPr>
-              <w:t xml:space="default">146,995 (3.0%)</w:t>
+              <w:t xml:space="default">    Has insurance</w:t>
+            </w:r>
+          </w:p>
+        </w:tc>
+        <w:tc>
+          <w:tcPr>
+            <w:tcBorders>
+              <w:top w:val="single" w:space="0" w:color="D3D3D3"/>
+              <w:bottom w:val="single" w:space="0" w:color="D3D3D3"/>
+              <w:start w:val="single" w:space="0" w:color="D3D3D3"/>
+              <w:end w:val="single" w:space="0" w:color="D3D3D3"/>
+            </w:tcBorders>
+          </w:tcPr>
+          <w:p>
+            <w:pPr>
+              <w:spacing w:before="0" w:after="60"/>
+              <w:keepNext/>
+              <w:jc w:val="center"/>
+            </w:pPr>
+            <w:r>
+              <w:rPr>
+                <w:rFonts w:ascii="Calibri" w:hAnsi="Calibri"/>
+                <w:sz w:val="20"/>
+              </w:rPr>
+              <w:t xml:space="default">3,203,581 (97%)</w:t>
+            </w:r>
+          </w:p>
+        </w:tc>
+        <w:tc>
+          <w:tcPr>
+            <w:tcBorders>
+              <w:top w:val="single" w:space="0" w:color="D3D3D3"/>
+              <w:bottom w:val="single" w:space="0" w:color="D3D3D3"/>
+              <w:start w:val="single" w:space="0" w:color="D3D3D3"/>
+              <w:end w:val="single" w:space="0" w:color="D3D3D3"/>
+            </w:tcBorders>
+          </w:tcPr>
+          <w:p>
+            <w:pPr>
+              <w:spacing w:before="0" w:after="60"/>
+              <w:keepNext/>
+              <w:jc w:val="center"/>
+            </w:pPr>
+            <w:r>
+              <w:rPr>
+                <w:rFonts w:ascii="Calibri" w:hAnsi="Calibri"/>
+                <w:sz w:val="20"/>
+              </w:rPr>
+              <w:t xml:space="default">3,783,553 (97%)</w:t>
             </w:r>
           </w:p>
         </w:tc>
@@ -2434,9 +2435,56 @@
               <w:rPr>
                 <w:rFonts w:ascii="Calibri" w:hAnsi="Calibri"/>
                 <w:sz w:val="20"/>
-                <w:b w:val="true"/>
-              </w:rPr>
-              <w:t xml:space="default">Type of insurance</w:t>
+              </w:rPr>
+              <w:t xml:space="default">    No insurance</w:t>
+            </w:r>
+          </w:p>
+        </w:tc>
+        <w:tc>
+          <w:tcPr>
+            <w:tcBorders>
+              <w:top w:val="single" w:space="0" w:color="D3D3D3"/>
+              <w:bottom w:val="single" w:space="0" w:color="D3D3D3"/>
+              <w:start w:val="single" w:space="0" w:color="D3D3D3"/>
+              <w:end w:val="single" w:space="0" w:color="D3D3D3"/>
+            </w:tcBorders>
+          </w:tcPr>
+          <w:p>
+            <w:pPr>
+              <w:spacing w:before="0" w:after="60"/>
+              <w:keepNext/>
+              <w:jc w:val="center"/>
+            </w:pPr>
+            <w:r>
+              <w:rPr>
+                <w:rFonts w:ascii="Calibri" w:hAnsi="Calibri"/>
+                <w:sz w:val="20"/>
+              </w:rPr>
+              <w:t xml:space="default">91,109 (2.8%)</w:t>
+            </w:r>
+          </w:p>
+        </w:tc>
+        <w:tc>
+          <w:tcPr>
+            <w:tcBorders>
+              <w:top w:val="single" w:space="0" w:color="D3D3D3"/>
+              <w:bottom w:val="single" w:space="0" w:color="D3D3D3"/>
+              <w:start w:val="single" w:space="0" w:color="D3D3D3"/>
+              <w:end w:val="single" w:space="0" w:color="D3D3D3"/>
+            </w:tcBorders>
+          </w:tcPr>
+          <w:p>
+            <w:pPr>
+              <w:spacing w:before="0" w:after="60"/>
+              <w:keepNext/>
+              <w:jc w:val="center"/>
+            </w:pPr>
+            <w:r>
+              <w:rPr>
+                <w:rFonts w:ascii="Calibri" w:hAnsi="Calibri"/>
+                <w:sz w:val="20"/>
+              </w:rPr>
+              <w:t xml:space="default">111,863 (2.9%)</w:t>
             </w:r>
           </w:p>
         </w:tc>
@@ -2461,54 +2509,6 @@
                 <w:sz w:val="20"/>
               </w:rPr>
               <w:t xml:space="default"/>
-            </w:r>
-          </w:p>
-        </w:tc>
-        <w:tc>
-          <w:tcPr>
-            <w:tcBorders>
-              <w:top w:val="single" w:space="0" w:color="D3D3D3"/>
-              <w:bottom w:val="single" w:space="0" w:color="D3D3D3"/>
-              <w:start w:val="single" w:space="0" w:color="D3D3D3"/>
-              <w:end w:val="single" w:space="0" w:color="D3D3D3"/>
-            </w:tcBorders>
-          </w:tcPr>
-          <w:p>
-            <w:pPr>
-              <w:spacing w:before="0" w:after="60"/>
-              <w:keepNext/>
-              <w:jc w:val="center"/>
-            </w:pPr>
-            <w:r>
-              <w:rPr>
-                <w:rFonts w:ascii="Calibri" w:hAnsi="Calibri"/>
-                <w:sz w:val="20"/>
-              </w:rPr>
-              <w:t xml:space="default"/>
-            </w:r>
-          </w:p>
-        </w:tc>
-        <w:tc>
-          <w:tcPr>
-            <w:tcBorders>
-              <w:top w:val="single" w:space="0" w:color="D3D3D3"/>
-              <w:bottom w:val="single" w:space="0" w:color="D3D3D3"/>
-              <w:start w:val="single" w:space="0" w:color="D3D3D3"/>
-              <w:end w:val="single" w:space="0" w:color="D3D3D3"/>
-            </w:tcBorders>
-          </w:tcPr>
-          <w:p>
-            <w:pPr>
-              <w:spacing w:before="0" w:after="60"/>
-              <w:keepNext/>
-              <w:jc w:val="center"/>
-            </w:pPr>
-            <w:r>
-              <w:rPr>
-                <w:rFonts w:ascii="Calibri" w:hAnsi="Calibri"/>
-                <w:sz w:val="20"/>
-              </w:rPr>
-              <w:t xml:space="default">0.9</w:t>
             </w:r>
           </w:p>
         </w:tc>
@@ -2536,56 +2536,9 @@
               <w:rPr>
                 <w:rFonts w:ascii="Calibri" w:hAnsi="Calibri"/>
                 <w:sz w:val="20"/>
-              </w:rPr>
-              <w:t xml:space="default">    Medicaid only</w:t>
-            </w:r>
-          </w:p>
-        </w:tc>
-        <w:tc>
-          <w:tcPr>
-            <w:tcBorders>
-              <w:top w:val="single" w:space="0" w:color="D3D3D3"/>
-              <w:bottom w:val="single" w:space="0" w:color="D3D3D3"/>
-              <w:start w:val="single" w:space="0" w:color="D3D3D3"/>
-              <w:end w:val="single" w:space="0" w:color="D3D3D3"/>
-            </w:tcBorders>
-          </w:tcPr>
-          <w:p>
-            <w:pPr>
-              <w:spacing w:before="0" w:after="60"/>
-              <w:keepNext/>
-              <w:jc w:val="center"/>
-            </w:pPr>
-            <w:r>
-              <w:rPr>
-                <w:rFonts w:ascii="Calibri" w:hAnsi="Calibri"/>
-                <w:sz w:val="20"/>
-              </w:rPr>
-              <w:t xml:space="default">1,532,391 (34%)</w:t>
-            </w:r>
-          </w:p>
-        </w:tc>
-        <w:tc>
-          <w:tcPr>
-            <w:tcBorders>
-              <w:top w:val="single" w:space="0" w:color="D3D3D3"/>
-              <w:bottom w:val="single" w:space="0" w:color="D3D3D3"/>
-              <w:start w:val="single" w:space="0" w:color="D3D3D3"/>
-              <w:end w:val="single" w:space="0" w:color="D3D3D3"/>
-            </w:tcBorders>
-          </w:tcPr>
-          <w:p>
-            <w:pPr>
-              <w:spacing w:before="0" w:after="60"/>
-              <w:keepNext/>
-              <w:jc w:val="center"/>
-            </w:pPr>
-            <w:r>
-              <w:rPr>
-                <w:rFonts w:ascii="Calibri" w:hAnsi="Calibri"/>
-                <w:sz w:val="20"/>
-              </w:rPr>
-              <w:t xml:space="default">1,542,853 (32%)</w:t>
+                <w:b w:val="true"/>
+              </w:rPr>
+              <w:t xml:space="default">Type of insurance</w:t>
             </w:r>
           </w:p>
         </w:tc>
@@ -2610,6 +2563,54 @@
                 <w:sz w:val="20"/>
               </w:rPr>
               <w:t xml:space="default"/>
+            </w:r>
+          </w:p>
+        </w:tc>
+        <w:tc>
+          <w:tcPr>
+            <w:tcBorders>
+              <w:top w:val="single" w:space="0" w:color="D3D3D3"/>
+              <w:bottom w:val="single" w:space="0" w:color="D3D3D3"/>
+              <w:start w:val="single" w:space="0" w:color="D3D3D3"/>
+              <w:end w:val="single" w:space="0" w:color="D3D3D3"/>
+            </w:tcBorders>
+          </w:tcPr>
+          <w:p>
+            <w:pPr>
+              <w:spacing w:before="0" w:after="60"/>
+              <w:keepNext/>
+              <w:jc w:val="center"/>
+            </w:pPr>
+            <w:r>
+              <w:rPr>
+                <w:rFonts w:ascii="Calibri" w:hAnsi="Calibri"/>
+                <w:sz w:val="20"/>
+              </w:rPr>
+              <w:t xml:space="default"/>
+            </w:r>
+          </w:p>
+        </w:tc>
+        <w:tc>
+          <w:tcPr>
+            <w:tcBorders>
+              <w:top w:val="single" w:space="0" w:color="D3D3D3"/>
+              <w:bottom w:val="single" w:space="0" w:color="D3D3D3"/>
+              <w:start w:val="single" w:space="0" w:color="D3D3D3"/>
+              <w:end w:val="single" w:space="0" w:color="D3D3D3"/>
+            </w:tcBorders>
+          </w:tcPr>
+          <w:p>
+            <w:pPr>
+              <w:spacing w:before="0" w:after="60"/>
+              <w:keepNext/>
+              <w:jc w:val="center"/>
+            </w:pPr>
+            <w:r>
+              <w:rPr>
+                <w:rFonts w:ascii="Calibri" w:hAnsi="Calibri"/>
+                <w:sz w:val="20"/>
+              </w:rPr>
+              <w:t xml:space="default">0.6</w:t>
             </w:r>
           </w:p>
         </w:tc>
@@ -2638,55 +2639,55 @@
                 <w:rFonts w:ascii="Calibri" w:hAnsi="Calibri"/>
                 <w:sz w:val="20"/>
               </w:rPr>
-              <w:t xml:space="default">    Medicaid, with private</w:t>
-            </w:r>
-          </w:p>
-        </w:tc>
-        <w:tc>
-          <w:tcPr>
-            <w:tcBorders>
-              <w:top w:val="single" w:space="0" w:color="D3D3D3"/>
-              <w:bottom w:val="single" w:space="0" w:color="D3D3D3"/>
-              <w:start w:val="single" w:space="0" w:color="D3D3D3"/>
-              <w:end w:val="single" w:space="0" w:color="D3D3D3"/>
-            </w:tcBorders>
-          </w:tcPr>
-          <w:p>
-            <w:pPr>
-              <w:spacing w:before="0" w:after="60"/>
-              <w:keepNext/>
-              <w:jc w:val="center"/>
-            </w:pPr>
-            <w:r>
-              <w:rPr>
-                <w:rFonts w:ascii="Calibri" w:hAnsi="Calibri"/>
-                <w:sz w:val="20"/>
-              </w:rPr>
-              <w:t xml:space="default">254,956 (5.6%)</w:t>
-            </w:r>
-          </w:p>
-        </w:tc>
-        <w:tc>
-          <w:tcPr>
-            <w:tcBorders>
-              <w:top w:val="single" w:space="0" w:color="D3D3D3"/>
-              <w:bottom w:val="single" w:space="0" w:color="D3D3D3"/>
-              <w:start w:val="single" w:space="0" w:color="D3D3D3"/>
-              <w:end w:val="single" w:space="0" w:color="D3D3D3"/>
-            </w:tcBorders>
-          </w:tcPr>
-          <w:p>
-            <w:pPr>
-              <w:spacing w:before="0" w:after="60"/>
-              <w:keepNext/>
-              <w:jc w:val="center"/>
-            </w:pPr>
-            <w:r>
-              <w:rPr>
-                <w:rFonts w:ascii="Calibri" w:hAnsi="Calibri"/>
-                <w:sz w:val="20"/>
-              </w:rPr>
-              <w:t xml:space="default">246,461 (5.1%)</w:t>
+              <w:t xml:space="default">    Medicaid only</w:t>
+            </w:r>
+          </w:p>
+        </w:tc>
+        <w:tc>
+          <w:tcPr>
+            <w:tcBorders>
+              <w:top w:val="single" w:space="0" w:color="D3D3D3"/>
+              <w:bottom w:val="single" w:space="0" w:color="D3D3D3"/>
+              <w:start w:val="single" w:space="0" w:color="D3D3D3"/>
+              <w:end w:val="single" w:space="0" w:color="D3D3D3"/>
+            </w:tcBorders>
+          </w:tcPr>
+          <w:p>
+            <w:pPr>
+              <w:spacing w:before="0" w:after="60"/>
+              <w:keepNext/>
+              <w:jc w:val="center"/>
+            </w:pPr>
+            <w:r>
+              <w:rPr>
+                <w:rFonts w:ascii="Calibri" w:hAnsi="Calibri"/>
+                <w:sz w:val="20"/>
+              </w:rPr>
+              <w:t xml:space="default">1,208,461 (37%)</w:t>
+            </w:r>
+          </w:p>
+        </w:tc>
+        <w:tc>
+          <w:tcPr>
+            <w:tcBorders>
+              <w:top w:val="single" w:space="0" w:color="D3D3D3"/>
+              <w:bottom w:val="single" w:space="0" w:color="D3D3D3"/>
+              <w:start w:val="single" w:space="0" w:color="D3D3D3"/>
+              <w:end w:val="single" w:space="0" w:color="D3D3D3"/>
+            </w:tcBorders>
+          </w:tcPr>
+          <w:p>
+            <w:pPr>
+              <w:spacing w:before="0" w:after="60"/>
+              <w:keepNext/>
+              <w:jc w:val="center"/>
+            </w:pPr>
+            <w:r>
+              <w:rPr>
+                <w:rFonts w:ascii="Calibri" w:hAnsi="Calibri"/>
+                <w:sz w:val="20"/>
+              </w:rPr>
+              <w:t xml:space="default">1,148,479 (30%)</w:t>
             </w:r>
           </w:p>
         </w:tc>
@@ -2739,55 +2740,55 @@
                 <w:rFonts w:ascii="Calibri" w:hAnsi="Calibri"/>
                 <w:sz w:val="20"/>
               </w:rPr>
-              <w:t xml:space="default">    Other public</w:t>
-            </w:r>
-          </w:p>
-        </w:tc>
-        <w:tc>
-          <w:tcPr>
-            <w:tcBorders>
-              <w:top w:val="single" w:space="0" w:color="D3D3D3"/>
-              <w:bottom w:val="single" w:space="0" w:color="D3D3D3"/>
-              <w:start w:val="single" w:space="0" w:color="D3D3D3"/>
-              <w:end w:val="single" w:space="0" w:color="D3D3D3"/>
-            </w:tcBorders>
-          </w:tcPr>
-          <w:p>
-            <w:pPr>
-              <w:spacing w:before="0" w:after="60"/>
-              <w:keepNext/>
-              <w:jc w:val="center"/>
-            </w:pPr>
-            <w:r>
-              <w:rPr>
-                <w:rFonts w:ascii="Calibri" w:hAnsi="Calibri"/>
-                <w:sz w:val="20"/>
-              </w:rPr>
-              <w:t xml:space="default">68,588 (1.5%)</w:t>
-            </w:r>
-          </w:p>
-        </w:tc>
-        <w:tc>
-          <w:tcPr>
-            <w:tcBorders>
-              <w:top w:val="single" w:space="0" w:color="D3D3D3"/>
-              <w:bottom w:val="single" w:space="0" w:color="D3D3D3"/>
-              <w:start w:val="single" w:space="0" w:color="D3D3D3"/>
-              <w:end w:val="single" w:space="0" w:color="D3D3D3"/>
-            </w:tcBorders>
-          </w:tcPr>
-          <w:p>
-            <w:pPr>
-              <w:spacing w:before="0" w:after="60"/>
-              <w:keepNext/>
-              <w:jc w:val="center"/>
-            </w:pPr>
-            <w:r>
-              <w:rPr>
-                <w:rFonts w:ascii="Calibri" w:hAnsi="Calibri"/>
-                <w:sz w:val="20"/>
-              </w:rPr>
-              <w:t xml:space="default">89,779 (1.9%)</w:t>
+              <w:t xml:space="default">    Medicaid, with private</w:t>
+            </w:r>
+          </w:p>
+        </w:tc>
+        <w:tc>
+          <w:tcPr>
+            <w:tcBorders>
+              <w:top w:val="single" w:space="0" w:color="D3D3D3"/>
+              <w:bottom w:val="single" w:space="0" w:color="D3D3D3"/>
+              <w:start w:val="single" w:space="0" w:color="D3D3D3"/>
+              <w:end w:val="single" w:space="0" w:color="D3D3D3"/>
+            </w:tcBorders>
+          </w:tcPr>
+          <w:p>
+            <w:pPr>
+              <w:spacing w:before="0" w:after="60"/>
+              <w:keepNext/>
+              <w:jc w:val="center"/>
+            </w:pPr>
+            <w:r>
+              <w:rPr>
+                <w:rFonts w:ascii="Calibri" w:hAnsi="Calibri"/>
+                <w:sz w:val="20"/>
+              </w:rPr>
+              <w:t xml:space="default">159,109 (4.8%)</w:t>
+            </w:r>
+          </w:p>
+        </w:tc>
+        <w:tc>
+          <w:tcPr>
+            <w:tcBorders>
+              <w:top w:val="single" w:space="0" w:color="D3D3D3"/>
+              <w:bottom w:val="single" w:space="0" w:color="D3D3D3"/>
+              <w:start w:val="single" w:space="0" w:color="D3D3D3"/>
+              <w:end w:val="single" w:space="0" w:color="D3D3D3"/>
+            </w:tcBorders>
+          </w:tcPr>
+          <w:p>
+            <w:pPr>
+              <w:spacing w:before="0" w:after="60"/>
+              <w:keepNext/>
+              <w:jc w:val="center"/>
+            </w:pPr>
+            <w:r>
+              <w:rPr>
+                <w:rFonts w:ascii="Calibri" w:hAnsi="Calibri"/>
+                <w:sz w:val="20"/>
+              </w:rPr>
+              <w:t xml:space="default">192,749 (5.0%)</w:t>
             </w:r>
           </w:p>
         </w:tc>
@@ -2840,55 +2841,55 @@
                 <w:rFonts w:ascii="Calibri" w:hAnsi="Calibri"/>
                 <w:sz w:val="20"/>
               </w:rPr>
-              <w:t xml:space="default">    Private only</w:t>
-            </w:r>
-          </w:p>
-        </w:tc>
-        <w:tc>
-          <w:tcPr>
-            <w:tcBorders>
-              <w:top w:val="single" w:space="0" w:color="D3D3D3"/>
-              <w:bottom w:val="single" w:space="0" w:color="D3D3D3"/>
-              <w:start w:val="single" w:space="0" w:color="D3D3D3"/>
-              <w:end w:val="single" w:space="0" w:color="D3D3D3"/>
-            </w:tcBorders>
-          </w:tcPr>
-          <w:p>
-            <w:pPr>
-              <w:spacing w:before="0" w:after="60"/>
-              <w:keepNext/>
-              <w:jc w:val="center"/>
-            </w:pPr>
-            <w:r>
-              <w:rPr>
-                <w:rFonts w:ascii="Calibri" w:hAnsi="Calibri"/>
-                <w:sz w:val="20"/>
-              </w:rPr>
-              <w:t xml:space="default">2,506,164 (55%)</w:t>
-            </w:r>
-          </w:p>
-        </w:tc>
-        <w:tc>
-          <w:tcPr>
-            <w:tcBorders>
-              <w:top w:val="single" w:space="0" w:color="D3D3D3"/>
-              <w:bottom w:val="single" w:space="0" w:color="D3D3D3"/>
-              <w:start w:val="single" w:space="0" w:color="D3D3D3"/>
-              <w:end w:val="single" w:space="0" w:color="D3D3D3"/>
-            </w:tcBorders>
-          </w:tcPr>
-          <w:p>
-            <w:pPr>
-              <w:spacing w:before="0" w:after="60"/>
-              <w:keepNext/>
-              <w:jc w:val="center"/>
-            </w:pPr>
-            <w:r>
-              <w:rPr>
-                <w:rFonts w:ascii="Calibri" w:hAnsi="Calibri"/>
-                <w:sz w:val="20"/>
-              </w:rPr>
-              <w:t xml:space="default">2,811,946 (58%)</w:t>
+              <w:t xml:space="default">    Other public</w:t>
+            </w:r>
+          </w:p>
+        </w:tc>
+        <w:tc>
+          <w:tcPr>
+            <w:tcBorders>
+              <w:top w:val="single" w:space="0" w:color="D3D3D3"/>
+              <w:bottom w:val="single" w:space="0" w:color="D3D3D3"/>
+              <w:start w:val="single" w:space="0" w:color="D3D3D3"/>
+              <w:end w:val="single" w:space="0" w:color="D3D3D3"/>
+            </w:tcBorders>
+          </w:tcPr>
+          <w:p>
+            <w:pPr>
+              <w:spacing w:before="0" w:after="60"/>
+              <w:keepNext/>
+              <w:jc w:val="center"/>
+            </w:pPr>
+            <w:r>
+              <w:rPr>
+                <w:rFonts w:ascii="Calibri" w:hAnsi="Calibri"/>
+                <w:sz w:val="20"/>
+              </w:rPr>
+              <w:t xml:space="default">60,496 (1.8%)</w:t>
+            </w:r>
+          </w:p>
+        </w:tc>
+        <w:tc>
+          <w:tcPr>
+            <w:tcBorders>
+              <w:top w:val="single" w:space="0" w:color="D3D3D3"/>
+              <w:bottom w:val="single" w:space="0" w:color="D3D3D3"/>
+              <w:start w:val="single" w:space="0" w:color="D3D3D3"/>
+              <w:end w:val="single" w:space="0" w:color="D3D3D3"/>
+            </w:tcBorders>
+          </w:tcPr>
+          <w:p>
+            <w:pPr>
+              <w:spacing w:before="0" w:after="60"/>
+              <w:keepNext/>
+              <w:jc w:val="center"/>
+            </w:pPr>
+            <w:r>
+              <w:rPr>
+                <w:rFonts w:ascii="Calibri" w:hAnsi="Calibri"/>
+                <w:sz w:val="20"/>
+              </w:rPr>
+              <w:t xml:space="default">70,373 (1.8%)</w:t>
             </w:r>
           </w:p>
         </w:tc>
@@ -2941,55 +2942,55 @@
                 <w:rFonts w:ascii="Calibri" w:hAnsi="Calibri"/>
                 <w:sz w:val="20"/>
               </w:rPr>
-              <w:t xml:space="default">    Uninsured</w:t>
-            </w:r>
-          </w:p>
-        </w:tc>
-        <w:tc>
-          <w:tcPr>
-            <w:tcBorders>
-              <w:top w:val="single" w:space="0" w:color="D3D3D3"/>
-              <w:bottom w:val="single" w:space="0" w:color="D3D3D3"/>
-              <w:start w:val="single" w:space="0" w:color="D3D3D3"/>
-              <w:end w:val="single" w:space="0" w:color="D3D3D3"/>
-            </w:tcBorders>
-          </w:tcPr>
-          <w:p>
-            <w:pPr>
-              <w:spacing w:before="0" w:after="60"/>
-              <w:keepNext/>
-              <w:jc w:val="center"/>
-            </w:pPr>
-            <w:r>
-              <w:rPr>
-                <w:rFonts w:ascii="Calibri" w:hAnsi="Calibri"/>
-                <w:sz w:val="20"/>
-              </w:rPr>
-              <w:t xml:space="default">160,802 (3.6%)</w:t>
-            </w:r>
-          </w:p>
-        </w:tc>
-        <w:tc>
-          <w:tcPr>
-            <w:tcBorders>
-              <w:top w:val="single" w:space="0" w:color="D3D3D3"/>
-              <w:bottom w:val="single" w:space="0" w:color="D3D3D3"/>
-              <w:start w:val="single" w:space="0" w:color="D3D3D3"/>
-              <w:end w:val="single" w:space="0" w:color="D3D3D3"/>
-            </w:tcBorders>
-          </w:tcPr>
-          <w:p>
-            <w:pPr>
-              <w:spacing w:before="0" w:after="60"/>
-              <w:keepNext/>
-              <w:jc w:val="center"/>
-            </w:pPr>
-            <w:r>
-              <w:rPr>
-                <w:rFonts w:ascii="Calibri" w:hAnsi="Calibri"/>
-                <w:sz w:val="20"/>
-              </w:rPr>
-              <w:t xml:space="default">146,995 (3.0%)</w:t>
+              <w:t xml:space="default">    Private only</w:t>
+            </w:r>
+          </w:p>
+        </w:tc>
+        <w:tc>
+          <w:tcPr>
+            <w:tcBorders>
+              <w:top w:val="single" w:space="0" w:color="D3D3D3"/>
+              <w:bottom w:val="single" w:space="0" w:color="D3D3D3"/>
+              <w:start w:val="single" w:space="0" w:color="D3D3D3"/>
+              <w:end w:val="single" w:space="0" w:color="D3D3D3"/>
+            </w:tcBorders>
+          </w:tcPr>
+          <w:p>
+            <w:pPr>
+              <w:spacing w:before="0" w:after="60"/>
+              <w:keepNext/>
+              <w:jc w:val="center"/>
+            </w:pPr>
+            <w:r>
+              <w:rPr>
+                <w:rFonts w:ascii="Calibri" w:hAnsi="Calibri"/>
+                <w:sz w:val="20"/>
+              </w:rPr>
+              <w:t xml:space="default">1,764,826 (54%)</w:t>
+            </w:r>
+          </w:p>
+        </w:tc>
+        <w:tc>
+          <w:tcPr>
+            <w:tcBorders>
+              <w:top w:val="single" w:space="0" w:color="D3D3D3"/>
+              <w:bottom w:val="single" w:space="0" w:color="D3D3D3"/>
+              <w:start w:val="single" w:space="0" w:color="D3D3D3"/>
+              <w:end w:val="single" w:space="0" w:color="D3D3D3"/>
+            </w:tcBorders>
+          </w:tcPr>
+          <w:p>
+            <w:pPr>
+              <w:spacing w:before="0" w:after="60"/>
+              <w:keepNext/>
+              <w:jc w:val="center"/>
+            </w:pPr>
+            <w:r>
+              <w:rPr>
+                <w:rFonts w:ascii="Calibri" w:hAnsi="Calibri"/>
+                <w:sz w:val="20"/>
+              </w:rPr>
+              <w:t xml:space="default">2,348,252 (61%)</w:t>
             </w:r>
           </w:p>
         </w:tc>
@@ -3041,81 +3042,80 @@
               <w:rPr>
                 <w:rFonts w:ascii="Calibri" w:hAnsi="Calibri"/>
                 <w:sz w:val="20"/>
-                <w:b w:val="true"/>
-              </w:rPr>
-              <w:t xml:space="default">Household (18+ years) income (2021 USD)</w:t>
-            </w:r>
-          </w:p>
-        </w:tc>
-        <w:tc>
-          <w:tcPr>
-            <w:tcBorders>
-              <w:top w:val="single" w:space="0" w:color="D3D3D3"/>
-              <w:bottom w:val="single" w:space="0" w:color="D3D3D3"/>
-              <w:start w:val="single" w:space="0" w:color="D3D3D3"/>
-              <w:end w:val="single" w:space="0" w:color="D3D3D3"/>
-            </w:tcBorders>
-          </w:tcPr>
-          <w:p>
-            <w:pPr>
-              <w:spacing w:before="0" w:after="60"/>
-              <w:keepNext/>
-              <w:jc w:val="center"/>
-            </w:pPr>
-            <w:r>
-              <w:rPr>
-                <w:rFonts w:ascii="Calibri" w:hAnsi="Calibri"/>
-                <w:sz w:val="20"/>
-              </w:rPr>
-              <w:t xml:space="default">38,624 (13,768, 65,097)</w:t>
-            </w:r>
-          </w:p>
-        </w:tc>
-        <w:tc>
-          <w:tcPr>
-            <w:tcBorders>
-              <w:top w:val="single" w:space="0" w:color="D3D3D3"/>
-              <w:bottom w:val="single" w:space="0" w:color="D3D3D3"/>
-              <w:start w:val="single" w:space="0" w:color="D3D3D3"/>
-              <w:end w:val="single" w:space="0" w:color="D3D3D3"/>
-            </w:tcBorders>
-          </w:tcPr>
-          <w:p>
-            <w:pPr>
-              <w:spacing w:before="0" w:after="60"/>
-              <w:keepNext/>
-              <w:jc w:val="center"/>
-            </w:pPr>
-            <w:r>
-              <w:rPr>
-                <w:rFonts w:ascii="Calibri" w:hAnsi="Calibri"/>
-                <w:sz w:val="20"/>
-              </w:rPr>
-              <w:t xml:space="default">34,320 (11,000, 63,800)</w:t>
-            </w:r>
-          </w:p>
-        </w:tc>
-        <w:tc>
-          <w:tcPr>
-            <w:tcBorders>
-              <w:top w:val="single" w:space="0" w:color="D3D3D3"/>
-              <w:bottom w:val="single" w:space="0" w:color="D3D3D3"/>
-              <w:start w:val="single" w:space="0" w:color="D3D3D3"/>
-              <w:end w:val="single" w:space="0" w:color="D3D3D3"/>
-            </w:tcBorders>
-          </w:tcPr>
-          <w:p>
-            <w:pPr>
-              <w:spacing w:before="0" w:after="60"/>
-              <w:keepNext/>
-              <w:jc w:val="center"/>
-            </w:pPr>
-            <w:r>
-              <w:rPr>
-                <w:rFonts w:ascii="Calibri" w:hAnsi="Calibri"/>
-                <w:sz w:val="20"/>
-              </w:rPr>
-              <w:t xml:space="default">0.3</w:t>
+              </w:rPr>
+              <w:t xml:space="default">    Uninsured</w:t>
+            </w:r>
+          </w:p>
+        </w:tc>
+        <w:tc>
+          <w:tcPr>
+            <w:tcBorders>
+              <w:top w:val="single" w:space="0" w:color="D3D3D3"/>
+              <w:bottom w:val="single" w:space="0" w:color="D3D3D3"/>
+              <w:start w:val="single" w:space="0" w:color="D3D3D3"/>
+              <w:end w:val="single" w:space="0" w:color="D3D3D3"/>
+            </w:tcBorders>
+          </w:tcPr>
+          <w:p>
+            <w:pPr>
+              <w:spacing w:before="0" w:after="60"/>
+              <w:keepNext/>
+              <w:jc w:val="center"/>
+            </w:pPr>
+            <w:r>
+              <w:rPr>
+                <w:rFonts w:ascii="Calibri" w:hAnsi="Calibri"/>
+                <w:sz w:val="20"/>
+              </w:rPr>
+              <w:t xml:space="default">91,109 (2.8%)</w:t>
+            </w:r>
+          </w:p>
+        </w:tc>
+        <w:tc>
+          <w:tcPr>
+            <w:tcBorders>
+              <w:top w:val="single" w:space="0" w:color="D3D3D3"/>
+              <w:bottom w:val="single" w:space="0" w:color="D3D3D3"/>
+              <w:start w:val="single" w:space="0" w:color="D3D3D3"/>
+              <w:end w:val="single" w:space="0" w:color="D3D3D3"/>
+            </w:tcBorders>
+          </w:tcPr>
+          <w:p>
+            <w:pPr>
+              <w:spacing w:before="0" w:after="60"/>
+              <w:keepNext/>
+              <w:jc w:val="center"/>
+            </w:pPr>
+            <w:r>
+              <w:rPr>
+                <w:rFonts w:ascii="Calibri" w:hAnsi="Calibri"/>
+                <w:sz w:val="20"/>
+              </w:rPr>
+              <w:t xml:space="default">111,863 (2.9%)</w:t>
+            </w:r>
+          </w:p>
+        </w:tc>
+        <w:tc>
+          <w:tcPr>
+            <w:tcBorders>
+              <w:top w:val="single" w:space="0" w:color="D3D3D3"/>
+              <w:bottom w:val="single" w:space="0" w:color="D3D3D3"/>
+              <w:start w:val="single" w:space="0" w:color="D3D3D3"/>
+              <w:end w:val="single" w:space="0" w:color="D3D3D3"/>
+            </w:tcBorders>
+          </w:tcPr>
+          <w:p>
+            <w:pPr>
+              <w:spacing w:before="0" w:after="60"/>
+              <w:keepNext/>
+              <w:jc w:val="center"/>
+            </w:pPr>
+            <w:r>
+              <w:rPr>
+                <w:rFonts w:ascii="Calibri" w:hAnsi="Calibri"/>
+                <w:sz w:val="20"/>
+              </w:rPr>
+              <w:t xml:space="default"/>
             </w:r>
           </w:p>
         </w:tc>
@@ -3145,79 +3145,79 @@
                 <w:sz w:val="20"/>
                 <w:b w:val="true"/>
               </w:rPr>
-              <w:t xml:space="default">Total spending (2021 USD)</w:t>
-            </w:r>
-          </w:p>
-        </w:tc>
-        <w:tc>
-          <w:tcPr>
-            <w:tcBorders>
-              <w:top w:val="single" w:space="0" w:color="D3D3D3"/>
-              <w:bottom w:val="single" w:space="0" w:color="D3D3D3"/>
-              <w:start w:val="single" w:space="0" w:color="D3D3D3"/>
-              <w:end w:val="single" w:space="0" w:color="D3D3D3"/>
-            </w:tcBorders>
-          </w:tcPr>
-          <w:p>
-            <w:pPr>
-              <w:spacing w:before="0" w:after="60"/>
-              <w:keepNext/>
-              <w:jc w:val="center"/>
-            </w:pPr>
-            <w:r>
-              <w:rPr>
-                <w:rFonts w:ascii="Calibri" w:hAnsi="Calibri"/>
-                <w:sz w:val="20"/>
-              </w:rPr>
-              <w:t xml:space="default">217 (0, 901)</w:t>
-            </w:r>
-          </w:p>
-        </w:tc>
-        <w:tc>
-          <w:tcPr>
-            <w:tcBorders>
-              <w:top w:val="single" w:space="0" w:color="D3D3D3"/>
-              <w:bottom w:val="single" w:space="0" w:color="D3D3D3"/>
-              <w:start w:val="single" w:space="0" w:color="D3D3D3"/>
-              <w:end w:val="single" w:space="0" w:color="D3D3D3"/>
-            </w:tcBorders>
-          </w:tcPr>
-          <w:p>
-            <w:pPr>
-              <w:spacing w:before="0" w:after="60"/>
-              <w:keepNext/>
-              <w:jc w:val="center"/>
-            </w:pPr>
-            <w:r>
-              <w:rPr>
-                <w:rFonts w:ascii="Calibri" w:hAnsi="Calibri"/>
-                <w:sz w:val="20"/>
-              </w:rPr>
-              <w:t xml:space="default">265 (0, 1,257)</w:t>
-            </w:r>
-          </w:p>
-        </w:tc>
-        <w:tc>
-          <w:tcPr>
-            <w:tcBorders>
-              <w:top w:val="single" w:space="0" w:color="D3D3D3"/>
-              <w:bottom w:val="single" w:space="0" w:color="D3D3D3"/>
-              <w:start w:val="single" w:space="0" w:color="D3D3D3"/>
-              <w:end w:val="single" w:space="0" w:color="D3D3D3"/>
-            </w:tcBorders>
-          </w:tcPr>
-          <w:p>
-            <w:pPr>
-              <w:spacing w:before="0" w:after="60"/>
-              <w:keepNext/>
-              <w:jc w:val="center"/>
-            </w:pPr>
-            <w:r>
-              <w:rPr>
-                <w:rFonts w:ascii="Calibri" w:hAnsi="Calibri"/>
-                <w:sz w:val="20"/>
-              </w:rPr>
-              <w:t xml:space="default">0.3</w:t>
+              <w:t xml:space="default">Household (18+ years) income (2021 USD)</w:t>
+            </w:r>
+          </w:p>
+        </w:tc>
+        <w:tc>
+          <w:tcPr>
+            <w:tcBorders>
+              <w:top w:val="single" w:space="0" w:color="D3D3D3"/>
+              <w:bottom w:val="single" w:space="0" w:color="D3D3D3"/>
+              <w:start w:val="single" w:space="0" w:color="D3D3D3"/>
+              <w:end w:val="single" w:space="0" w:color="D3D3D3"/>
+            </w:tcBorders>
+          </w:tcPr>
+          <w:p>
+            <w:pPr>
+              <w:spacing w:before="0" w:after="60"/>
+              <w:keepNext/>
+              <w:jc w:val="center"/>
+            </w:pPr>
+            <w:r>
+              <w:rPr>
+                <w:rFonts w:ascii="Calibri" w:hAnsi="Calibri"/>
+                <w:sz w:val="20"/>
+              </w:rPr>
+              <w:t xml:space="default">46,404 (13,768-70,379)</w:t>
+            </w:r>
+          </w:p>
+        </w:tc>
+        <w:tc>
+          <w:tcPr>
+            <w:tcBorders>
+              <w:top w:val="single" w:space="0" w:color="D3D3D3"/>
+              <w:bottom w:val="single" w:space="0" w:color="D3D3D3"/>
+              <w:start w:val="single" w:space="0" w:color="D3D3D3"/>
+              <w:end w:val="single" w:space="0" w:color="D3D3D3"/>
+            </w:tcBorders>
+          </w:tcPr>
+          <w:p>
+            <w:pPr>
+              <w:spacing w:before="0" w:after="60"/>
+              <w:keepNext/>
+              <w:jc w:val="center"/>
+            </w:pPr>
+            <w:r>
+              <w:rPr>
+                <w:rFonts w:ascii="Calibri" w:hAnsi="Calibri"/>
+                <w:sz w:val="20"/>
+              </w:rPr>
+              <w:t xml:space="default">40,121 (13,494-68,000)</w:t>
+            </w:r>
+          </w:p>
+        </w:tc>
+        <w:tc>
+          <w:tcPr>
+            <w:tcBorders>
+              <w:top w:val="single" w:space="0" w:color="D3D3D3"/>
+              <w:bottom w:val="single" w:space="0" w:color="D3D3D3"/>
+              <w:start w:val="single" w:space="0" w:color="D3D3D3"/>
+              <w:end w:val="single" w:space="0" w:color="D3D3D3"/>
+            </w:tcBorders>
+          </w:tcPr>
+          <w:p>
+            <w:pPr>
+              <w:spacing w:before="0" w:after="60"/>
+              <w:keepNext/>
+              <w:jc w:val="center"/>
+            </w:pPr>
+            <w:r>
+              <w:rPr>
+                <w:rFonts w:ascii="Calibri" w:hAnsi="Calibri"/>
+                <w:sz w:val="20"/>
+              </w:rPr>
+              <w:t xml:space="default">0.4</w:t>
             </w:r>
           </w:p>
         </w:tc>
@@ -3228,28 +3228,98 @@
         </w:trPr>
         <w:tc>
           <w:tcPr>
-            <w:gridSpan w:val="4"/>
-          </w:tcPr>
-          <w:p>
-            <w:pPr>
-              <w:spacing w:before="0" w:after="60"/>
-              <w:keepNext/>
-            </w:pPr>
-            <w:r>
-              <w:rPr>
-                <w:vertAlign w:val="superscript"/>
-                <w:i/>
-                <w:rFonts w:ascii="Calibri" w:hAnsi="Calibri"/>
-                <w:sz w:val="20"/>
-              </w:rPr>
-              <w:t xml:space="default">1</w:t>
-            </w:r>
-            <w:r>
-              <w:rPr>
-                <w:rFonts w:ascii="Calibri" w:hAnsi="Calibri"/>
-                <w:sz w:val="20"/>
-              </w:rPr>
-              <w:t xml:space="preserve">n (%); Median (Q1, Q3)</w:t>
+            <w:tcBorders>
+              <w:top w:val="single" w:space="0" w:color="D3D3D3"/>
+              <w:bottom w:val="single" w:space="0" w:color="D3D3D3"/>
+              <w:start w:val="single" w:space="0" w:color="D3D3D3"/>
+              <w:end w:val="single" w:space="0" w:color="D3D3D3"/>
+            </w:tcBorders>
+          </w:tcPr>
+          <w:p>
+            <w:pPr>
+              <w:spacing w:before="0" w:after="60"/>
+              <w:keepNext/>
+              <w:jc w:val="start"/>
+            </w:pPr>
+            <w:r>
+              <w:rPr>
+                <w:rFonts w:ascii="Calibri" w:hAnsi="Calibri"/>
+                <w:sz w:val="20"/>
+                <w:b w:val="true"/>
+              </w:rPr>
+              <w:t xml:space="default">Total out-of-pocket spending (2021 USD)</w:t>
+            </w:r>
+          </w:p>
+        </w:tc>
+        <w:tc>
+          <w:tcPr>
+            <w:tcBorders>
+              <w:top w:val="single" w:space="0" w:color="D3D3D3"/>
+              <w:bottom w:val="single" w:space="0" w:color="D3D3D3"/>
+              <w:start w:val="single" w:space="0" w:color="D3D3D3"/>
+              <w:end w:val="single" w:space="0" w:color="D3D3D3"/>
+            </w:tcBorders>
+          </w:tcPr>
+          <w:p>
+            <w:pPr>
+              <w:spacing w:before="0" w:after="60"/>
+              <w:keepNext/>
+              <w:jc w:val="center"/>
+            </w:pPr>
+            <w:r>
+              <w:rPr>
+                <w:rFonts w:ascii="Calibri" w:hAnsi="Calibri"/>
+                <w:sz w:val="20"/>
+              </w:rPr>
+              <w:t xml:space="default">250 (3-984)</w:t>
+            </w:r>
+          </w:p>
+        </w:tc>
+        <w:tc>
+          <w:tcPr>
+            <w:tcBorders>
+              <w:top w:val="single" w:space="0" w:color="D3D3D3"/>
+              <w:bottom w:val="single" w:space="0" w:color="D3D3D3"/>
+              <w:start w:val="single" w:space="0" w:color="D3D3D3"/>
+              <w:end w:val="single" w:space="0" w:color="D3D3D3"/>
+            </w:tcBorders>
+          </w:tcPr>
+          <w:p>
+            <w:pPr>
+              <w:spacing w:before="0" w:after="60"/>
+              <w:keepNext/>
+              <w:jc w:val="center"/>
+            </w:pPr>
+            <w:r>
+              <w:rPr>
+                <w:rFonts w:ascii="Calibri" w:hAnsi="Calibri"/>
+                <w:sz w:val="20"/>
+              </w:rPr>
+              <w:t xml:space="default">394 (52-1,362)</w:t>
+            </w:r>
+          </w:p>
+        </w:tc>
+        <w:tc>
+          <w:tcPr>
+            <w:tcBorders>
+              <w:top w:val="single" w:space="0" w:color="D3D3D3"/>
+              <w:bottom w:val="single" w:space="0" w:color="D3D3D3"/>
+              <w:start w:val="single" w:space="0" w:color="D3D3D3"/>
+              <w:end w:val="single" w:space="0" w:color="D3D3D3"/>
+            </w:tcBorders>
+          </w:tcPr>
+          <w:p>
+            <w:pPr>
+              <w:spacing w:before="0" w:after="60"/>
+              <w:keepNext/>
+              <w:jc w:val="center"/>
+            </w:pPr>
+            <w:r>
+              <w:rPr>
+                <w:rFonts w:ascii="Calibri" w:hAnsi="Calibri"/>
+                <w:sz w:val="20"/>
+              </w:rPr>
+              <w:t xml:space="default">0.015</w:t>
             </w:r>
           </w:p>
         </w:tc>
@@ -3274,6 +3344,38 @@
                 <w:rFonts w:ascii="Calibri" w:hAnsi="Calibri"/>
                 <w:sz w:val="20"/>
               </w:rPr>
+              <w:t xml:space="default">1</w:t>
+            </w:r>
+            <w:r>
+              <w:rPr>
+                <w:rFonts w:ascii="Calibri" w:hAnsi="Calibri"/>
+                <w:sz w:val="20"/>
+              </w:rPr>
+              <w:t xml:space="preserve">Mean (SD); n (%); Median (Q1-Q3)</w:t>
+            </w:r>
+          </w:p>
+        </w:tc>
+      </w:tr>
+      <w:tr>
+        <w:trPr>
+          <w:cantSplit/>
+        </w:trPr>
+        <w:tc>
+          <w:tcPr>
+            <w:gridSpan w:val="4"/>
+          </w:tcPr>
+          <w:p>
+            <w:pPr>
+              <w:spacing w:before="0" w:after="60"/>
+              <w:keepNext/>
+            </w:pPr>
+            <w:r>
+              <w:rPr>
+                <w:vertAlign w:val="superscript"/>
+                <w:i/>
+                <w:rFonts w:ascii="Calibri" w:hAnsi="Calibri"/>
+                <w:sz w:val="20"/>
+              </w:rPr>
               <w:t xml:space="default">2</w:t>
             </w:r>
             <w:r>
@@ -3281,7 +3383,7 @@
                 <w:rFonts w:ascii="Calibri" w:hAnsi="Calibri"/>
                 <w:sz w:val="20"/>
               </w:rPr>
-              <w:t xml:space="preserve">Pearson's X^2: Rao &amp; Scott adjustment; Design-based KruskalWallis test</w:t>
+              <w:t xml:space="preserve">Design-based KruskalWallis test; Pearson's X^2: Rao &amp; Scott adjustment</w:t>
             </w:r>
           </w:p>
         </w:tc>

</xml_diff>